<commit_message>
IBM paper (EN and ES): section 146, a PCA spectrum read in the weight-1 sector; Tang 2021 in the bibliography
Co-Authored-By: Claude Opus 5.5 <noreply@anthropic.com>
Claude-Session: https://claude.ai/code/session_01VmfpwzVWvRWhRHG7VzpiEN
</commit_message>
<xml_diff>
--- a/manuscript/qang_ibm.docx
+++ b/manuscript/qang_ibm.docx
@@ -3807,6 +3807,482 @@
           <w:rFonts w:ascii="Times New Roman" w:hAnsi="Times New Roman"/>
         </w:rPr>
         <w:t xml:space="preserve">it.</w:t>
+      </w:r>
+      <w:r>
+        <w:rPr>
+          <w:rFonts w:ascii="Times New Roman" w:hAnsi="Times New Roman"/>
+        </w:rPr>
+        <w:t xml:space="preserve"> </w:t>
+      </w:r>
+      <w:r>
+        <w:rPr>
+          <w:rFonts w:ascii="Times New Roman" w:hAnsi="Times New Roman"/>
+        </w:rPr>
+        <w:t xml:space="preserve">Reading</w:t>
+      </w:r>
+      <w:r>
+        <w:rPr>
+          <w:rFonts w:ascii="Times New Roman" w:hAnsi="Times New Roman"/>
+        </w:rPr>
+        <w:t xml:space="preserve"> </w:t>
+      </w:r>
+      <w:r>
+        <w:rPr>
+          <w:rFonts w:ascii="Times New Roman" w:hAnsi="Times New Roman"/>
+        </w:rPr>
+        <w:t xml:space="preserve">a</w:t>
+      </w:r>
+      <w:r>
+        <w:rPr>
+          <w:rFonts w:ascii="Times New Roman" w:hAnsi="Times New Roman"/>
+        </w:rPr>
+        <w:t xml:space="preserve"> </w:t>
+      </w:r>
+      <w:r>
+        <w:rPr>
+          <w:rFonts w:ascii="Times New Roman" w:hAnsi="Times New Roman"/>
+        </w:rPr>
+        <w:t xml:space="preserve">known</w:t>
+      </w:r>
+      <w:r>
+        <w:rPr>
+          <w:rFonts w:ascii="Times New Roman" w:hAnsi="Times New Roman"/>
+        </w:rPr>
+        <w:t xml:space="preserve"> </w:t>
+      </w:r>
+      <w:r>
+        <w:rPr>
+          <w:rFonts w:ascii="Times New Roman" w:hAnsi="Times New Roman"/>
+        </w:rPr>
+        <w:t xml:space="preserve">five-component</w:t>
+      </w:r>
+      <w:r>
+        <w:rPr>
+          <w:rFonts w:ascii="Times New Roman" w:hAnsi="Times New Roman"/>
+        </w:rPr>
+        <w:t xml:space="preserve"> </w:t>
+      </w:r>
+      <w:r>
+        <w:rPr>
+          <w:rFonts w:ascii="Times New Roman" w:hAnsi="Times New Roman"/>
+        </w:rPr>
+        <w:t xml:space="preserve">principal-component</w:t>
+      </w:r>
+      <w:r>
+        <w:rPr>
+          <w:rFonts w:ascii="Times New Roman" w:hAnsi="Times New Roman"/>
+        </w:rPr>
+        <w:t xml:space="preserve"> </w:t>
+      </w:r>
+      <w:r>
+        <w:rPr>
+          <w:rFonts w:ascii="Times New Roman" w:hAnsi="Times New Roman"/>
+        </w:rPr>
+        <w:t xml:space="preserve">spectrum</w:t>
+      </w:r>
+      <w:r>
+        <w:rPr>
+          <w:rFonts w:ascii="Times New Roman" w:hAnsi="Times New Roman"/>
+        </w:rPr>
+        <w:t xml:space="preserve"> </w:t>
+      </w:r>
+      <w:r>
+        <w:rPr>
+          <w:rFonts w:ascii="Times New Roman" w:hAnsi="Times New Roman"/>
+        </w:rPr>
+        <w:t xml:space="preserve">out</w:t>
+      </w:r>
+      <w:r>
+        <w:rPr>
+          <w:rFonts w:ascii="Times New Roman" w:hAnsi="Times New Roman"/>
+        </w:rPr>
+        <w:t xml:space="preserve"> </w:t>
+      </w:r>
+      <w:r>
+        <w:rPr>
+          <w:rFonts w:ascii="Times New Roman" w:hAnsi="Times New Roman"/>
+        </w:rPr>
+        <w:t xml:space="preserve">of</w:t>
+      </w:r>
+      <w:r>
+        <w:rPr>
+          <w:rFonts w:ascii="Times New Roman" w:hAnsi="Times New Roman"/>
+        </w:rPr>
+        <w:t xml:space="preserve"> </w:t>
+      </w:r>
+      <w:r>
+        <w:rPr>
+          <w:rFonts w:ascii="Times New Roman" w:hAnsi="Times New Roman"/>
+        </w:rPr>
+        <w:t xml:space="preserve">the</w:t>
+      </w:r>
+      <w:r>
+        <w:rPr>
+          <w:rFonts w:ascii="Times New Roman" w:hAnsi="Times New Roman"/>
+        </w:rPr>
+        <w:t xml:space="preserve"> </w:t>
+      </w:r>
+      <w:r>
+        <w:rPr>
+          <w:rFonts w:ascii="Times New Roman" w:hAnsi="Times New Roman"/>
+        </w:rPr>
+        <w:t xml:space="preserve">data’s</w:t>
+      </w:r>
+      <w:r>
+        <w:rPr>
+          <w:rFonts w:ascii="Times New Roman" w:hAnsi="Times New Roman"/>
+        </w:rPr>
+        <w:t xml:space="preserve"> </w:t>
+      </w:r>
+      <w:r>
+        <w:rPr>
+          <w:rFonts w:ascii="Times New Roman" w:hAnsi="Times New Roman"/>
+        </w:rPr>
+        <w:t xml:space="preserve">density</w:t>
+      </w:r>
+      <w:r>
+        <w:rPr>
+          <w:rFonts w:ascii="Times New Roman" w:hAnsi="Times New Roman"/>
+        </w:rPr>
+        <w:t xml:space="preserve"> </w:t>
+      </w:r>
+      <w:r>
+        <w:rPr>
+          <w:rFonts w:ascii="Times New Roman" w:hAnsi="Times New Roman"/>
+        </w:rPr>
+        <w:t xml:space="preserve">matrix</w:t>
+      </w:r>
+      <w:r>
+        <w:rPr>
+          <w:rFonts w:ascii="Times New Roman" w:hAnsi="Times New Roman"/>
+        </w:rPr>
+        <w:t xml:space="preserve"> </w:t>
+      </w:r>
+      <w:r>
+        <w:rPr>
+          <w:rFonts w:ascii="Times New Roman" w:hAnsi="Times New Roman"/>
+        </w:rPr>
+        <w:t xml:space="preserve">in</w:t>
+      </w:r>
+      <w:r>
+        <w:rPr>
+          <w:rFonts w:ascii="Times New Roman" w:hAnsi="Times New Roman"/>
+        </w:rPr>
+        <w:t xml:space="preserve"> </w:t>
+      </w:r>
+      <w:r>
+        <w:rPr>
+          <w:rFonts w:ascii="Times New Roman" w:hAnsi="Times New Roman"/>
+        </w:rPr>
+        <w:t xml:space="preserve">the</w:t>
+      </w:r>
+      <w:r>
+        <w:rPr>
+          <w:rFonts w:ascii="Times New Roman" w:hAnsi="Times New Roman"/>
+        </w:rPr>
+        <w:t xml:space="preserve"> </w:t>
+      </w:r>
+      <w:r>
+        <w:rPr>
+          <w:rFonts w:ascii="Times New Roman" w:hAnsi="Times New Roman"/>
+        </w:rPr>
+        <w:t xml:space="preserve">weight-1</w:t>
+      </w:r>
+      <w:r>
+        <w:rPr>
+          <w:rFonts w:ascii="Times New Roman" w:hAnsi="Times New Roman"/>
+        </w:rPr>
+        <w:t xml:space="preserve"> </w:t>
+      </w:r>
+      <w:r>
+        <w:rPr>
+          <w:rFonts w:ascii="Times New Roman" w:hAnsi="Times New Roman"/>
+        </w:rPr>
+        <w:t xml:space="preserve">sector,</w:t>
+      </w:r>
+      <w:r>
+        <w:rPr>
+          <w:rFonts w:ascii="Times New Roman" w:hAnsi="Times New Roman"/>
+        </w:rPr>
+        <w:t xml:space="preserve"> </w:t>
+      </w:r>
+      <w:r>
+        <w:rPr>
+          <w:rFonts w:ascii="Times New Roman" w:hAnsi="Times New Roman"/>
+        </w:rPr>
+        <w:t xml:space="preserve">filter</w:t>
+      </w:r>
+      <w:r>
+        <w:rPr>
+          <w:rFonts w:ascii="Times New Roman" w:hAnsi="Times New Roman"/>
+        </w:rPr>
+        <w:t xml:space="preserve"> </w:t>
+      </w:r>
+      <w:r>
+        <w:rPr>
+          <w:rFonts w:ascii="Times New Roman" w:hAnsi="Times New Roman"/>
+        </w:rPr>
+        <w:t xml:space="preserve">plus</w:t>
+      </w:r>
+      <w:r>
+        <w:rPr>
+          <w:rFonts w:ascii="Times New Roman" w:hAnsi="Times New Roman"/>
+        </w:rPr>
+        <w:t xml:space="preserve"> </w:t>
+      </w:r>
+      <w:r>
+        <w:rPr>
+          <w:rFonts w:ascii="Times New Roman" w:hAnsi="Times New Roman"/>
+        </w:rPr>
+        <w:t xml:space="preserve">read-out</w:t>
+      </w:r>
+      <w:r>
+        <w:rPr>
+          <w:rFonts w:ascii="Times New Roman" w:hAnsi="Times New Roman"/>
+        </w:rPr>
+        <w:t xml:space="preserve"> </w:t>
+      </w:r>
+      <w:r>
+        <w:rPr>
+          <w:rFonts w:ascii="Times New Roman" w:hAnsi="Times New Roman"/>
+        </w:rPr>
+        <w:t xml:space="preserve">correction</w:t>
+      </w:r>
+      <w:r>
+        <w:rPr>
+          <w:rFonts w:ascii="Times New Roman" w:hAnsi="Times New Roman"/>
+        </w:rPr>
+        <w:t xml:space="preserve"> </w:t>
+      </w:r>
+      <w:r>
+        <w:rPr>
+          <w:rFonts w:ascii="Times New Roman" w:hAnsi="Times New Roman"/>
+        </w:rPr>
+        <w:t xml:space="preserve">lowers</w:t>
+      </w:r>
+      <w:r>
+        <w:rPr>
+          <w:rFonts w:ascii="Times New Roman" w:hAnsi="Times New Roman"/>
+        </w:rPr>
+        <w:t xml:space="preserve"> </w:t>
+      </w:r>
+      <w:r>
+        <w:rPr>
+          <w:rFonts w:ascii="Times New Roman" w:hAnsi="Times New Roman"/>
+        </w:rPr>
+        <w:t xml:space="preserve">the</w:t>
+      </w:r>
+      <w:r>
+        <w:rPr>
+          <w:rFonts w:ascii="Times New Roman" w:hAnsi="Times New Roman"/>
+        </w:rPr>
+        <w:t xml:space="preserve"> </w:t>
+      </w:r>
+      <w:r>
+        <w:rPr>
+          <w:rFonts w:ascii="Times New Roman" w:hAnsi="Times New Roman"/>
+        </w:rPr>
+        <w:t xml:space="preserve">error</w:t>
+      </w:r>
+      <w:r>
+        <w:rPr>
+          <w:rFonts w:ascii="Times New Roman" w:hAnsi="Times New Roman"/>
+        </w:rPr>
+        <w:t xml:space="preserve"> </w:t>
+      </w:r>
+      <w:r>
+        <w:rPr>
+          <w:rFonts w:ascii="Times New Roman" w:hAnsi="Times New Roman"/>
+        </w:rPr>
+        <w:t xml:space="preserve">4.6</w:t>
+      </w:r>
+      <m:oMath>
+        <m:r>
+          <m:rPr>
+            <m:sty m:val="p"/>
+          </m:rPr>
+          <m:t>×</m:t>
+        </m:r>
+      </m:oMath>
+      <w:r>
+        <w:rPr>
+          <w:rFonts w:ascii="Times New Roman" w:hAnsi="Times New Roman"/>
+        </w:rPr>
+        <w:t xml:space="preserve"> </w:t>
+      </w:r>
+      <w:r>
+        <w:rPr>
+          <w:rFonts w:ascii="Times New Roman" w:hAnsi="Times New Roman"/>
+        </w:rPr>
+        <w:t xml:space="preserve">(median</w:t>
+      </w:r>
+      <w:r>
+        <w:rPr>
+          <w:rFonts w:ascii="Times New Roman" w:hAnsi="Times New Roman"/>
+        </w:rPr>
+        <w:t xml:space="preserve"> </w:t>
+      </w:r>
+      <w:r>
+        <w:rPr>
+          <w:rFonts w:ascii="Times New Roman" w:hAnsi="Times New Roman"/>
+        </w:rPr>
+        <w:t xml:space="preserve">over</w:t>
+      </w:r>
+      <w:r>
+        <w:rPr>
+          <w:rFonts w:ascii="Times New Roman" w:hAnsi="Times New Roman"/>
+        </w:rPr>
+        <w:t xml:space="preserve"> </w:t>
+      </w:r>
+      <w:r>
+        <w:rPr>
+          <w:rFonts w:ascii="Times New Roman" w:hAnsi="Times New Roman"/>
+        </w:rPr>
+        <w:t xml:space="preserve">twenty-one</w:t>
+      </w:r>
+      <w:r>
+        <w:rPr>
+          <w:rFonts w:ascii="Times New Roman" w:hAnsi="Times New Roman"/>
+        </w:rPr>
+        <w:t xml:space="preserve"> </w:t>
+      </w:r>
+      <w:r>
+        <w:rPr>
+          <w:rFonts w:ascii="Times New Roman" w:hAnsi="Times New Roman"/>
+        </w:rPr>
+        <w:t xml:space="preserve">devices)</w:t>
+      </w:r>
+      <w:r>
+        <w:rPr>
+          <w:rFonts w:ascii="Times New Roman" w:hAnsi="Times New Roman"/>
+        </w:rPr>
+        <w:t xml:space="preserve"> </w:t>
+      </w:r>
+      <w:r>
+        <w:rPr>
+          <w:rFonts w:ascii="Times New Roman" w:hAnsi="Times New Roman"/>
+        </w:rPr>
+        <w:t xml:space="preserve">and</w:t>
+      </w:r>
+      <w:r>
+        <w:rPr>
+          <w:rFonts w:ascii="Times New Roman" w:hAnsi="Times New Roman"/>
+        </w:rPr>
+        <w:t xml:space="preserve"> </w:t>
+      </w:r>
+      <w:r>
+        <w:rPr>
+          <w:rFonts w:ascii="Times New Roman" w:hAnsi="Times New Roman"/>
+        </w:rPr>
+        <w:t xml:space="preserve">orders</w:t>
+      </w:r>
+      <w:r>
+        <w:rPr>
+          <w:rFonts w:ascii="Times New Roman" w:hAnsi="Times New Roman"/>
+        </w:rPr>
+        <w:t xml:space="preserve"> </w:t>
+      </w:r>
+      <w:r>
+        <w:rPr>
+          <w:rFonts w:ascii="Times New Roman" w:hAnsi="Times New Roman"/>
+        </w:rPr>
+        <w:t xml:space="preserve">the</w:t>
+      </w:r>
+      <w:r>
+        <w:rPr>
+          <w:rFonts w:ascii="Times New Roman" w:hAnsi="Times New Roman"/>
+        </w:rPr>
+        <w:t xml:space="preserve"> </w:t>
+      </w:r>
+      <w:r>
+        <w:rPr>
+          <w:rFonts w:ascii="Times New Roman" w:hAnsi="Times New Roman"/>
+        </w:rPr>
+        <w:t xml:space="preserve">spectrum</w:t>
+      </w:r>
+      <w:r>
+        <w:rPr>
+          <w:rFonts w:ascii="Times New Roman" w:hAnsi="Times New Roman"/>
+        </w:rPr>
+        <w:t xml:space="preserve"> </w:t>
+      </w:r>
+      <w:r>
+        <w:rPr>
+          <w:rFonts w:ascii="Times New Roman" w:hAnsi="Times New Roman"/>
+        </w:rPr>
+        <w:t xml:space="preserve">correctly</w:t>
+      </w:r>
+      <w:r>
+        <w:rPr>
+          <w:rFonts w:ascii="Times New Roman" w:hAnsi="Times New Roman"/>
+        </w:rPr>
+        <w:t xml:space="preserve"> </w:t>
+      </w:r>
+      <w:r>
+        <w:rPr>
+          <w:rFonts w:ascii="Times New Roman" w:hAnsi="Times New Roman"/>
+        </w:rPr>
+        <w:t xml:space="preserve">on</w:t>
+      </w:r>
+      <w:r>
+        <w:rPr>
+          <w:rFonts w:ascii="Times New Roman" w:hAnsi="Times New Roman"/>
+        </w:rPr>
+        <w:t xml:space="preserve"> </w:t>
+      </w:r>
+      <w:r>
+        <w:rPr>
+          <w:rFonts w:ascii="Times New Roman" w:hAnsi="Times New Roman"/>
+        </w:rPr>
+        <w:t xml:space="preserve">18</w:t>
+      </w:r>
+      <w:r>
+        <w:rPr>
+          <w:rFonts w:ascii="Times New Roman" w:hAnsi="Times New Roman"/>
+        </w:rPr>
+        <w:t xml:space="preserve"> </w:t>
+      </w:r>
+      <w:r>
+        <w:rPr>
+          <w:rFonts w:ascii="Times New Roman" w:hAnsi="Times New Roman"/>
+        </w:rPr>
+        <w:t xml:space="preserve">of</w:t>
+      </w:r>
+      <w:r>
+        <w:rPr>
+          <w:rFonts w:ascii="Times New Roman" w:hAnsi="Times New Roman"/>
+        </w:rPr>
+        <w:t xml:space="preserve"> </w:t>
+      </w:r>
+      <w:r>
+        <w:rPr>
+          <w:rFonts w:ascii="Times New Roman" w:hAnsi="Times New Roman"/>
+        </w:rPr>
+        <w:t xml:space="preserve">21</w:t>
+      </w:r>
+      <w:r>
+        <w:rPr>
+          <w:rFonts w:ascii="Times New Roman" w:hAnsi="Times New Roman"/>
+        </w:rPr>
+        <w:t xml:space="preserve"> </w:t>
+      </w:r>
+      <w:r>
+        <w:rPr>
+          <w:rFonts w:ascii="Times New Roman" w:hAnsi="Times New Roman"/>
+        </w:rPr>
+        <w:t xml:space="preserve">(13</w:t>
+      </w:r>
+      <w:r>
+        <w:rPr>
+          <w:rFonts w:ascii="Times New Roman" w:hAnsi="Times New Roman"/>
+        </w:rPr>
+        <w:t xml:space="preserve"> </w:t>
+      </w:r>
+      <w:r>
+        <w:rPr>
+          <w:rFonts w:ascii="Times New Roman" w:hAnsi="Times New Roman"/>
+        </w:rPr>
+        <w:t xml:space="preserve">raw).</w:t>
       </w:r>
       <w:r>
         <w:rPr>
@@ -4513,7 +4989,7 @@
         <w:rPr>
           <w:rFonts w:ascii="Times New Roman" w:hAnsi="Times New Roman"/>
         </w:rPr>
-        <w:t xml:space="preserve">§137–§144 refer to the research notes of the repository, where every number below is reproduced by a</w:t>
+        <w:t xml:space="preserve">§137–§146 refer to the research notes of the repository, where every number below is reproduced by a</w:t>
       </w:r>
       <w:r>
         <w:rPr>
@@ -4548,7 +5024,7 @@
       </w:r>
     </w:p>
     <w:bookmarkEnd w:id="20"/>
-    <w:bookmarkStart w:id="28" w:name="methods"/>
+    <w:bookmarkStart w:id="29" w:name="methods"/>
     <w:p>
       <w:pPr>
         <w:pStyle w:val="Heading1"/>
@@ -6306,7 +6782,885 @@
       </w:r>
     </w:p>
     <w:bookmarkEnd w:id="26"/>
-    <w:bookmarkStart w:id="27" w:name="test-circuits."/>
+    <w:bookmarkStart w:id="27" w:name="pca-spectrum."/>
+    <w:p>
+      <w:pPr>
+        <w:pStyle w:val="Heading4"/>
+      </w:pPr>
+      <w:r>
+        <w:rPr>
+          <w:rFonts w:ascii="Times New Roman" w:hAnsi="Times New Roman"/>
+        </w:rPr>
+        <w:t xml:space="preserve">PCA spectrum.</w:t>
+      </w:r>
+    </w:p>
+    <w:p>
+      <w:pPr>
+        <w:pStyle w:val="FirstParagraph"/>
+      </w:pPr>
+      <w:r>
+        <w:rPr>
+          <w:rFonts w:ascii="Times New Roman" w:hAnsi="Times New Roman"/>
+        </w:rPr>
+        <w:t xml:space="preserve">In the unary encoding a real vector</w:t>
+      </w:r>
+      <w:r>
+        <w:rPr>
+          <w:rFonts w:ascii="Times New Roman" w:hAnsi="Times New Roman"/>
+        </w:rPr>
+        <w:t xml:space="preserve"> </w:t>
+      </w:r>
+      <m:oMath>
+        <m:r>
+          <m:t>x</m:t>
+        </m:r>
+      </m:oMath>
+      <w:r>
+        <w:rPr>
+          <w:rFonts w:ascii="Times New Roman" w:hAnsi="Times New Roman"/>
+        </w:rPr>
+        <w:t xml:space="preserve"> </w:t>
+      </w:r>
+      <w:r>
+        <w:rPr>
+          <w:rFonts w:ascii="Times New Roman" w:hAnsi="Times New Roman"/>
+        </w:rPr>
+        <w:t xml:space="preserve">is</w:t>
+      </w:r>
+      <w:r>
+        <w:rPr>
+          <w:rFonts w:ascii="Times New Roman" w:hAnsi="Times New Roman"/>
+        </w:rPr>
+        <w:t xml:space="preserve"> </w:t>
+      </w:r>
+      <m:oMath>
+        <m:nary>
+          <m:naryPr>
+            <m:chr m:val="∑"/>
+            <m:limLoc m:val="undOvr"/>
+            <m:subHide m:val="off"/>
+            <m:supHide m:val="on"/>
+          </m:naryPr>
+          <m:sub>
+            <m:r>
+              <m:t>k</m:t>
+            </m:r>
+          </m:sub>
+          <m:sup>
+            <m:r>
+              <m:t>​</m:t>
+            </m:r>
+          </m:sup>
+          <m:e>
+            <m:sSub>
+              <m:e>
+                <m:r>
+                  <m:t>x</m:t>
+                </m:r>
+              </m:e>
+              <m:sub>
+                <m:r>
+                  <m:t>k</m:t>
+                </m:r>
+              </m:sub>
+            </m:sSub>
+          </m:e>
+        </m:nary>
+        <m:r>
+          <m:rPr>
+            <m:sty m:val="p"/>
+          </m:rPr>
+          <m:t>|</m:t>
+        </m:r>
+        <m:sSub>
+          <m:e>
+            <m:r>
+              <m:t>e</m:t>
+            </m:r>
+          </m:e>
+          <m:sub>
+            <m:r>
+              <m:t>k</m:t>
+            </m:r>
+          </m:sub>
+        </m:sSub>
+        <m:r>
+          <m:rPr>
+            <m:sty m:val="p"/>
+          </m:rPr>
+          <m:t>⟩</m:t>
+        </m:r>
+      </m:oMath>
+      <w:r>
+        <w:rPr>
+          <w:rFonts w:ascii="Times New Roman" w:hAnsi="Times New Roman"/>
+        </w:rPr>
+        <w:t xml:space="preserve">,</w:t>
+      </w:r>
+      <w:r>
+        <w:rPr>
+          <w:rFonts w:ascii="Times New Roman" w:hAnsi="Times New Roman"/>
+        </w:rPr>
+        <w:t xml:space="preserve"> </w:t>
+      </w:r>
+      <m:oMath>
+        <m:sSub>
+          <m:e>
+            <m:r>
+              <m:t>e</m:t>
+            </m:r>
+          </m:e>
+          <m:sub>
+            <m:r>
+              <m:t>k</m:t>
+            </m:r>
+          </m:sub>
+        </m:sSub>
+      </m:oMath>
+      <w:r>
+        <w:rPr>
+          <w:rFonts w:ascii="Times New Roman" w:hAnsi="Times New Roman"/>
+        </w:rPr>
+        <w:t xml:space="preserve"> </w:t>
+      </w:r>
+      <w:r>
+        <w:rPr>
+          <w:rFonts w:ascii="Times New Roman" w:hAnsi="Times New Roman"/>
+        </w:rPr>
+        <w:t xml:space="preserve">the state</w:t>
+      </w:r>
+      <w:r>
+        <w:rPr>
+          <w:rFonts w:ascii="Times New Roman" w:hAnsi="Times New Roman"/>
+        </w:rPr>
+        <w:t xml:space="preserve"> </w:t>
+      </w:r>
+      <w:r>
+        <w:rPr>
+          <w:rFonts w:ascii="Times New Roman" w:hAnsi="Times New Roman"/>
+        </w:rPr>
+        <w:t xml:space="preserve">with only qubit</w:t>
+      </w:r>
+      <w:r>
+        <w:rPr>
+          <w:rFonts w:ascii="Times New Roman" w:hAnsi="Times New Roman"/>
+        </w:rPr>
+        <w:t xml:space="preserve"> </w:t>
+      </w:r>
+      <m:oMath>
+        <m:r>
+          <m:t>k</m:t>
+        </m:r>
+      </m:oMath>
+      <w:r>
+        <w:rPr>
+          <w:rFonts w:ascii="Times New Roman" w:hAnsi="Times New Roman"/>
+        </w:rPr>
+        <w:t xml:space="preserve"> </w:t>
+      </w:r>
+      <w:r>
+        <w:rPr>
+          <w:rFonts w:ascii="Times New Roman" w:hAnsi="Times New Roman"/>
+        </w:rPr>
+        <w:t xml:space="preserve">excited, prepared by</w:t>
+      </w:r>
+      <w:r>
+        <w:rPr>
+          <w:rFonts w:ascii="Times New Roman" w:hAnsi="Times New Roman"/>
+        </w:rPr>
+        <w:t xml:space="preserve"> </w:t>
+      </w:r>
+      <m:oMath>
+        <m:r>
+          <m:t>d</m:t>
+        </m:r>
+        <m:r>
+          <m:rPr>
+            <m:sty m:val="p"/>
+          </m:rPr>
+          <m:t>−</m:t>
+        </m:r>
+        <m:r>
+          <m:t>1</m:t>
+        </m:r>
+      </m:oMath>
+      <w:r>
+        <w:rPr>
+          <w:rFonts w:ascii="Times New Roman" w:hAnsi="Times New Roman"/>
+        </w:rPr>
+        <w:t xml:space="preserve"> </w:t>
+      </w:r>
+      <w:r>
+        <w:rPr>
+          <w:rFonts w:ascii="Times New Roman" w:hAnsi="Times New Roman"/>
+        </w:rPr>
+        <w:t xml:space="preserve">RBS gates. Loading the centred data vectors</w:t>
+      </w:r>
+      <w:r>
+        <w:rPr>
+          <w:rFonts w:ascii="Times New Roman" w:hAnsi="Times New Roman"/>
+        </w:rPr>
+        <w:t xml:space="preserve"> </w:t>
+      </w:r>
+      <m:oMath>
+        <m:sSub>
+          <m:e>
+            <m:r>
+              <m:t>x</m:t>
+            </m:r>
+          </m:e>
+          <m:sub>
+            <m:r>
+              <m:t>j</m:t>
+            </m:r>
+          </m:sub>
+        </m:sSub>
+      </m:oMath>
+      <w:r>
+        <w:rPr>
+          <w:rFonts w:ascii="Times New Roman" w:hAnsi="Times New Roman"/>
+        </w:rPr>
+        <w:t xml:space="preserve"> </w:t>
+      </w:r>
+      <w:r>
+        <w:rPr>
+          <w:rFonts w:ascii="Times New Roman" w:hAnsi="Times New Roman"/>
+        </w:rPr>
+        <w:t xml:space="preserve">with</w:t>
+      </w:r>
+      <w:r>
+        <w:rPr>
+          <w:rFonts w:ascii="Times New Roman" w:hAnsi="Times New Roman"/>
+        </w:rPr>
+        <w:t xml:space="preserve"> </w:t>
+      </w:r>
+      <w:r>
+        <w:rPr>
+          <w:rFonts w:ascii="Times New Roman" w:hAnsi="Times New Roman"/>
+        </w:rPr>
+        <w:t xml:space="preserve">probabilities</w:t>
+      </w:r>
+      <w:r>
+        <w:rPr>
+          <w:rFonts w:ascii="Times New Roman" w:hAnsi="Times New Roman"/>
+        </w:rPr>
+        <w:t xml:space="preserve"> </w:t>
+      </w:r>
+      <m:oMath>
+        <m:sSup>
+          <m:e>
+            <m:d>
+              <m:dPr>
+                <m:begChr m:val="|"/>
+                <m:endChr m:val="|"/>
+                <m:sepChr m:val=""/>
+                <m:grow/>
+              </m:dPr>
+              <m:e>
+                <m:sSub>
+                  <m:e>
+                    <m:r>
+                      <m:t>x</m:t>
+                    </m:r>
+                  </m:e>
+                  <m:sub>
+                    <m:r>
+                      <m:t>j</m:t>
+                    </m:r>
+                  </m:sub>
+                </m:sSub>
+              </m:e>
+            </m:d>
+          </m:e>
+          <m:sup>
+            <m:r>
+              <m:t>2</m:t>
+            </m:r>
+          </m:sup>
+        </m:sSup>
+        <m:r>
+          <m:rPr>
+            <m:sty m:val="p"/>
+          </m:rPr>
+          <m:t>/</m:t>
+        </m:r>
+        <m:nary>
+          <m:naryPr>
+            <m:chr m:val="∑"/>
+            <m:limLoc m:val="undOvr"/>
+            <m:subHide m:val="off"/>
+            <m:supHide m:val="on"/>
+          </m:naryPr>
+          <m:sub>
+            <m:r>
+              <m:t>i</m:t>
+            </m:r>
+          </m:sub>
+          <m:sup>
+            <m:r>
+              <m:t>​</m:t>
+            </m:r>
+          </m:sup>
+          <m:e>
+            <m:sSup>
+              <m:e>
+                <m:d>
+                  <m:dPr>
+                    <m:begChr m:val="|"/>
+                    <m:endChr m:val="|"/>
+                    <m:sepChr m:val=""/>
+                    <m:grow/>
+                  </m:dPr>
+                  <m:e>
+                    <m:sSub>
+                      <m:e>
+                        <m:r>
+                          <m:t>x</m:t>
+                        </m:r>
+                      </m:e>
+                      <m:sub>
+                        <m:r>
+                          <m:t>i</m:t>
+                        </m:r>
+                      </m:sub>
+                    </m:sSub>
+                  </m:e>
+                </m:d>
+              </m:e>
+              <m:sup>
+                <m:r>
+                  <m:t>2</m:t>
+                </m:r>
+              </m:sup>
+            </m:sSup>
+          </m:e>
+        </m:nary>
+      </m:oMath>
+      <w:r>
+        <w:rPr>
+          <w:rFonts w:ascii="Times New Roman" w:hAnsi="Times New Roman"/>
+        </w:rPr>
+        <w:t xml:space="preserve"> </w:t>
+      </w:r>
+      <w:r>
+        <w:rPr>
+          <w:rFonts w:ascii="Times New Roman" w:hAnsi="Times New Roman"/>
+        </w:rPr>
+        <w:t xml:space="preserve">gives</w:t>
+      </w:r>
+      <w:r>
+        <w:rPr>
+          <w:rFonts w:ascii="Times New Roman" w:hAnsi="Times New Roman"/>
+        </w:rPr>
+        <w:t xml:space="preserve"> </w:t>
+      </w:r>
+      <m:oMath>
+        <m:r>
+          <m:t>ρ</m:t>
+        </m:r>
+        <m:r>
+          <m:rPr>
+            <m:sty m:val="p"/>
+          </m:rPr>
+          <m:t>=</m:t>
+        </m:r>
+        <m:r>
+          <m:t>C</m:t>
+        </m:r>
+        <m:r>
+          <m:rPr>
+            <m:sty m:val="p"/>
+          </m:rPr>
+          <m:t>/</m:t>
+        </m:r>
+        <m:r>
+          <m:rPr>
+            <m:sty m:val="p"/>
+          </m:rPr>
+          <m:t>t</m:t>
+        </m:r>
+        <m:r>
+          <m:rPr>
+            <m:sty m:val="p"/>
+          </m:rPr>
+          <m:t>r</m:t>
+        </m:r>
+        <m:r>
+          <m:t> </m:t>
+        </m:r>
+        <m:r>
+          <m:t>C</m:t>
+        </m:r>
+      </m:oMath>
+      <w:r>
+        <w:rPr>
+          <w:rFonts w:ascii="Times New Roman" w:hAnsi="Times New Roman"/>
+        </w:rPr>
+        <w:t xml:space="preserve">,</w:t>
+      </w:r>
+      <w:r>
+        <w:rPr>
+          <w:rFonts w:ascii="Times New Roman" w:hAnsi="Times New Roman"/>
+        </w:rPr>
+        <w:t xml:space="preserve"> </w:t>
+      </w:r>
+      <m:oMath>
+        <m:r>
+          <m:t>C</m:t>
+        </m:r>
+        <m:r>
+          <m:rPr>
+            <m:sty m:val="p"/>
+          </m:rPr>
+          <m:t>=</m:t>
+        </m:r>
+        <m:f>
+          <m:fPr>
+            <m:type m:val="bar"/>
+          </m:fPr>
+          <m:num>
+            <m:r>
+              <m:t>1</m:t>
+            </m:r>
+          </m:num>
+          <m:den>
+            <m:r>
+              <m:t>m</m:t>
+            </m:r>
+          </m:den>
+        </m:f>
+        <m:nary>
+          <m:naryPr>
+            <m:chr m:val="∑"/>
+            <m:limLoc m:val="undOvr"/>
+            <m:subHide m:val="off"/>
+            <m:supHide m:val="on"/>
+          </m:naryPr>
+          <m:sub>
+            <m:r>
+              <m:t>j</m:t>
+            </m:r>
+          </m:sub>
+          <m:sup>
+            <m:r>
+              <m:t>​</m:t>
+            </m:r>
+          </m:sup>
+          <m:e>
+            <m:sSub>
+              <m:e>
+                <m:r>
+                  <m:t>x</m:t>
+                </m:r>
+              </m:e>
+              <m:sub>
+                <m:r>
+                  <m:t>j</m:t>
+                </m:r>
+              </m:sub>
+            </m:sSub>
+          </m:e>
+        </m:nary>
+        <m:sSubSup>
+          <m:e>
+            <m:r>
+              <m:t>x</m:t>
+            </m:r>
+          </m:e>
+          <m:sub>
+            <m:r>
+              <m:t>j</m:t>
+            </m:r>
+          </m:sub>
+          <m:sup>
+            <m:r>
+              <m:rPr>
+                <m:sty m:val="p"/>
+                <m:scr m:val="sans-serif"/>
+              </m:rPr>
+              <m:t>T</m:t>
+            </m:r>
+          </m:sup>
+        </m:sSubSup>
+      </m:oMath>
+      <w:r>
+        <w:rPr>
+          <w:rFonts w:ascii="Times New Roman" w:hAnsi="Times New Roman"/>
+        </w:rPr>
+        <w:t xml:space="preserve">:</w:t>
+      </w:r>
+      <w:r>
+        <w:rPr>
+          <w:rFonts w:ascii="Times New Roman" w:hAnsi="Times New Roman"/>
+        </w:rPr>
+        <w:t xml:space="preserve"> </w:t>
+      </w:r>
+      <w:r>
+        <w:rPr>
+          <w:rFonts w:ascii="Times New Roman" w:hAnsi="Times New Roman"/>
+        </w:rPr>
+        <w:t xml:space="preserve">the density matrix that quantum PCA diagonalizes </w:t>
+      </w:r>
+      <w:r>
+        <w:rPr>
+          <w:rFonts w:ascii="Times New Roman" w:hAnsi="Times New Roman"/>
+        </w:rPr>
+        <w:t xml:space="preserve">(</w:t>
+      </w:r>
+      <w:hyperlink w:anchor="ref-lloyd2014qpca">
+        <w:r>
+          <w:rPr>
+            <w:rStyle w:val="Hyperlink"/>
+          </w:rPr>
+          <w:t xml:space="preserve">Lloyd, Mohseni, and Rebentrost 2014</w:t>
+        </w:r>
+      </w:hyperlink>
+      <w:r>
+        <w:rPr>
+          <w:rFonts w:ascii="Times New Roman" w:hAnsi="Times New Roman"/>
+        </w:rPr>
+        <w:t xml:space="preserve">)</w:t>
+      </w:r>
+      <w:r>
+        <w:rPr>
+          <w:rFonts w:ascii="Times New Roman" w:hAnsi="Times New Roman"/>
+        </w:rPr>
+        <w:t xml:space="preserve">.</w:t>
+      </w:r>
+      <w:r>
+        <w:rPr>
+          <w:rFonts w:ascii="Times New Roman" w:hAnsi="Times New Roman"/>
+        </w:rPr>
+        <w:t xml:space="preserve"> </w:t>
+      </w:r>
+      <w:r>
+        <w:rPr>
+          <w:rStyle w:val="VerbatimChar"/>
+          <w:rFonts w:ascii="Times New Roman" w:hAnsi="Times New Roman"/>
+        </w:rPr>
+        <w:t xml:space="preserve">unary_orthogonal</w:t>
+      </w:r>
+      <w:r>
+        <w:rPr>
+          <w:rFonts w:ascii="Times New Roman" w:hAnsi="Times New Roman"/>
+        </w:rPr>
+        <w:t xml:space="preserve"> </w:t>
+      </w:r>
+      <w:r>
+        <w:rPr>
+          <w:rFonts w:ascii="Times New Roman" w:hAnsi="Times New Roman"/>
+        </w:rPr>
+        <w:t xml:space="preserve">decomposes a real orthogonal matrix into at most</w:t>
+      </w:r>
+      <w:r>
+        <w:rPr>
+          <w:rFonts w:ascii="Times New Roman" w:hAnsi="Times New Roman"/>
+        </w:rPr>
+        <w:t xml:space="preserve"> </w:t>
+      </w:r>
+      <m:oMath>
+        <m:r>
+          <m:t>d</m:t>
+        </m:r>
+        <m:d>
+          <m:dPr>
+            <m:begChr m:val="("/>
+            <m:endChr m:val=")"/>
+            <m:sepChr m:val=""/>
+            <m:grow/>
+          </m:dPr>
+          <m:e>
+            <m:r>
+              <m:t>d</m:t>
+            </m:r>
+            <m:r>
+              <m:rPr>
+                <m:sty m:val="p"/>
+              </m:rPr>
+              <m:t>−</m:t>
+            </m:r>
+            <m:r>
+              <m:t>1</m:t>
+            </m:r>
+          </m:e>
+        </m:d>
+        <m:r>
+          <m:rPr>
+            <m:sty m:val="p"/>
+          </m:rPr>
+          <m:t>/</m:t>
+        </m:r>
+        <m:r>
+          <m:t>2</m:t>
+        </m:r>
+      </m:oMath>
+      <w:r>
+        <w:rPr>
+          <w:rFonts w:ascii="Times New Roman" w:hAnsi="Times New Roman"/>
+        </w:rPr>
+        <w:t xml:space="preserve"> </w:t>
+      </w:r>
+      <w:r>
+        <w:rPr>
+          <w:rFonts w:ascii="Times New Roman" w:hAnsi="Times New Roman"/>
+        </w:rPr>
+        <w:t xml:space="preserve">nearest-neighbour RBS gates (up to output</w:t>
+      </w:r>
+      <w:r>
+        <w:rPr>
+          <w:rFonts w:ascii="Times New Roman" w:hAnsi="Times New Roman"/>
+        </w:rPr>
+        <w:t xml:space="preserve"> </w:t>
+      </w:r>
+      <w:r>
+        <w:rPr>
+          <w:rFonts w:ascii="Times New Roman" w:hAnsi="Times New Roman"/>
+        </w:rPr>
+        <w:t xml:space="preserve">signs); with the PCA basis it sends eigenvalue</w:t>
+      </w:r>
+      <w:r>
+        <w:rPr>
+          <w:rFonts w:ascii="Times New Roman" w:hAnsi="Times New Roman"/>
+        </w:rPr>
+        <w:t xml:space="preserve"> </w:t>
+      </w:r>
+      <m:oMath>
+        <m:sSub>
+          <m:e>
+            <m:r>
+              <m:t>λ</m:t>
+            </m:r>
+          </m:e>
+          <m:sub>
+            <m:r>
+              <m:t>k</m:t>
+            </m:r>
+          </m:sub>
+        </m:sSub>
+      </m:oMath>
+      <w:r>
+        <w:rPr>
+          <w:rFonts w:ascii="Times New Roman" w:hAnsi="Times New Roman"/>
+        </w:rPr>
+        <w:t xml:space="preserve"> </w:t>
+      </w:r>
+      <w:r>
+        <w:rPr>
+          <w:rFonts w:ascii="Times New Roman" w:hAnsi="Times New Roman"/>
+        </w:rPr>
+        <w:t xml:space="preserve">to qubit</w:t>
+      </w:r>
+      <w:r>
+        <w:rPr>
+          <w:rFonts w:ascii="Times New Roman" w:hAnsi="Times New Roman"/>
+        </w:rPr>
+        <w:t xml:space="preserve"> </w:t>
+      </w:r>
+      <m:oMath>
+        <m:r>
+          <m:t>k</m:t>
+        </m:r>
+      </m:oMath>
+      <w:r>
+        <w:rPr>
+          <w:rFonts w:ascii="Times New Roman" w:hAnsi="Times New Roman"/>
+        </w:rPr>
+        <w:t xml:space="preserve">, so</w:t>
+      </w:r>
+      <w:r>
+        <w:rPr>
+          <w:rFonts w:ascii="Times New Roman" w:hAnsi="Times New Roman"/>
+        </w:rPr>
+        <w:t xml:space="preserve"> </w:t>
+      </w:r>
+      <m:oMath>
+        <m:r>
+          <m:t>P</m:t>
+        </m:r>
+        <m:d>
+          <m:dPr>
+            <m:begChr m:val="("/>
+            <m:endChr m:val=")"/>
+            <m:sepChr m:val=""/>
+            <m:grow/>
+          </m:dPr>
+          <m:e>
+            <m:r>
+              <m:rPr>
+                <m:nor/>
+                <m:sty m:val="p"/>
+              </m:rPr>
+              <m:t>qubit </m:t>
+            </m:r>
+            <m:r>
+              <m:t>k</m:t>
+            </m:r>
+            <m:r>
+              <m:rPr>
+                <m:nor/>
+                <m:sty m:val="p"/>
+              </m:rPr>
+              <m:t> excited</m:t>
+            </m:r>
+          </m:e>
+        </m:d>
+        <m:r>
+          <m:rPr>
+            <m:sty m:val="p"/>
+          </m:rPr>
+          <m:t>=</m:t>
+        </m:r>
+        <m:sSub>
+          <m:e>
+            <m:r>
+              <m:t>λ</m:t>
+            </m:r>
+          </m:e>
+          <m:sub>
+            <m:r>
+              <m:t>k</m:t>
+            </m:r>
+          </m:sub>
+        </m:sSub>
+        <m:r>
+          <m:rPr>
+            <m:sty m:val="p"/>
+          </m:rPr>
+          <m:t>/</m:t>
+        </m:r>
+        <m:r>
+          <m:rPr>
+            <m:sty m:val="p"/>
+          </m:rPr>
+          <m:t>∑</m:t>
+        </m:r>
+        <m:r>
+          <m:t>λ</m:t>
+        </m:r>
+      </m:oMath>
+      <w:r>
+        <w:rPr>
+          <w:rFonts w:ascii="Times New Roman" w:hAnsi="Times New Roman"/>
+        </w:rPr>
+        <w:t xml:space="preserve">, read by</w:t>
+      </w:r>
+      <w:r>
+        <w:rPr>
+          <w:rFonts w:ascii="Times New Roman" w:hAnsi="Times New Roman"/>
+        </w:rPr>
+        <w:t xml:space="preserve"> </w:t>
+      </w:r>
+      <w:r>
+        <w:rPr>
+          <w:rStyle w:val="VerbatimChar"/>
+          <w:rFonts w:ascii="Times New Roman" w:hAnsi="Times New Roman"/>
+        </w:rPr>
+        <w:t xml:space="preserve">unary_spectrum</w:t>
+      </w:r>
+      <w:r>
+        <w:rPr>
+          <w:rFonts w:ascii="Times New Roman" w:hAnsi="Times New Roman"/>
+        </w:rPr>
+        <w:t xml:space="preserve"> </w:t>
+      </w:r>
+      <w:r>
+        <w:rPr>
+          <w:rFonts w:ascii="Times New Roman" w:hAnsi="Times New Roman"/>
+        </w:rPr>
+        <w:t xml:space="preserve">from the four</w:t>
+      </w:r>
+      <w:r>
+        <w:rPr>
+          <w:rFonts w:ascii="Times New Roman" w:hAnsi="Times New Roman"/>
+        </w:rPr>
+        <w:t xml:space="preserve"> </w:t>
+      </w:r>
+      <w:r>
+        <w:rPr>
+          <w:rFonts w:ascii="Times New Roman" w:hAnsi="Times New Roman"/>
+        </w:rPr>
+        <w:t xml:space="preserve">read-outs of</w:t>
+      </w:r>
+      <w:r>
+        <w:rPr>
+          <w:rFonts w:ascii="Times New Roman" w:hAnsi="Times New Roman"/>
+        </w:rPr>
+        <w:t xml:space="preserve"> </w:t>
+      </w:r>
+      <w:r>
+        <w:rPr>
+          <w:rStyle w:val="VerbatimChar"/>
+          <w:rFonts w:ascii="Times New Roman" w:hAnsi="Times New Roman"/>
+        </w:rPr>
+        <w:t xml:space="preserve">ibm_qg</w:t>
+      </w:r>
+      <w:r>
+        <w:rPr>
+          <w:rFonts w:ascii="Times New Roman" w:hAnsi="Times New Roman"/>
+        </w:rPr>
+        <w:t xml:space="preserve">. The rotation is computed classically and</w:t>
+      </w:r>
+      <w:r>
+        <w:rPr>
+          <w:rFonts w:ascii="Times New Roman" w:hAnsi="Times New Roman"/>
+        </w:rPr>
+        <w:t xml:space="preserve"> </w:t>
+      </w:r>
+      <m:oMath>
+        <m:r>
+          <m:t>d</m:t>
+        </m:r>
+      </m:oMath>
+      <w:r>
+        <w:rPr>
+          <w:rFonts w:ascii="Times New Roman" w:hAnsi="Times New Roman"/>
+        </w:rPr>
+        <w:t xml:space="preserve"> </w:t>
+      </w:r>
+      <w:r>
+        <w:rPr>
+          <w:rFonts w:ascii="Times New Roman" w:hAnsi="Times New Roman"/>
+        </w:rPr>
+        <w:t xml:space="preserve">features use</w:t>
+      </w:r>
+      <w:r>
+        <w:rPr>
+          <w:rFonts w:ascii="Times New Roman" w:hAnsi="Times New Roman"/>
+        </w:rPr>
+        <w:t xml:space="preserve"> </w:t>
+      </w:r>
+      <m:oMath>
+        <m:r>
+          <m:t>d</m:t>
+        </m:r>
+      </m:oMath>
+      <w:r>
+        <w:rPr>
+          <w:rFonts w:ascii="Times New Roman" w:hAnsi="Times New Roman"/>
+        </w:rPr>
+        <w:t xml:space="preserve"> </w:t>
+      </w:r>
+      <w:r>
+        <w:rPr>
+          <w:rFonts w:ascii="Times New Roman" w:hAnsi="Times New Roman"/>
+        </w:rPr>
+        <w:t xml:space="preserve">qubits: this</w:t>
+      </w:r>
+      <w:r>
+        <w:rPr>
+          <w:rFonts w:ascii="Times New Roman" w:hAnsi="Times New Roman"/>
+        </w:rPr>
+        <w:t xml:space="preserve"> </w:t>
+      </w:r>
+      <w:r>
+        <w:rPr>
+          <w:rFonts w:ascii="Times New Roman" w:hAnsi="Times New Roman"/>
+        </w:rPr>
+        <w:t xml:space="preserve">tests read-out, not a speed-up.</w:t>
+      </w:r>
+    </w:p>
+    <w:bookmarkEnd w:id="27"/>
+    <w:bookmarkStart w:id="28" w:name="test-circuits."/>
     <w:p>
       <w:pPr>
         <w:pStyle w:val="Heading4"/>
@@ -6469,9 +7823,9 @@
         <w:t xml:space="preserve">over qubits and circuits. Transpilation uses optimization level 1 and seed 137.</w:t>
       </w:r>
     </w:p>
-    <w:bookmarkEnd w:id="27"/>
     <w:bookmarkEnd w:id="28"/>
-    <w:bookmarkStart w:id="39" w:name="results"/>
+    <w:bookmarkEnd w:id="29"/>
+    <w:bookmarkStart w:id="41" w:name="results"/>
     <w:p>
       <w:pPr>
         <w:pStyle w:val="Heading1"/>
@@ -6483,7 +7837,7 @@
         <w:t xml:space="preserve">Results</w:t>
       </w:r>
     </w:p>
-    <w:bookmarkStart w:id="30" w:name="read-out-on-three-devices-137-142"/>
+    <w:bookmarkStart w:id="31" w:name="read-out-on-three-devices-137-142"/>
     <w:p>
       <w:pPr>
         <w:pStyle w:val="Heading2"/>
@@ -6495,7 +7849,7 @@
         <w:t xml:space="preserve">Read-out on three devices (§137, §142)</w:t>
       </w:r>
     </w:p>
-    <w:bookmarkStart w:id="29" w:name="tab:three"/>
+    <w:bookmarkStart w:id="30" w:name="tab:three"/>
     <w:p>
       <w:pPr>
         <w:pStyle w:val="TableCaption"/>
@@ -6921,7 +8275,7 @@
         </w:tc>
       </w:tr>
     </w:tbl>
-    <w:bookmarkEnd w:id="29"/>
+    <w:bookmarkEnd w:id="30"/>
     <w:p>
       <w:pPr>
         <w:pStyle w:val="BodyText"/>
@@ -7027,8 +8381,8 @@
         <w:t xml:space="preserve">combination was filter + ZNE on two devices and filter + read-out on Torino (so both of those predictions failed).</w:t>
       </w:r>
     </w:p>
-    <w:bookmarkEnd w:id="30"/>
-    <w:bookmarkStart w:id="34" w:name="twenty-devices-144"/>
+    <w:bookmarkEnd w:id="31"/>
+    <w:bookmarkStart w:id="35" w:name="twenty-devices-144"/>
     <w:p>
       <w:pPr>
         <w:pStyle w:val="Heading2"/>
@@ -7053,18 +8407,18 @@
           <wp:inline>
             <wp:extent cx="4800600" cy="4336025"/>
             <wp:effectExtent b="0" l="0" r="0" t="0"/>
-            <wp:docPr descr="" title="" id="32" name="Picture"/>
+            <wp:docPr descr="" title="" id="33" name="Picture"/>
             <a:graphic>
               <a:graphicData uri="http://schemas.openxmlformats.org/drawingml/2006/picture">
                 <pic:pic>
                   <pic:nvPicPr>
-                    <pic:cNvPr descr="fig_fleet.png" id="33" name="Picture"/>
+                    <pic:cNvPr descr="fig_fleet.png" id="34" name="Picture"/>
                     <pic:cNvPicPr>
                       <a:picLocks noChangeArrowheads="1" noChangeAspect="1"/>
                     </pic:cNvPicPr>
                   </pic:nvPicPr>
                   <pic:blipFill>
-                    <a:blip r:embed="rId31"/>
+                    <a:blip r:embed="rId32"/>
                     <a:stretch>
                       <a:fillRect/>
                     </a:stretch>
@@ -7309,8 +8663,8 @@
         <w:t xml:space="preserve">filtered error from 0.098 to 0.021 (exploratory).</w:t>
       </w:r>
     </w:p>
-    <w:bookmarkEnd w:id="34"/>
-    <w:bookmarkStart w:id="35" w:name="X65a55fb3e65eb3767af4294710aef69a3875982"/>
+    <w:bookmarkEnd w:id="35"/>
+    <w:bookmarkStart w:id="36" w:name="X65a55fb3e65eb3767af4294710aef69a3875982"/>
     <w:p>
       <w:pPr>
         <w:pStyle w:val="Heading2"/>
@@ -7468,8 +8822,8 @@
         <w:t xml:space="preserve">three predictions passed).</w:t>
       </w:r>
     </w:p>
-    <w:bookmarkEnd w:id="35"/>
-    <w:bookmarkStart w:id="36" w:name="shot-planning-143"/>
+    <w:bookmarkEnd w:id="36"/>
+    <w:bookmarkStart w:id="37" w:name="shot-planning-143"/>
     <w:p>
       <w:pPr>
         <w:pStyle w:val="Heading2"/>
@@ -7650,8 +9004,8 @@
         <w:t xml:space="preserve">; the plan is set by the worst qubit and still met the target.</w:t>
       </w:r>
     </w:p>
-    <w:bookmarkEnd w:id="36"/>
-    <w:bookmarkStart w:id="38" w:name="the-qnn-139141"/>
+    <w:bookmarkEnd w:id="37"/>
+    <w:bookmarkStart w:id="39" w:name="the-qnn-139141"/>
     <w:p>
       <w:pPr>
         <w:pStyle w:val="Heading2"/>
@@ -7663,7 +9017,7 @@
         <w:t xml:space="preserve">The QNN (§139–§141)</w:t>
       </w:r>
     </w:p>
-    <w:bookmarkStart w:id="37" w:name="tab:qnn"/>
+    <w:bookmarkStart w:id="38" w:name="tab:qnn"/>
     <w:p>
       <w:pPr>
         <w:pStyle w:val="TableCaption"/>
@@ -8003,7 +9357,7 @@
         </w:tc>
       </w:tr>
     </w:tbl>
-    <w:bookmarkEnd w:id="37"/>
+    <w:bookmarkEnd w:id="38"/>
     <w:p>
       <w:pPr>
         <w:pStyle w:val="BodyText"/>
@@ -8195,9 +9549,533 @@
         <w:t xml:space="preserve">issue was reported upstream.</w:t>
       </w:r>
     </w:p>
-    <w:bookmarkEnd w:id="38"/>
     <w:bookmarkEnd w:id="39"/>
-    <w:bookmarkStart w:id="40" w:name="discussion"/>
+    <w:bookmarkStart w:id="40" w:name="a-pca-spectrum-146"/>
+    <w:p>
+      <w:pPr>
+        <w:pStyle w:val="Heading2"/>
+      </w:pPr>
+      <w:r>
+        <w:rPr>
+          <w:rFonts w:ascii="Times New Roman" w:hAnsi="Times New Roman"/>
+        </w:rPr>
+        <w:t xml:space="preserve">A PCA spectrum (§146)</w:t>
+      </w:r>
+    </w:p>
+    <w:p>
+      <w:pPr>
+        <w:pStyle w:val="FirstParagraph"/>
+      </w:pPr>
+      <w:r>
+        <w:rPr>
+          <w:rFonts w:ascii="Times New Roman" w:hAnsi="Times New Roman"/>
+        </w:rPr>
+        <w:t xml:space="preserve">Five features, 16 samples from a Gaussian with standard deviations</w:t>
+      </w:r>
+      <w:r>
+        <w:rPr>
+          <w:rFonts w:ascii="Times New Roman" w:hAnsi="Times New Roman"/>
+        </w:rPr>
+        <w:t xml:space="preserve"> </w:t>
+      </w:r>
+      <m:oMath>
+        <m:d>
+          <m:dPr>
+            <m:begChr m:val="("/>
+            <m:endChr m:val=")"/>
+            <m:sepChr m:val=""/>
+            <m:grow/>
+          </m:dPr>
+          <m:e>
+            <m:r>
+              <m:t>2.0</m:t>
+            </m:r>
+            <m:r>
+              <m:rPr>
+                <m:sty m:val="p"/>
+              </m:rPr>
+              <m:t>,</m:t>
+            </m:r>
+            <m:r>
+              <m:t>1.4</m:t>
+            </m:r>
+            <m:r>
+              <m:rPr>
+                <m:sty m:val="p"/>
+              </m:rPr>
+              <m:t>,</m:t>
+            </m:r>
+            <m:r>
+              <m:t>1.0</m:t>
+            </m:r>
+            <m:r>
+              <m:rPr>
+                <m:sty m:val="p"/>
+              </m:rPr>
+              <m:t>,</m:t>
+            </m:r>
+            <m:r>
+              <m:t>0.6</m:t>
+            </m:r>
+            <m:r>
+              <m:rPr>
+                <m:sty m:val="p"/>
+              </m:rPr>
+              <m:t>,</m:t>
+            </m:r>
+            <m:r>
+              <m:t>0.35</m:t>
+            </m:r>
+          </m:e>
+        </m:d>
+      </m:oMath>
+      <w:r>
+        <w:rPr>
+          <w:rFonts w:ascii="Times New Roman" w:hAnsi="Times New Roman"/>
+        </w:rPr>
+        <w:t xml:space="preserve"> </w:t>
+      </w:r>
+      <w:r>
+        <w:rPr>
+          <w:rFonts w:ascii="Times New Roman" w:hAnsi="Times New Roman"/>
+        </w:rPr>
+        <w:t xml:space="preserve">on random axes;</w:t>
+      </w:r>
+      <w:r>
+        <w:rPr>
+          <w:rFonts w:ascii="Times New Roman" w:hAnsi="Times New Roman"/>
+        </w:rPr>
+        <w:t xml:space="preserve"> </w:t>
+      </w:r>
+      <w:r>
+        <w:rPr>
+          <w:rFonts w:ascii="Times New Roman" w:hAnsi="Times New Roman"/>
+        </w:rPr>
+        <w:t xml:space="preserve">exact spectrum</w:t>
+      </w:r>
+      <w:r>
+        <w:rPr>
+          <w:rFonts w:ascii="Times New Roman" w:hAnsi="Times New Roman"/>
+        </w:rPr>
+        <w:t xml:space="preserve"> </w:t>
+      </w:r>
+      <m:oMath>
+        <m:d>
+          <m:dPr>
+            <m:begChr m:val="("/>
+            <m:endChr m:val=")"/>
+            <m:sepChr m:val=""/>
+            <m:grow/>
+          </m:dPr>
+          <m:e>
+            <m:r>
+              <m:t>0.640</m:t>
+            </m:r>
+            <m:r>
+              <m:rPr>
+                <m:sty m:val="p"/>
+              </m:rPr>
+              <m:t>,</m:t>
+            </m:r>
+            <m:r>
+              <m:t>0.203</m:t>
+            </m:r>
+            <m:r>
+              <m:rPr>
+                <m:sty m:val="p"/>
+              </m:rPr>
+              <m:t>,</m:t>
+            </m:r>
+            <m:r>
+              <m:t>0.122</m:t>
+            </m:r>
+            <m:r>
+              <m:rPr>
+                <m:sty m:val="p"/>
+              </m:rPr>
+              <m:t>,</m:t>
+            </m:r>
+            <m:r>
+              <m:t>0.023</m:t>
+            </m:r>
+            <m:r>
+              <m:rPr>
+                <m:sty m:val="p"/>
+              </m:rPr>
+              <m:t>,</m:t>
+            </m:r>
+            <m:r>
+              <m:t>0.011</m:t>
+            </m:r>
+          </m:e>
+        </m:d>
+      </m:oMath>
+      <w:r>
+        <w:rPr>
+          <w:rFonts w:ascii="Times New Roman" w:hAnsi="Times New Roman"/>
+        </w:rPr>
+        <w:t xml:space="preserve">; one circuit per sample (4 + 10 RBS, 26–28 native</w:t>
+      </w:r>
+      <w:r>
+        <w:rPr>
+          <w:rFonts w:ascii="Times New Roman" w:hAnsi="Times New Roman"/>
+        </w:rPr>
+        <w:t xml:space="preserve"> </w:t>
+      </w:r>
+      <w:r>
+        <w:rPr>
+          <w:rFonts w:ascii="Times New Roman" w:hAnsi="Times New Roman"/>
+        </w:rPr>
+        <w:t xml:space="preserve">two-qubit gates), 2000 shots, on the three devices of §137 and the eighteen of §144, FakeCusco included</w:t>
+      </w:r>
+      <w:r>
+        <w:rPr>
+          <w:rFonts w:ascii="Times New Roman" w:hAnsi="Times New Roman"/>
+        </w:rPr>
+        <w:t xml:space="preserve"> </w:t>
+      </w:r>
+      <w:r>
+        <w:rPr>
+          <w:rFonts w:ascii="Times New Roman" w:hAnsi="Times New Roman"/>
+        </w:rPr>
+        <w:t xml:space="preserve">after the fix. Error is</w:t>
+      </w:r>
+      <w:r>
+        <w:rPr>
+          <w:rFonts w:ascii="Times New Roman" w:hAnsi="Times New Roman"/>
+        </w:rPr>
+        <w:t xml:space="preserve"> </w:t>
+      </w:r>
+      <m:oMath>
+        <m:sSub>
+          <m:e>
+            <m:r>
+              <m:t>L</m:t>
+            </m:r>
+          </m:e>
+          <m:sub>
+            <m:r>
+              <m:t>1</m:t>
+            </m:r>
+          </m:sub>
+        </m:sSub>
+        <m:r>
+          <m:rPr>
+            <m:sty m:val="p"/>
+          </m:rPr>
+          <m:t>=</m:t>
+        </m:r>
+        <m:nary>
+          <m:naryPr>
+            <m:chr m:val="∑"/>
+            <m:limLoc m:val="undOvr"/>
+            <m:subHide m:val="off"/>
+            <m:supHide m:val="on"/>
+          </m:naryPr>
+          <m:sub>
+            <m:r>
+              <m:t>k</m:t>
+            </m:r>
+          </m:sub>
+          <m:sup>
+            <m:r>
+              <m:t>​</m:t>
+            </m:r>
+          </m:sup>
+          <m:e>
+            <m:d>
+              <m:dPr>
+                <m:begChr m:val="|"/>
+                <m:endChr m:val="|"/>
+                <m:sepChr m:val=""/>
+                <m:grow/>
+              </m:dPr>
+              <m:e>
+                <m:sSub>
+                  <m:e>
+                    <m:acc>
+                      <m:accPr>
+                        <m:chr m:val="̂"/>
+                      </m:accPr>
+                      <m:e>
+                        <m:r>
+                          <m:t>λ</m:t>
+                        </m:r>
+                      </m:e>
+                    </m:acc>
+                  </m:e>
+                  <m:sub>
+                    <m:r>
+                      <m:t>k</m:t>
+                    </m:r>
+                  </m:sub>
+                </m:sSub>
+                <m:r>
+                  <m:rPr>
+                    <m:sty m:val="p"/>
+                  </m:rPr>
+                  <m:t>−</m:t>
+                </m:r>
+                <m:sSub>
+                  <m:e>
+                    <m:r>
+                      <m:t>λ</m:t>
+                    </m:r>
+                  </m:e>
+                  <m:sub>
+                    <m:r>
+                      <m:t>k</m:t>
+                    </m:r>
+                  </m:sub>
+                </m:sSub>
+                <m:r>
+                  <m:rPr>
+                    <m:sty m:val="p"/>
+                  </m:rPr>
+                  <m:t>/</m:t>
+                </m:r>
+                <m:r>
+                  <m:rPr>
+                    <m:sty m:val="p"/>
+                  </m:rPr>
+                  <m:t>∑</m:t>
+                </m:r>
+                <m:r>
+                  <m:t>λ</m:t>
+                </m:r>
+              </m:e>
+            </m:d>
+          </m:e>
+        </m:nary>
+      </m:oMath>
+      <w:r>
+        <w:rPr>
+          <w:rFonts w:ascii="Times New Roman" w:hAnsi="Times New Roman"/>
+        </w:rPr>
+        <w:t xml:space="preserve">. All four predictions passed:</w:t>
+      </w:r>
+      <w:r>
+        <w:rPr>
+          <w:rFonts w:ascii="Times New Roman" w:hAnsi="Times New Roman"/>
+        </w:rPr>
+        <w:t xml:space="preserve"> </w:t>
+      </w:r>
+      <w:r>
+        <w:rPr>
+          <w:rFonts w:ascii="Times New Roman" w:hAnsi="Times New Roman"/>
+        </w:rPr>
+        <w:t xml:space="preserve">noiselessly</w:t>
+      </w:r>
+      <w:r>
+        <w:rPr>
+          <w:rFonts w:ascii="Times New Roman" w:hAnsi="Times New Roman"/>
+        </w:rPr>
+        <w:t xml:space="preserve"> </w:t>
+      </w:r>
+      <m:oMath>
+        <m:sSub>
+          <m:e>
+            <m:r>
+              <m:t>L</m:t>
+            </m:r>
+          </m:e>
+          <m:sub>
+            <m:r>
+              <m:t>1</m:t>
+            </m:r>
+          </m:sub>
+        </m:sSub>
+        <m:r>
+          <m:rPr>
+            <m:sty m:val="p"/>
+          </m:rPr>
+          <m:t>=</m:t>
+        </m:r>
+        <m:r>
+          <m:t>0.020</m:t>
+        </m:r>
+      </m:oMath>
+      <w:r>
+        <w:rPr>
+          <w:rFonts w:ascii="Times New Roman" w:hAnsi="Times New Roman"/>
+        </w:rPr>
+        <w:t xml:space="preserve">; all twenty-one ran and filter + read-out was below raw on every one; the median</w:t>
+      </w:r>
+      <w:r>
+        <w:rPr>
+          <w:rFonts w:ascii="Times New Roman" w:hAnsi="Times New Roman"/>
+        </w:rPr>
+        <w:t xml:space="preserve"> </w:t>
+      </w:r>
+      <w:r>
+        <w:rPr>
+          <w:rFonts w:ascii="Times New Roman" w:hAnsi="Times New Roman"/>
+        </w:rPr>
+        <w:t xml:space="preserve">ratio raw / filter + read-out was 4.6 (1.6–7.7); and the five eigenvalues came out in order on 18 of 21</w:t>
+      </w:r>
+      <w:r>
+        <w:rPr>
+          <w:rFonts w:ascii="Times New Roman" w:hAnsi="Times New Roman"/>
+        </w:rPr>
+        <w:t xml:space="preserve"> </w:t>
+      </w:r>
+      <w:r>
+        <w:rPr>
+          <w:rFonts w:ascii="Times New Roman" w:hAnsi="Times New Roman"/>
+        </w:rPr>
+        <w:t xml:space="preserve">(raw 13, read-out 14, filter 18). Median</w:t>
+      </w:r>
+      <w:r>
+        <w:rPr>
+          <w:rFonts w:ascii="Times New Roman" w:hAnsi="Times New Roman"/>
+        </w:rPr>
+        <w:t xml:space="preserve"> </w:t>
+      </w:r>
+      <m:oMath>
+        <m:sSub>
+          <m:e>
+            <m:r>
+              <m:t>L</m:t>
+            </m:r>
+          </m:e>
+          <m:sub>
+            <m:r>
+              <m:t>1</m:t>
+            </m:r>
+          </m:sub>
+        </m:sSub>
+      </m:oMath>
+      <w:r>
+        <w:rPr>
+          <w:rFonts w:ascii="Times New Roman" w:hAnsi="Times New Roman"/>
+        </w:rPr>
+        <w:t xml:space="preserve">: raw 0.266, read-out 0.166, filter 0.062, filter + read-out</w:t>
+      </w:r>
+      <w:r>
+        <w:rPr>
+          <w:rFonts w:ascii="Times New Roman" w:hAnsi="Times New Roman"/>
+        </w:rPr>
+        <w:t xml:space="preserve"> </w:t>
+      </w:r>
+      <w:r>
+        <w:rPr>
+          <w:rFonts w:ascii="Times New Roman" w:hAnsi="Times New Roman"/>
+        </w:rPr>
+        <w:t xml:space="preserve">0.048. The raw estimate is biased upwards for every eigenvalue, because shots that leave the sector add</w:t>
+      </w:r>
+      <w:r>
+        <w:rPr>
+          <w:rFonts w:ascii="Times New Roman" w:hAnsi="Times New Roman"/>
+        </w:rPr>
+        <w:t xml:space="preserve"> </w:t>
+      </w:r>
+      <w:r>
+        <w:rPr>
+          <w:rFonts w:ascii="Times New Roman" w:hAnsi="Times New Roman"/>
+        </w:rPr>
+        <w:t xml:space="preserve">excitations on all qubits (the raw spectrum sums to more than 1); the filter removes that bias. What</w:t>
+      </w:r>
+      <w:r>
+        <w:rPr>
+          <w:rFonts w:ascii="Times New Roman" w:hAnsi="Times New Roman"/>
+        </w:rPr>
+        <w:t xml:space="preserve"> </w:t>
+      </w:r>
+      <w:r>
+        <w:rPr>
+          <w:rFonts w:ascii="Times New Roman" w:hAnsi="Times New Roman"/>
+        </w:rPr>
+        <w:t xml:space="preserve">remains is a flattening of the spectrum that grows as the kept share falls: on FakeKyoto (15% kept) the</w:t>
+      </w:r>
+      <w:r>
+        <w:rPr>
+          <w:rFonts w:ascii="Times New Roman" w:hAnsi="Times New Roman"/>
+        </w:rPr>
+        <w:t xml:space="preserve"> </w:t>
+      </w:r>
+      <w:r>
+        <w:rPr>
+          <w:rFonts w:ascii="Times New Roman" w:hAnsi="Times New Roman"/>
+        </w:rPr>
+        <w:t xml:space="preserve">order is lost, and on FakeBrisbane only the two smallest eigenvalues, 0.012 apart, swap. Quantum PCA’s</w:t>
+      </w:r>
+      <w:r>
+        <w:rPr>
+          <w:rFonts w:ascii="Times New Roman" w:hAnsi="Times New Roman"/>
+        </w:rPr>
+        <w:t xml:space="preserve"> </w:t>
+      </w:r>
+      <w:r>
+        <w:rPr>
+          <w:rFonts w:ascii="Times New Roman" w:hAnsi="Times New Roman"/>
+        </w:rPr>
+        <w:t xml:space="preserve">exponential speed-up rests on the assumption that copies of</w:t>
+      </w:r>
+      <w:r>
+        <w:rPr>
+          <w:rFonts w:ascii="Times New Roman" w:hAnsi="Times New Roman"/>
+        </w:rPr>
+        <w:t xml:space="preserve"> </w:t>
+      </w:r>
+      <m:oMath>
+        <m:r>
+          <m:t>ρ</m:t>
+        </m:r>
+      </m:oMath>
+      <w:r>
+        <w:rPr>
+          <w:rFonts w:ascii="Times New Roman" w:hAnsi="Times New Roman"/>
+        </w:rPr>
+        <w:t xml:space="preserve"> </w:t>
+      </w:r>
+      <w:r>
+        <w:rPr>
+          <w:rFonts w:ascii="Times New Roman" w:hAnsi="Times New Roman"/>
+        </w:rPr>
+        <w:t xml:space="preserve">are given </w:t>
+      </w:r>
+      <w:r>
+        <w:rPr>
+          <w:rFonts w:ascii="Times New Roman" w:hAnsi="Times New Roman"/>
+        </w:rPr>
+        <w:t xml:space="preserve">(</w:t>
+      </w:r>
+      <w:hyperlink w:anchor="ref-tang2021qpca">
+        <w:r>
+          <w:rPr>
+            <w:rStyle w:val="Hyperlink"/>
+          </w:rPr>
+          <w:t xml:space="preserve">Tang 2021</w:t>
+        </w:r>
+      </w:hyperlink>
+      <w:r>
+        <w:rPr>
+          <w:rFonts w:ascii="Times New Roman" w:hAnsi="Times New Roman"/>
+        </w:rPr>
+        <w:t xml:space="preserve">)</w:t>
+      </w:r>
+      <w:r>
+        <w:rPr>
+          <w:rFonts w:ascii="Times New Roman" w:hAnsi="Times New Roman"/>
+        </w:rPr>
+        <w:t xml:space="preserve">; this</w:t>
+      </w:r>
+      <w:r>
+        <w:rPr>
+          <w:rFonts w:ascii="Times New Roman" w:hAnsi="Times New Roman"/>
+        </w:rPr>
+        <w:t xml:space="preserve"> </w:t>
+      </w:r>
+      <w:r>
+        <w:rPr>
+          <w:rFonts w:ascii="Times New Roman" w:hAnsi="Times New Roman"/>
+        </w:rPr>
+        <w:t xml:space="preserve">experiment makes no claim on it.</w:t>
+      </w:r>
+    </w:p>
+    <w:bookmarkEnd w:id="40"/>
+    <w:bookmarkEnd w:id="41"/>
+    <w:bookmarkStart w:id="42" w:name="discussion"/>
     <w:p>
       <w:pPr>
         <w:pStyle w:val="Heading1"/>
@@ -8311,7 +10189,33 @@
         <w:rPr>
           <w:rFonts w:ascii="Times New Roman" w:hAnsi="Times New Roman"/>
         </w:rPr>
-        <w:t xml:space="preserve">mostly far from threshold. Nine of the twenty-three predictions failed as written, several through the analysis rather</w:t>
+        <w:t xml:space="preserve">mostly far from threshold; spectrum estimation, where the answer is a set of</w:t>
+      </w:r>
+      <w:r>
+        <w:rPr>
+          <w:rFonts w:ascii="Times New Roman" w:hAnsi="Times New Roman"/>
+        </w:rPr>
+        <w:t xml:space="preserve"> </w:t>
+      </w:r>
+      <w:r>
+        <w:rPr>
+          <w:rFonts w:ascii="Times New Roman" w:hAnsi="Times New Roman"/>
+        </w:rPr>
+        <w:t xml:space="preserve">probabilities rather than a decision, gains more (4.6</w:t>
+      </w:r>
+      <m:oMath>
+        <m:r>
+          <m:rPr>
+            <m:sty m:val="p"/>
+          </m:rPr>
+          <m:t>×</m:t>
+        </m:r>
+      </m:oMath>
+      <w:r>
+        <w:rPr>
+          <w:rFonts w:ascii="Times New Roman" w:hAnsi="Times New Roman"/>
+        </w:rPr>
+        <w:t xml:space="preserve">). Nine of the twenty-seven predictions failed as written, several through the analysis rather</w:t>
       </w:r>
       <w:r>
         <w:rPr>
@@ -8362,8 +10266,8 @@
         <w:t xml:space="preserve">are absent. A run on hardware is the next step.</w:t>
       </w:r>
     </w:p>
-    <w:bookmarkEnd w:id="40"/>
-    <w:bookmarkStart w:id="60" w:name="code-and-data-availability"/>
+    <w:bookmarkEnd w:id="42"/>
+    <w:bookmarkStart w:id="66" w:name="code-and-data-availability"/>
     <w:p>
       <w:pPr>
         <w:pStyle w:val="Heading1"/>
@@ -8383,15 +10287,27 @@
         <w:rPr>
           <w:rFonts w:ascii="Times New Roman" w:hAnsi="Times New Roman"/>
         </w:rPr>
-        <w:t xml:space="preserve">Everything is in the open-source library qang (MIT license), version 0.9.0 and later:</w:t>
-      </w:r>
-      <w:r>
-        <w:rPr>
-          <w:rFonts w:ascii="Times New Roman" w:hAnsi="Times New Roman"/>
-        </w:rPr>
-        <w:t xml:space="preserve"> </w:t>
-      </w:r>
-      <w:hyperlink r:id="rId41">
+        <w:t xml:space="preserve">Everything is in the open-source library qang (MIT license), version 0.9.0 and later (the</w:t>
+      </w:r>
+      <w:r>
+        <w:rPr>
+          <w:rFonts w:ascii="Times New Roman" w:hAnsi="Times New Roman"/>
+        </w:rPr>
+        <w:t xml:space="preserve"> </w:t>
+      </w:r>
+      <w:r>
+        <w:rPr>
+          <w:rFonts w:ascii="Times New Roman" w:hAnsi="Times New Roman"/>
+        </w:rPr>
+        <w:t xml:space="preserve">functions of §146 are in the repository and in the next release):</w:t>
+      </w:r>
+      <w:r>
+        <w:rPr>
+          <w:rFonts w:ascii="Times New Roman" w:hAnsi="Times New Roman"/>
+        </w:rPr>
+        <w:t xml:space="preserve"> </w:t>
+      </w:r>
+      <w:hyperlink r:id="rId43">
         <w:r>
           <w:rPr>
             <w:rStyle w:val="Hyperlink"/>
@@ -8678,8 +10594,8 @@
         <w:t xml:space="preserve">]</w:t>
       </w:r>
     </w:p>
-    <w:bookmarkStart w:id="59" w:name="refs"/>
-    <w:bookmarkStart w:id="42" w:name="ref-bonetmonroig2018"/>
+    <w:bookmarkStart w:id="65" w:name="refs"/>
+    <w:bookmarkStart w:id="44" w:name="ref-bonetmonroig2018"/>
     <w:p>
       <w:pPr>
         <w:pStyle w:val="Bibliography"/>
@@ -8729,8 +10645,8 @@
         <w:t xml:space="preserve">98: 062339.</w:t>
       </w:r>
     </w:p>
-    <w:bookmarkEnd w:id="42"/>
-    <w:bookmarkStart w:id="44" w:name="ref-bravyi2021readout"/>
+    <w:bookmarkEnd w:id="44"/>
+    <w:bookmarkStart w:id="46" w:name="ref-bravyi2021readout"/>
     <w:p>
       <w:pPr>
         <w:pStyle w:val="Bibliography"/>
@@ -8785,7 +10701,7 @@
         </w:rPr>
         <w:t xml:space="preserve"> </w:t>
       </w:r>
-      <w:hyperlink r:id="rId43">
+      <w:hyperlink r:id="rId45">
         <w:r>
           <w:rPr>
             <w:rStyle w:val="Hyperlink"/>
@@ -8800,8 +10716,8 @@
         <w:t xml:space="preserve">.</w:t>
       </w:r>
     </w:p>
-    <w:bookmarkEnd w:id="44"/>
-    <w:bookmarkStart w:id="46" w:name="ref-giurgicatiron2020"/>
+    <w:bookmarkEnd w:id="46"/>
+    <w:bookmarkStart w:id="48" w:name="ref-giurgicatiron2020"/>
     <w:p>
       <w:pPr>
         <w:pStyle w:val="Bibliography"/>
@@ -8862,7 +10778,7 @@
         </w:rPr>
         <w:t xml:space="preserve"> </w:t>
       </w:r>
-      <w:hyperlink r:id="rId45">
+      <w:hyperlink r:id="rId47">
         <w:r>
           <w:rPr>
             <w:rStyle w:val="Hyperlink"/>
@@ -8877,8 +10793,8 @@
         <w:t xml:space="preserve">.</w:t>
       </w:r>
     </w:p>
-    <w:bookmarkEnd w:id="46"/>
-    <w:bookmarkStart w:id="48" w:name="ref-qiskitibmruntime"/>
+    <w:bookmarkEnd w:id="48"/>
+    <w:bookmarkStart w:id="50" w:name="ref-qiskitibmruntime"/>
     <w:p>
       <w:pPr>
         <w:pStyle w:val="Bibliography"/>
@@ -8931,7 +10847,7 @@
         </w:rPr>
         <w:t xml:space="preserve"> </w:t>
       </w:r>
-      <w:hyperlink r:id="rId47">
+      <w:hyperlink r:id="rId49">
         <w:r>
           <w:rPr>
             <w:rStyle w:val="Hyperlink"/>
@@ -8946,8 +10862,8 @@
         <w:t xml:space="preserve">.</w:t>
       </w:r>
     </w:p>
-    <w:bookmarkEnd w:id="48"/>
-    <w:bookmarkStart w:id="50" w:name="ref-javadiabhari2024qiskit"/>
+    <w:bookmarkEnd w:id="50"/>
+    <w:bookmarkStart w:id="52" w:name="ref-javadiabhari2024qiskit"/>
     <w:p>
       <w:pPr>
         <w:pStyle w:val="Bibliography"/>
@@ -8994,7 +10910,7 @@
         </w:rPr>
         <w:t xml:space="preserve"> </w:t>
       </w:r>
-      <w:hyperlink r:id="rId49">
+      <w:hyperlink r:id="rId51">
         <w:r>
           <w:rPr>
             <w:rStyle w:val="Hyperlink"/>
@@ -9009,8 +10925,8 @@
         <w:t xml:space="preserve">.</w:t>
       </w:r>
     </w:p>
-    <w:bookmarkEnd w:id="50"/>
-    <w:bookmarkStart w:id="51" w:name="ref-mcardle2019"/>
+    <w:bookmarkEnd w:id="52"/>
+    <w:bookmarkStart w:id="54" w:name="ref-lloyd2014qpca"/>
     <w:p>
       <w:pPr>
         <w:pStyle w:val="Bibliography"/>
@@ -9019,19 +10935,19 @@
         <w:rPr>
           <w:rFonts w:ascii="Times New Roman" w:hAnsi="Times New Roman"/>
         </w:rPr>
-        <w:t xml:space="preserve">McArdle, Sam, Xiao Yuan, and Simon Benjamin. 2019.</w:t>
-      </w:r>
-      <w:r>
-        <w:rPr>
-          <w:rFonts w:ascii="Times New Roman" w:hAnsi="Times New Roman"/>
-        </w:rPr>
-        <w:t xml:space="preserve"> </w:t>
-      </w:r>
-      <w:r>
-        <w:rPr>
-          <w:rFonts w:ascii="Times New Roman" w:hAnsi="Times New Roman"/>
-        </w:rPr>
-        <w:t xml:space="preserve">“Error-Mitigated Digital Quantum Simulation.”</w:t>
+        <w:t xml:space="preserve">Lloyd, Seth, Masoud Mohseni, and Patrick Rebentrost. 2014.</w:t>
+      </w:r>
+      <w:r>
+        <w:rPr>
+          <w:rFonts w:ascii="Times New Roman" w:hAnsi="Times New Roman"/>
+        </w:rPr>
+        <w:t xml:space="preserve"> </w:t>
+      </w:r>
+      <w:r>
+        <w:rPr>
+          <w:rFonts w:ascii="Times New Roman" w:hAnsi="Times New Roman"/>
+        </w:rPr>
+        <w:t xml:space="preserve">“Quantum Principal Component Analysis.”</w:t>
       </w:r>
       <w:r>
         <w:rPr>
@@ -9045,23 +10961,43 @@
           <w:rFonts w:ascii="Times New Roman" w:hAnsi="Times New Roman"/>
           <w:i/>
         </w:rPr>
-        <w:t xml:space="preserve">Physical Review Letters</w:t>
-      </w:r>
-      <w:r>
-        <w:rPr>
-          <w:rFonts w:ascii="Times New Roman" w:hAnsi="Times New Roman"/>
-        </w:rPr>
-        <w:t xml:space="preserve"> </w:t>
-      </w:r>
-      <w:r>
-        <w:rPr>
-          <w:rFonts w:ascii="Times New Roman" w:hAnsi="Times New Roman"/>
-        </w:rPr>
-        <w:t xml:space="preserve">122: 180501.</w:t>
+        <w:t xml:space="preserve">Nature Physics</w:t>
+      </w:r>
+      <w:r>
+        <w:rPr>
+          <w:rFonts w:ascii="Times New Roman" w:hAnsi="Times New Roman"/>
+        </w:rPr>
+        <w:t xml:space="preserve"> </w:t>
+      </w:r>
+      <w:r>
+        <w:rPr>
+          <w:rFonts w:ascii="Times New Roman" w:hAnsi="Times New Roman"/>
+        </w:rPr>
+        <w:t xml:space="preserve">10: 631–33.</w:t>
+      </w:r>
+      <w:r>
+        <w:rPr>
+          <w:rFonts w:ascii="Times New Roman" w:hAnsi="Times New Roman"/>
+        </w:rPr>
+        <w:t xml:space="preserve"> </w:t>
+      </w:r>
+      <w:hyperlink r:id="rId53">
+        <w:r>
+          <w:rPr>
+            <w:rStyle w:val="Hyperlink"/>
+          </w:rPr>
+          <w:t xml:space="preserve">https://doi.org/10.1038/nphys3029</w:t>
+        </w:r>
+      </w:hyperlink>
+      <w:r>
+        <w:rPr>
+          <w:rFonts w:ascii="Times New Roman" w:hAnsi="Times New Roman"/>
+        </w:rPr>
+        <w:t xml:space="preserve">.</w:t>
       </w:r>
     </w:p>
-    <w:bookmarkEnd w:id="51"/>
-    <w:bookmarkStart w:id="53" w:name="ref-monteverde2026qang"/>
+    <w:bookmarkEnd w:id="54"/>
+    <w:bookmarkStart w:id="55" w:name="ref-mcardle2019"/>
     <w:p>
       <w:pPr>
         <w:pStyle w:val="Bibliography"/>
@@ -9070,6 +11006,57 @@
         <w:rPr>
           <w:rFonts w:ascii="Times New Roman" w:hAnsi="Times New Roman"/>
         </w:rPr>
+        <w:t xml:space="preserve">McArdle, Sam, Xiao Yuan, and Simon Benjamin. 2019.</w:t>
+      </w:r>
+      <w:r>
+        <w:rPr>
+          <w:rFonts w:ascii="Times New Roman" w:hAnsi="Times New Roman"/>
+        </w:rPr>
+        <w:t xml:space="preserve"> </w:t>
+      </w:r>
+      <w:r>
+        <w:rPr>
+          <w:rFonts w:ascii="Times New Roman" w:hAnsi="Times New Roman"/>
+        </w:rPr>
+        <w:t xml:space="preserve">“Error-Mitigated Digital Quantum Simulation.”</w:t>
+      </w:r>
+      <w:r>
+        <w:rPr>
+          <w:rFonts w:ascii="Times New Roman" w:hAnsi="Times New Roman"/>
+        </w:rPr>
+        <w:t xml:space="preserve"> </w:t>
+      </w:r>
+      <w:r>
+        <w:rPr>
+          <w:iCs/>
+          <w:rFonts w:ascii="Times New Roman" w:hAnsi="Times New Roman"/>
+          <w:i/>
+        </w:rPr>
+        <w:t xml:space="preserve">Physical Review Letters</w:t>
+      </w:r>
+      <w:r>
+        <w:rPr>
+          <w:rFonts w:ascii="Times New Roman" w:hAnsi="Times New Roman"/>
+        </w:rPr>
+        <w:t xml:space="preserve"> </w:t>
+      </w:r>
+      <w:r>
+        <w:rPr>
+          <w:rFonts w:ascii="Times New Roman" w:hAnsi="Times New Roman"/>
+        </w:rPr>
+        <w:t xml:space="preserve">122: 180501.</w:t>
+      </w:r>
+    </w:p>
+    <w:bookmarkEnd w:id="55"/>
+    <w:bookmarkStart w:id="57" w:name="ref-monteverde2026qang"/>
+    <w:p>
+      <w:pPr>
+        <w:pStyle w:val="Bibliography"/>
+      </w:pPr>
+      <w:r>
+        <w:rPr>
+          <w:rFonts w:ascii="Times New Roman" w:hAnsi="Times New Roman"/>
+        </w:rPr>
         <w:t xml:space="preserve">Monteverde, Vicente Humberto. 2026a.</w:t>
       </w:r>
       <w:r>
@@ -9114,7 +11101,7 @@
         </w:rPr>
         <w:t xml:space="preserve"> </w:t>
       </w:r>
-      <w:hyperlink r:id="rId52">
+      <w:hyperlink r:id="rId56">
         <w:r>
           <w:rPr>
             <w:rStyle w:val="Hyperlink"/>
@@ -9129,8 +11116,8 @@
         <w:t xml:space="preserve">.</w:t>
       </w:r>
     </w:p>
-    <w:bookmarkEnd w:id="53"/>
-    <w:bookmarkStart w:id="54" w:name="ref-monteverde2026qml"/>
+    <w:bookmarkEnd w:id="57"/>
+    <w:bookmarkStart w:id="58" w:name="ref-monteverde2026qml"/>
     <w:p>
       <w:pPr>
         <w:pStyle w:val="Bibliography"/>
@@ -9172,8 +11159,8 @@
         <w:t xml:space="preserve">-Limited Hardware: What the Qg Symmetry Filter Does and Does Not Do.”</w:t>
       </w:r>
     </w:p>
-    <w:bookmarkEnd w:id="54"/>
-    <w:bookmarkStart w:id="56" w:name="ref-qiskitml"/>
+    <w:bookmarkEnd w:id="58"/>
+    <w:bookmarkStart w:id="60" w:name="ref-qiskitml"/>
     <w:p>
       <w:pPr>
         <w:pStyle w:val="Bibliography"/>
@@ -9202,7 +11189,7 @@
         </w:rPr>
         <w:t xml:space="preserve"> </w:t>
       </w:r>
-      <w:hyperlink r:id="rId55">
+      <w:hyperlink r:id="rId59">
         <w:r>
           <w:rPr>
             <w:rStyle w:val="Hyperlink"/>
@@ -9217,8 +11204,8 @@
         <w:t xml:space="preserve">.</w:t>
       </w:r>
     </w:p>
-    <w:bookmarkEnd w:id="56"/>
-    <w:bookmarkStart w:id="58" w:name="ref-temme2017"/>
+    <w:bookmarkEnd w:id="60"/>
+    <w:bookmarkStart w:id="62" w:name="ref-tang2021qpca"/>
     <w:p>
       <w:pPr>
         <w:pStyle w:val="Bibliography"/>
@@ -9227,6 +11214,77 @@
         <w:rPr>
           <w:rFonts w:ascii="Times New Roman" w:hAnsi="Times New Roman"/>
         </w:rPr>
+        <w:t xml:space="preserve">Tang, Ewin. 2021.</w:t>
+      </w:r>
+      <w:r>
+        <w:rPr>
+          <w:rFonts w:ascii="Times New Roman" w:hAnsi="Times New Roman"/>
+        </w:rPr>
+        <w:t xml:space="preserve"> </w:t>
+      </w:r>
+      <w:r>
+        <w:rPr>
+          <w:rFonts w:ascii="Times New Roman" w:hAnsi="Times New Roman"/>
+        </w:rPr>
+        <w:t xml:space="preserve">“Quantum Principal Component Analysis Only Achieves an Exponential Speedup Because of Its State Preparation Assumptions.”</w:t>
+      </w:r>
+      <w:r>
+        <w:rPr>
+          <w:rFonts w:ascii="Times New Roman" w:hAnsi="Times New Roman"/>
+        </w:rPr>
+        <w:t xml:space="preserve"> </w:t>
+      </w:r>
+      <w:r>
+        <w:rPr>
+          <w:iCs/>
+          <w:rFonts w:ascii="Times New Roman" w:hAnsi="Times New Roman"/>
+          <w:i/>
+        </w:rPr>
+        <w:t xml:space="preserve">Physical Review Letters</w:t>
+      </w:r>
+      <w:r>
+        <w:rPr>
+          <w:rFonts w:ascii="Times New Roman" w:hAnsi="Times New Roman"/>
+        </w:rPr>
+        <w:t xml:space="preserve"> </w:t>
+      </w:r>
+      <w:r>
+        <w:rPr>
+          <w:rFonts w:ascii="Times New Roman" w:hAnsi="Times New Roman"/>
+        </w:rPr>
+        <w:t xml:space="preserve">127: 060503.</w:t>
+      </w:r>
+      <w:r>
+        <w:rPr>
+          <w:rFonts w:ascii="Times New Roman" w:hAnsi="Times New Roman"/>
+        </w:rPr>
+        <w:t xml:space="preserve"> </w:t>
+      </w:r>
+      <w:hyperlink r:id="rId61">
+        <w:r>
+          <w:rPr>
+            <w:rStyle w:val="Hyperlink"/>
+          </w:rPr>
+          <w:t xml:space="preserve">https://doi.org/10.1103/PhysRevLett.127.060503</w:t>
+        </w:r>
+      </w:hyperlink>
+      <w:r>
+        <w:rPr>
+          <w:rFonts w:ascii="Times New Roman" w:hAnsi="Times New Roman"/>
+        </w:rPr>
+        <w:t xml:space="preserve">.</w:t>
+      </w:r>
+    </w:p>
+    <w:bookmarkEnd w:id="62"/>
+    <w:bookmarkStart w:id="64" w:name="ref-temme2017"/>
+    <w:p>
+      <w:pPr>
+        <w:pStyle w:val="Bibliography"/>
+      </w:pPr>
+      <w:r>
+        <w:rPr>
+          <w:rFonts w:ascii="Times New Roman" w:hAnsi="Times New Roman"/>
+        </w:rPr>
         <w:t xml:space="preserve">Temme, Kristan, Sergey Bravyi, and Jay M. Gambetta. 2017.</w:t>
       </w:r>
       <w:r>
@@ -9273,7 +11331,7 @@
         </w:rPr>
         <w:t xml:space="preserve"> </w:t>
       </w:r>
-      <w:hyperlink r:id="rId57">
+      <w:hyperlink r:id="rId63">
         <w:r>
           <w:rPr>
             <w:rStyle w:val="Hyperlink"/>
@@ -9288,9 +11346,9 @@
         <w:t xml:space="preserve">.</w:t>
       </w:r>
     </w:p>
-    <w:bookmarkEnd w:id="58"/>
-    <w:bookmarkEnd w:id="59"/>
-    <w:bookmarkEnd w:id="60"/>
+    <w:bookmarkEnd w:id="64"/>
+    <w:bookmarkEnd w:id="65"/>
+    <w:bookmarkEnd w:id="66"/>
     <w:sectPr/>
   </w:body>
 </w:document>

</xml_diff>

<commit_message>
IBM paper (EN and ES): section 147, Trotter simulation and a quantum walk, with a figure; Word export keeps each figure
Co-Authored-By: Claude Opus 5.5 <noreply@anthropic.com>
Claude-Session: https://claude.ai/code/session_01VmfpwzVWvRWhRHG7VzpiEN
</commit_message>
<xml_diff>
--- a/manuscript/qang_ibm.docx
+++ b/manuscript/qang_ibm.docx
@@ -4294,6 +4294,582 @@
         <w:rPr>
           <w:rFonts w:ascii="Times New Roman" w:hAnsi="Times New Roman"/>
         </w:rPr>
+        <w:t xml:space="preserve">In</w:t>
+      </w:r>
+      <w:r>
+        <w:rPr>
+          <w:rFonts w:ascii="Times New Roman" w:hAnsi="Times New Roman"/>
+        </w:rPr>
+        <w:t xml:space="preserve"> </w:t>
+      </w:r>
+      <w:r>
+        <w:rPr>
+          <w:rFonts w:ascii="Times New Roman" w:hAnsi="Times New Roman"/>
+        </w:rPr>
+        <w:t xml:space="preserve">Trotter</w:t>
+      </w:r>
+      <w:r>
+        <w:rPr>
+          <w:rFonts w:ascii="Times New Roman" w:hAnsi="Times New Roman"/>
+        </w:rPr>
+        <w:t xml:space="preserve"> </w:t>
+      </w:r>
+      <w:r>
+        <w:rPr>
+          <w:rFonts w:ascii="Times New Roman" w:hAnsi="Times New Roman"/>
+        </w:rPr>
+        <w:t xml:space="preserve">simulation</w:t>
+      </w:r>
+      <w:r>
+        <w:rPr>
+          <w:rFonts w:ascii="Times New Roman" w:hAnsi="Times New Roman"/>
+        </w:rPr>
+        <w:t xml:space="preserve"> </w:t>
+      </w:r>
+      <w:r>
+        <w:rPr>
+          <w:rFonts w:ascii="Times New Roman" w:hAnsi="Times New Roman"/>
+        </w:rPr>
+        <w:t xml:space="preserve">of</w:t>
+      </w:r>
+      <w:r>
+        <w:rPr>
+          <w:rFonts w:ascii="Times New Roman" w:hAnsi="Times New Roman"/>
+        </w:rPr>
+        <w:t xml:space="preserve"> </w:t>
+      </w:r>
+      <w:r>
+        <w:rPr>
+          <w:rFonts w:ascii="Times New Roman" w:hAnsi="Times New Roman"/>
+        </w:rPr>
+        <w:t xml:space="preserve">the</w:t>
+      </w:r>
+      <w:r>
+        <w:rPr>
+          <w:rFonts w:ascii="Times New Roman" w:hAnsi="Times New Roman"/>
+        </w:rPr>
+        <w:t xml:space="preserve"> </w:t>
+      </w:r>
+      <w:r>
+        <w:rPr>
+          <w:rFonts w:ascii="Times New Roman" w:hAnsi="Times New Roman"/>
+        </w:rPr>
+        <w:t xml:space="preserve">XY</w:t>
+      </w:r>
+      <w:r>
+        <w:rPr>
+          <w:rFonts w:ascii="Times New Roman" w:hAnsi="Times New Roman"/>
+        </w:rPr>
+        <w:t xml:space="preserve"> </w:t>
+      </w:r>
+      <w:r>
+        <w:rPr>
+          <w:rFonts w:ascii="Times New Roman" w:hAnsi="Times New Roman"/>
+        </w:rPr>
+        <w:t xml:space="preserve">chain</w:t>
+      </w:r>
+      <w:r>
+        <w:rPr>
+          <w:rFonts w:ascii="Times New Roman" w:hAnsi="Times New Roman"/>
+        </w:rPr>
+        <w:t xml:space="preserve"> </w:t>
+      </w:r>
+      <w:r>
+        <w:rPr>
+          <w:rFonts w:ascii="Times New Roman" w:hAnsi="Times New Roman"/>
+        </w:rPr>
+        <w:t xml:space="preserve">the</w:t>
+      </w:r>
+      <w:r>
+        <w:rPr>
+          <w:rFonts w:ascii="Times New Roman" w:hAnsi="Times New Roman"/>
+        </w:rPr>
+        <w:t xml:space="preserve"> </w:t>
+      </w:r>
+      <w:r>
+        <w:rPr>
+          <w:rFonts w:ascii="Times New Roman" w:hAnsi="Times New Roman"/>
+        </w:rPr>
+        <w:t xml:space="preserve">filter</w:t>
+      </w:r>
+      <w:r>
+        <w:rPr>
+          <w:rFonts w:ascii="Times New Roman" w:hAnsi="Times New Roman"/>
+        </w:rPr>
+        <w:t xml:space="preserve"> </w:t>
+      </w:r>
+      <w:r>
+        <w:rPr>
+          <w:rFonts w:ascii="Times New Roman" w:hAnsi="Times New Roman"/>
+        </w:rPr>
+        <w:t xml:space="preserve">halves</w:t>
+      </w:r>
+      <w:r>
+        <w:rPr>
+          <w:rFonts w:ascii="Times New Roman" w:hAnsi="Times New Roman"/>
+        </w:rPr>
+        <w:t xml:space="preserve"> </w:t>
+      </w:r>
+      <w:r>
+        <w:rPr>
+          <w:rFonts w:ascii="Times New Roman" w:hAnsi="Times New Roman"/>
+        </w:rPr>
+        <w:t xml:space="preserve">the</w:t>
+      </w:r>
+      <w:r>
+        <w:rPr>
+          <w:rFonts w:ascii="Times New Roman" w:hAnsi="Times New Roman"/>
+        </w:rPr>
+        <w:t xml:space="preserve"> </w:t>
+      </w:r>
+      <w:r>
+        <w:rPr>
+          <w:rFonts w:ascii="Times New Roman" w:hAnsi="Times New Roman"/>
+        </w:rPr>
+        <w:t xml:space="preserve">best</w:t>
+      </w:r>
+      <w:r>
+        <w:rPr>
+          <w:rFonts w:ascii="Times New Roman" w:hAnsi="Times New Roman"/>
+        </w:rPr>
+        <w:t xml:space="preserve"> </w:t>
+      </w:r>
+      <w:r>
+        <w:rPr>
+          <w:rFonts w:ascii="Times New Roman" w:hAnsi="Times New Roman"/>
+        </w:rPr>
+        <w:t xml:space="preserve">error</w:t>
+      </w:r>
+      <w:r>
+        <w:rPr>
+          <w:rFonts w:ascii="Times New Roman" w:hAnsi="Times New Roman"/>
+        </w:rPr>
+        <w:t xml:space="preserve"> </w:t>
+      </w:r>
+      <w:r>
+        <w:rPr>
+          <w:rFonts w:ascii="Times New Roman" w:hAnsi="Times New Roman"/>
+        </w:rPr>
+        <w:t xml:space="preserve">and</w:t>
+      </w:r>
+      <w:r>
+        <w:rPr>
+          <w:rFonts w:ascii="Times New Roman" w:hAnsi="Times New Roman"/>
+        </w:rPr>
+        <w:t xml:space="preserve"> </w:t>
+      </w:r>
+      <w:r>
+        <w:rPr>
+          <w:rFonts w:ascii="Times New Roman" w:hAnsi="Times New Roman"/>
+        </w:rPr>
+        <w:t xml:space="preserve">moves</w:t>
+      </w:r>
+      <w:r>
+        <w:rPr>
+          <w:rFonts w:ascii="Times New Roman" w:hAnsi="Times New Roman"/>
+        </w:rPr>
+        <w:t xml:space="preserve"> </w:t>
+      </w:r>
+      <w:r>
+        <w:rPr>
+          <w:rFonts w:ascii="Times New Roman" w:hAnsi="Times New Roman"/>
+        </w:rPr>
+        <w:t xml:space="preserve">the</w:t>
+      </w:r>
+      <w:r>
+        <w:rPr>
+          <w:rFonts w:ascii="Times New Roman" w:hAnsi="Times New Roman"/>
+        </w:rPr>
+        <w:t xml:space="preserve"> </w:t>
+      </w:r>
+      <w:r>
+        <w:rPr>
+          <w:rFonts w:ascii="Times New Roman" w:hAnsi="Times New Roman"/>
+        </w:rPr>
+        <w:t xml:space="preserve">optimal</w:t>
+      </w:r>
+      <w:r>
+        <w:rPr>
+          <w:rFonts w:ascii="Times New Roman" w:hAnsi="Times New Roman"/>
+        </w:rPr>
+        <w:t xml:space="preserve"> </w:t>
+      </w:r>
+      <w:r>
+        <w:rPr>
+          <w:rFonts w:ascii="Times New Roman" w:hAnsi="Times New Roman"/>
+        </w:rPr>
+        <w:t xml:space="preserve">number</w:t>
+      </w:r>
+      <w:r>
+        <w:rPr>
+          <w:rFonts w:ascii="Times New Roman" w:hAnsi="Times New Roman"/>
+        </w:rPr>
+        <w:t xml:space="preserve"> </w:t>
+      </w:r>
+      <w:r>
+        <w:rPr>
+          <w:rFonts w:ascii="Times New Roman" w:hAnsi="Times New Roman"/>
+        </w:rPr>
+        <w:t xml:space="preserve">of</w:t>
+      </w:r>
+      <w:r>
+        <w:rPr>
+          <w:rFonts w:ascii="Times New Roman" w:hAnsi="Times New Roman"/>
+        </w:rPr>
+        <w:t xml:space="preserve"> </w:t>
+      </w:r>
+      <w:r>
+        <w:rPr>
+          <w:rFonts w:ascii="Times New Roman" w:hAnsi="Times New Roman"/>
+        </w:rPr>
+        <w:t xml:space="preserve">Trotter</w:t>
+      </w:r>
+      <w:r>
+        <w:rPr>
+          <w:rFonts w:ascii="Times New Roman" w:hAnsi="Times New Roman"/>
+        </w:rPr>
+        <w:t xml:space="preserve"> </w:t>
+      </w:r>
+      <w:r>
+        <w:rPr>
+          <w:rFonts w:ascii="Times New Roman" w:hAnsi="Times New Roman"/>
+        </w:rPr>
+        <w:t xml:space="preserve">steps</w:t>
+      </w:r>
+      <w:r>
+        <w:rPr>
+          <w:rFonts w:ascii="Times New Roman" w:hAnsi="Times New Roman"/>
+        </w:rPr>
+        <w:t xml:space="preserve"> </w:t>
+      </w:r>
+      <w:r>
+        <w:rPr>
+          <w:rFonts w:ascii="Times New Roman" w:hAnsi="Times New Roman"/>
+        </w:rPr>
+        <w:t xml:space="preserve">deeper</w:t>
+      </w:r>
+      <w:r>
+        <w:rPr>
+          <w:rFonts w:ascii="Times New Roman" w:hAnsi="Times New Roman"/>
+        </w:rPr>
+        <w:t xml:space="preserve"> </w:t>
+      </w:r>
+      <w:r>
+        <w:rPr>
+          <w:rFonts w:ascii="Times New Roman" w:hAnsi="Times New Roman"/>
+        </w:rPr>
+        <w:t xml:space="preserve">(16</w:t>
+      </w:r>
+      <w:r>
+        <w:rPr>
+          <w:rFonts w:ascii="Times New Roman" w:hAnsi="Times New Roman"/>
+        </w:rPr>
+        <w:t xml:space="preserve"> </w:t>
+      </w:r>
+      <w:r>
+        <w:rPr>
+          <w:rFonts w:ascii="Times New Roman" w:hAnsi="Times New Roman"/>
+        </w:rPr>
+        <w:t xml:space="preserve">of</w:t>
+      </w:r>
+      <w:r>
+        <w:rPr>
+          <w:rFonts w:ascii="Times New Roman" w:hAnsi="Times New Roman"/>
+        </w:rPr>
+        <w:t xml:space="preserve"> </w:t>
+      </w:r>
+      <w:r>
+        <w:rPr>
+          <w:rFonts w:ascii="Times New Roman" w:hAnsi="Times New Roman"/>
+        </w:rPr>
+        <w:t xml:space="preserve">21</w:t>
+      </w:r>
+      <w:r>
+        <w:rPr>
+          <w:rFonts w:ascii="Times New Roman" w:hAnsi="Times New Roman"/>
+        </w:rPr>
+        <w:t xml:space="preserve"> </w:t>
+      </w:r>
+      <w:r>
+        <w:rPr>
+          <w:rFonts w:ascii="Times New Roman" w:hAnsi="Times New Roman"/>
+        </w:rPr>
+        <w:t xml:space="preserve">devices),</w:t>
+      </w:r>
+      <w:r>
+        <w:rPr>
+          <w:rFonts w:ascii="Times New Roman" w:hAnsi="Times New Roman"/>
+        </w:rPr>
+        <w:t xml:space="preserve"> </w:t>
+      </w:r>
+      <w:r>
+        <w:rPr>
+          <w:rFonts w:ascii="Times New Roman" w:hAnsi="Times New Roman"/>
+        </w:rPr>
+        <w:t xml:space="preserve">and</w:t>
+      </w:r>
+      <w:r>
+        <w:rPr>
+          <w:rFonts w:ascii="Times New Roman" w:hAnsi="Times New Roman"/>
+        </w:rPr>
+        <w:t xml:space="preserve"> </w:t>
+      </w:r>
+      <w:r>
+        <w:rPr>
+          <w:rFonts w:ascii="Times New Roman" w:hAnsi="Times New Roman"/>
+        </w:rPr>
+        <w:t xml:space="preserve">in</w:t>
+      </w:r>
+      <w:r>
+        <w:rPr>
+          <w:rFonts w:ascii="Times New Roman" w:hAnsi="Times New Roman"/>
+        </w:rPr>
+        <w:t xml:space="preserve"> </w:t>
+      </w:r>
+      <w:r>
+        <w:rPr>
+          <w:rFonts w:ascii="Times New Roman" w:hAnsi="Times New Roman"/>
+        </w:rPr>
+        <w:t xml:space="preserve">a</w:t>
+      </w:r>
+      <w:r>
+        <w:rPr>
+          <w:rFonts w:ascii="Times New Roman" w:hAnsi="Times New Roman"/>
+        </w:rPr>
+        <w:t xml:space="preserve"> </w:t>
+      </w:r>
+      <w:r>
+        <w:rPr>
+          <w:rFonts w:ascii="Times New Roman" w:hAnsi="Times New Roman"/>
+        </w:rPr>
+        <w:t xml:space="preserve">quantum</w:t>
+      </w:r>
+      <w:r>
+        <w:rPr>
+          <w:rFonts w:ascii="Times New Roman" w:hAnsi="Times New Roman"/>
+        </w:rPr>
+        <w:t xml:space="preserve"> </w:t>
+      </w:r>
+      <w:r>
+        <w:rPr>
+          <w:rFonts w:ascii="Times New Roman" w:hAnsi="Times New Roman"/>
+        </w:rPr>
+        <w:t xml:space="preserve">walk</w:t>
+      </w:r>
+      <w:r>
+        <w:rPr>
+          <w:rFonts w:ascii="Times New Roman" w:hAnsi="Times New Roman"/>
+        </w:rPr>
+        <w:t xml:space="preserve"> </w:t>
+      </w:r>
+      <w:r>
+        <w:rPr>
+          <w:rFonts w:ascii="Times New Roman" w:hAnsi="Times New Roman"/>
+        </w:rPr>
+        <w:t xml:space="preserve">it</w:t>
+      </w:r>
+      <w:r>
+        <w:rPr>
+          <w:rFonts w:ascii="Times New Roman" w:hAnsi="Times New Roman"/>
+        </w:rPr>
+        <w:t xml:space="preserve"> </w:t>
+      </w:r>
+      <w:r>
+        <w:rPr>
+          <w:rFonts w:ascii="Times New Roman" w:hAnsi="Times New Roman"/>
+        </w:rPr>
+        <w:t xml:space="preserve">turns</w:t>
+      </w:r>
+      <w:r>
+        <w:rPr>
+          <w:rFonts w:ascii="Times New Roman" w:hAnsi="Times New Roman"/>
+        </w:rPr>
+        <w:t xml:space="preserve"> </w:t>
+      </w:r>
+      <w:r>
+        <w:rPr>
+          <w:rFonts w:ascii="Times New Roman" w:hAnsi="Times New Roman"/>
+        </w:rPr>
+        <w:t xml:space="preserve">a</w:t>
+      </w:r>
+      <w:r>
+        <w:rPr>
+          <w:rFonts w:ascii="Times New Roman" w:hAnsi="Times New Roman"/>
+        </w:rPr>
+        <w:t xml:space="preserve"> </w:t>
+      </w:r>
+      <w:r>
+        <w:rPr>
+          <w:rFonts w:ascii="Times New Roman" w:hAnsi="Times New Roman"/>
+        </w:rPr>
+        <w:t xml:space="preserve">raw</w:t>
+      </w:r>
+      <w:r>
+        <w:rPr>
+          <w:rFonts w:ascii="Times New Roman" w:hAnsi="Times New Roman"/>
+        </w:rPr>
+        <w:t xml:space="preserve"> </w:t>
+      </w:r>
+      <w:r>
+        <w:rPr>
+          <w:rFonts w:ascii="Times New Roman" w:hAnsi="Times New Roman"/>
+        </w:rPr>
+        <w:t xml:space="preserve">spreading</w:t>
+      </w:r>
+      <w:r>
+        <w:rPr>
+          <w:rFonts w:ascii="Times New Roman" w:hAnsi="Times New Roman"/>
+        </w:rPr>
+        <w:t xml:space="preserve"> </w:t>
+      </w:r>
+      <w:r>
+        <w:rPr>
+          <w:rFonts w:ascii="Times New Roman" w:hAnsi="Times New Roman"/>
+        </w:rPr>
+        <w:t xml:space="preserve">indistinguishable</w:t>
+      </w:r>
+      <w:r>
+        <w:rPr>
+          <w:rFonts w:ascii="Times New Roman" w:hAnsi="Times New Roman"/>
+        </w:rPr>
+        <w:t xml:space="preserve"> </w:t>
+      </w:r>
+      <w:r>
+        <w:rPr>
+          <w:rFonts w:ascii="Times New Roman" w:hAnsi="Times New Roman"/>
+        </w:rPr>
+        <w:t xml:space="preserve">from</w:t>
+      </w:r>
+      <w:r>
+        <w:rPr>
+          <w:rFonts w:ascii="Times New Roman" w:hAnsi="Times New Roman"/>
+        </w:rPr>
+        <w:t xml:space="preserve"> </w:t>
+      </w:r>
+      <w:r>
+        <w:rPr>
+          <w:rFonts w:ascii="Times New Roman" w:hAnsi="Times New Roman"/>
+        </w:rPr>
+        <w:t xml:space="preserve">a</w:t>
+      </w:r>
+      <w:r>
+        <w:rPr>
+          <w:rFonts w:ascii="Times New Roman" w:hAnsi="Times New Roman"/>
+        </w:rPr>
+        <w:t xml:space="preserve"> </w:t>
+      </w:r>
+      <w:r>
+        <w:rPr>
+          <w:rFonts w:ascii="Times New Roman" w:hAnsi="Times New Roman"/>
+        </w:rPr>
+        <w:t xml:space="preserve">classical</w:t>
+      </w:r>
+      <w:r>
+        <w:rPr>
+          <w:rFonts w:ascii="Times New Roman" w:hAnsi="Times New Roman"/>
+        </w:rPr>
+        <w:t xml:space="preserve"> </w:t>
+      </w:r>
+      <w:r>
+        <w:rPr>
+          <w:rFonts w:ascii="Times New Roman" w:hAnsi="Times New Roman"/>
+        </w:rPr>
+        <w:t xml:space="preserve">random</w:t>
+      </w:r>
+      <w:r>
+        <w:rPr>
+          <w:rFonts w:ascii="Times New Roman" w:hAnsi="Times New Roman"/>
+        </w:rPr>
+        <w:t xml:space="preserve"> </w:t>
+      </w:r>
+      <w:r>
+        <w:rPr>
+          <w:rFonts w:ascii="Times New Roman" w:hAnsi="Times New Roman"/>
+        </w:rPr>
+        <w:t xml:space="preserve">walk</w:t>
+      </w:r>
+      <w:r>
+        <w:rPr>
+          <w:rFonts w:ascii="Times New Roman" w:hAnsi="Times New Roman"/>
+        </w:rPr>
+        <w:t xml:space="preserve"> </w:t>
+      </w:r>
+      <w:r>
+        <w:rPr>
+          <w:rFonts w:ascii="Times New Roman" w:hAnsi="Times New Roman"/>
+        </w:rPr>
+        <w:t xml:space="preserve">(exponent</w:t>
+      </w:r>
+      <w:r>
+        <w:rPr>
+          <w:rFonts w:ascii="Times New Roman" w:hAnsi="Times New Roman"/>
+        </w:rPr>
+        <w:t xml:space="preserve"> </w:t>
+      </w:r>
+      <w:r>
+        <w:rPr>
+          <w:rFonts w:ascii="Times New Roman" w:hAnsi="Times New Roman"/>
+        </w:rPr>
+        <w:t xml:space="preserve">0.87)</w:t>
+      </w:r>
+      <w:r>
+        <w:rPr>
+          <w:rFonts w:ascii="Times New Roman" w:hAnsi="Times New Roman"/>
+        </w:rPr>
+        <w:t xml:space="preserve"> </w:t>
+      </w:r>
+      <w:r>
+        <w:rPr>
+          <w:rFonts w:ascii="Times New Roman" w:hAnsi="Times New Roman"/>
+        </w:rPr>
+        <w:t xml:space="preserve">into</w:t>
+      </w:r>
+      <w:r>
+        <w:rPr>
+          <w:rFonts w:ascii="Times New Roman" w:hAnsi="Times New Roman"/>
+        </w:rPr>
+        <w:t xml:space="preserve"> </w:t>
+      </w:r>
+      <w:r>
+        <w:rPr>
+          <w:rFonts w:ascii="Times New Roman" w:hAnsi="Times New Roman"/>
+        </w:rPr>
+        <w:t xml:space="preserve">ballistic</w:t>
+      </w:r>
+      <w:r>
+        <w:rPr>
+          <w:rFonts w:ascii="Times New Roman" w:hAnsi="Times New Roman"/>
+        </w:rPr>
+        <w:t xml:space="preserve"> </w:t>
+      </w:r>
+      <w:r>
+        <w:rPr>
+          <w:rFonts w:ascii="Times New Roman" w:hAnsi="Times New Roman"/>
+        </w:rPr>
+        <w:t xml:space="preserve">spreading</w:t>
+      </w:r>
+      <w:r>
+        <w:rPr>
+          <w:rFonts w:ascii="Times New Roman" w:hAnsi="Times New Roman"/>
+        </w:rPr>
+        <w:t xml:space="preserve"> </w:t>
+      </w:r>
+      <w:r>
+        <w:rPr>
+          <w:rFonts w:ascii="Times New Roman" w:hAnsi="Times New Roman"/>
+        </w:rPr>
+        <w:t xml:space="preserve">(1.84).</w:t>
+      </w:r>
+      <w:r>
+        <w:rPr>
+          <w:rFonts w:ascii="Times New Roman" w:hAnsi="Times New Roman"/>
+        </w:rPr>
+        <w:t xml:space="preserve"> </w:t>
+      </w:r>
+      <w:r>
+        <w:rPr>
+          <w:rFonts w:ascii="Times New Roman" w:hAnsi="Times New Roman"/>
+        </w:rPr>
         <w:t xml:space="preserve">Two</w:t>
       </w:r>
       <w:r>
@@ -4989,7 +5565,7 @@
         <w:rPr>
           <w:rFonts w:ascii="Times New Roman" w:hAnsi="Times New Roman"/>
         </w:rPr>
-        <w:t xml:space="preserve">§137–§146 refer to the research notes of the repository, where every number below is reproduced by a</w:t>
+        <w:t xml:space="preserve">§137–§147 refer to the research notes of the repository, where every number below is reproduced by a</w:t>
       </w:r>
       <w:r>
         <w:rPr>
@@ -5024,7 +5600,7 @@
       </w:r>
     </w:p>
     <w:bookmarkEnd w:id="20"/>
-    <w:bookmarkStart w:id="29" w:name="methods"/>
+    <w:bookmarkStart w:id="30" w:name="methods"/>
     <w:p>
       <w:pPr>
         <w:pStyle w:val="Heading1"/>
@@ -7660,7 +8236,696 @@
       </w:r>
     </w:p>
     <w:bookmarkEnd w:id="27"/>
-    <w:bookmarkStart w:id="28" w:name="test-circuits."/>
+    <w:bookmarkStart w:id="28" w:name="hamiltonian-simulation-and-quantum-walk."/>
+    <w:p>
+      <w:pPr>
+        <w:pStyle w:val="Heading4"/>
+      </w:pPr>
+      <w:r>
+        <w:rPr>
+          <w:rFonts w:ascii="Times New Roman" w:hAnsi="Times New Roman"/>
+        </w:rPr>
+        <w:t xml:space="preserve">Hamiltonian simulation and quantum walk.</w:t>
+      </w:r>
+    </w:p>
+    <w:p>
+      <w:pPr>
+        <w:pStyle w:val="FirstParagraph"/>
+      </w:pPr>
+      <w:r>
+        <w:rPr>
+          <w:rFonts w:ascii="Times New Roman" w:hAnsi="Times New Roman"/>
+        </w:rPr>
+        <w:t xml:space="preserve">The XY chain</w:t>
+      </w:r>
+      <w:r>
+        <w:rPr>
+          <w:rFonts w:ascii="Times New Roman" w:hAnsi="Times New Roman"/>
+        </w:rPr>
+        <w:t xml:space="preserve"> </w:t>
+      </w:r>
+      <m:oMath>
+        <m:r>
+          <m:t>H</m:t>
+        </m:r>
+        <m:r>
+          <m:rPr>
+            <m:sty m:val="p"/>
+          </m:rPr>
+          <m:t>=</m:t>
+        </m:r>
+        <m:r>
+          <m:t>J</m:t>
+        </m:r>
+        <m:nary>
+          <m:naryPr>
+            <m:chr m:val="∑"/>
+            <m:limLoc m:val="undOvr"/>
+            <m:subHide m:val="off"/>
+            <m:supHide m:val="on"/>
+          </m:naryPr>
+          <m:sub>
+            <m:r>
+              <m:t>k</m:t>
+            </m:r>
+          </m:sub>
+          <m:sup>
+            <m:r>
+              <m:t>​</m:t>
+            </m:r>
+          </m:sup>
+          <m:e>
+            <m:d>
+              <m:dPr>
+                <m:begChr m:val="("/>
+                <m:endChr m:val=")"/>
+                <m:sepChr m:val=""/>
+                <m:grow/>
+              </m:dPr>
+              <m:e>
+                <m:sSub>
+                  <m:e>
+                    <m:r>
+                      <m:t>X</m:t>
+                    </m:r>
+                  </m:e>
+                  <m:sub>
+                    <m:r>
+                      <m:t>k</m:t>
+                    </m:r>
+                  </m:sub>
+                </m:sSub>
+                <m:sSub>
+                  <m:e>
+                    <m:r>
+                      <m:t>X</m:t>
+                    </m:r>
+                  </m:e>
+                  <m:sub>
+                    <m:r>
+                      <m:t>k</m:t>
+                    </m:r>
+                    <m:r>
+                      <m:rPr>
+                        <m:sty m:val="p"/>
+                      </m:rPr>
+                      <m:t>+</m:t>
+                    </m:r>
+                    <m:r>
+                      <m:t>1</m:t>
+                    </m:r>
+                  </m:sub>
+                </m:sSub>
+                <m:r>
+                  <m:rPr>
+                    <m:sty m:val="p"/>
+                  </m:rPr>
+                  <m:t>+</m:t>
+                </m:r>
+                <m:sSub>
+                  <m:e>
+                    <m:r>
+                      <m:t>Y</m:t>
+                    </m:r>
+                  </m:e>
+                  <m:sub>
+                    <m:r>
+                      <m:t>k</m:t>
+                    </m:r>
+                  </m:sub>
+                </m:sSub>
+                <m:sSub>
+                  <m:e>
+                    <m:r>
+                      <m:t>Y</m:t>
+                    </m:r>
+                  </m:e>
+                  <m:sub>
+                    <m:r>
+                      <m:t>k</m:t>
+                    </m:r>
+                    <m:r>
+                      <m:rPr>
+                        <m:sty m:val="p"/>
+                      </m:rPr>
+                      <m:t>+</m:t>
+                    </m:r>
+                    <m:r>
+                      <m:t>1</m:t>
+                    </m:r>
+                  </m:sub>
+                </m:sSub>
+              </m:e>
+            </m:d>
+          </m:e>
+        </m:nary>
+        <m:r>
+          <m:rPr>
+            <m:sty m:val="p"/>
+          </m:rPr>
+          <m:t>/</m:t>
+        </m:r>
+        <m:r>
+          <m:t>2</m:t>
+        </m:r>
+        <m:r>
+          <m:rPr>
+            <m:sty m:val="p"/>
+          </m:rPr>
+          <m:t>+</m:t>
+        </m:r>
+        <m:nary>
+          <m:naryPr>
+            <m:chr m:val="∑"/>
+            <m:limLoc m:val="undOvr"/>
+            <m:subHide m:val="off"/>
+            <m:supHide m:val="on"/>
+          </m:naryPr>
+          <m:sub>
+            <m:r>
+              <m:t>k</m:t>
+            </m:r>
+          </m:sub>
+          <m:sup>
+            <m:r>
+              <m:t>​</m:t>
+            </m:r>
+          </m:sup>
+          <m:e>
+            <m:sSub>
+              <m:e>
+                <m:r>
+                  <m:t>h</m:t>
+                </m:r>
+              </m:e>
+              <m:sub>
+                <m:r>
+                  <m:t>k</m:t>
+                </m:r>
+              </m:sub>
+            </m:sSub>
+          </m:e>
+        </m:nary>
+        <m:sSub>
+          <m:e>
+            <m:r>
+              <m:t>Z</m:t>
+            </m:r>
+          </m:e>
+          <m:sub>
+            <m:r>
+              <m:t>k</m:t>
+            </m:r>
+          </m:sub>
+        </m:sSub>
+        <m:r>
+          <m:rPr>
+            <m:sty m:val="p"/>
+          </m:rPr>
+          <m:t>/</m:t>
+        </m:r>
+        <m:r>
+          <m:t>2</m:t>
+        </m:r>
+      </m:oMath>
+      <w:r>
+        <w:rPr>
+          <w:rFonts w:ascii="Times New Roman" w:hAnsi="Times New Roman"/>
+        </w:rPr>
+        <w:t xml:space="preserve"> </w:t>
+      </w:r>
+      <w:r>
+        <w:rPr>
+          <w:rFonts w:ascii="Times New Roman" w:hAnsi="Times New Roman"/>
+        </w:rPr>
+        <w:t xml:space="preserve">conserves the excitation number; with one excitation</w:t>
+      </w:r>
+      <w:r>
+        <w:rPr>
+          <w:rFonts w:ascii="Times New Roman" w:hAnsi="Times New Roman"/>
+        </w:rPr>
+        <w:t xml:space="preserve"> </w:t>
+      </w:r>
+      <w:r>
+        <w:rPr>
+          <w:rFonts w:ascii="Times New Roman" w:hAnsi="Times New Roman"/>
+        </w:rPr>
+        <w:t xml:space="preserve">it is a tight-binding model, a continuous-time quantum walk </w:t>
+      </w:r>
+      <w:r>
+        <w:rPr>
+          <w:rFonts w:ascii="Times New Roman" w:hAnsi="Times New Roman"/>
+        </w:rPr>
+        <w:t xml:space="preserve">(</w:t>
+      </w:r>
+      <w:hyperlink w:anchor="ref-kempe2003walks">
+        <w:r>
+          <w:rPr>
+            <w:rStyle w:val="Hyperlink"/>
+          </w:rPr>
+          <w:t xml:space="preserve">Kempe 2003</w:t>
+        </w:r>
+      </w:hyperlink>
+      <w:r>
+        <w:rPr>
+          <w:rFonts w:ascii="Times New Roman" w:hAnsi="Times New Roman"/>
+        </w:rPr>
+        <w:t xml:space="preserve">)</w:t>
+      </w:r>
+      <w:r>
+        <w:rPr>
+          <w:rFonts w:ascii="Times New Roman" w:hAnsi="Times New Roman"/>
+        </w:rPr>
+        <w:t xml:space="preserve"> </w:t>
+      </w:r>
+      <w:r>
+        <w:rPr>
+          <w:rFonts w:ascii="Times New Roman" w:hAnsi="Times New Roman"/>
+        </w:rPr>
+        <w:t xml:space="preserve">with hopping</w:t>
+      </w:r>
+      <w:r>
+        <w:rPr>
+          <w:rFonts w:ascii="Times New Roman" w:hAnsi="Times New Roman"/>
+        </w:rPr>
+        <w:t xml:space="preserve"> </w:t>
+      </w:r>
+      <m:oMath>
+        <m:r>
+          <m:t>J</m:t>
+        </m:r>
+      </m:oMath>
+      <w:r>
+        <w:rPr>
+          <w:rFonts w:ascii="Times New Roman" w:hAnsi="Times New Roman"/>
+        </w:rPr>
+        <w:t xml:space="preserve"> </w:t>
+      </w:r>
+      <w:r>
+        <w:rPr>
+          <w:rFonts w:ascii="Times New Roman" w:hAnsi="Times New Roman"/>
+        </w:rPr>
+        <w:t xml:space="preserve">and on-site</w:t>
+      </w:r>
+      <w:r>
+        <w:rPr>
+          <w:rFonts w:ascii="Times New Roman" w:hAnsi="Times New Roman"/>
+        </w:rPr>
+        <w:t xml:space="preserve"> </w:t>
+      </w:r>
+      <w:r>
+        <w:rPr>
+          <w:rFonts w:ascii="Times New Roman" w:hAnsi="Times New Roman"/>
+        </w:rPr>
+        <w:t xml:space="preserve">energies</w:t>
+      </w:r>
+      <w:r>
+        <w:rPr>
+          <w:rFonts w:ascii="Times New Roman" w:hAnsi="Times New Roman"/>
+        </w:rPr>
+        <w:t xml:space="preserve"> </w:t>
+      </w:r>
+      <m:oMath>
+        <m:r>
+          <m:rPr>
+            <m:sty m:val="p"/>
+          </m:rPr>
+          <m:t>−</m:t>
+        </m:r>
+        <m:sSub>
+          <m:e>
+            <m:r>
+              <m:t>h</m:t>
+            </m:r>
+          </m:e>
+          <m:sub>
+            <m:r>
+              <m:t>k</m:t>
+            </m:r>
+          </m:sub>
+        </m:sSub>
+      </m:oMath>
+      <w:r>
+        <w:rPr>
+          <w:rFonts w:ascii="Times New Roman" w:hAnsi="Times New Roman"/>
+        </w:rPr>
+        <w:t xml:space="preserve">.</w:t>
+      </w:r>
+      <w:r>
+        <w:rPr>
+          <w:rFonts w:ascii="Times New Roman" w:hAnsi="Times New Roman"/>
+        </w:rPr>
+        <w:t xml:space="preserve"> </w:t>
+      </w:r>
+      <w:r>
+        <w:rPr>
+          <w:rStyle w:val="VerbatimChar"/>
+          <w:rFonts w:ascii="Times New Roman" w:hAnsi="Times New Roman"/>
+        </w:rPr>
+        <w:t xml:space="preserve">xy_trotter</w:t>
+      </w:r>
+      <w:r>
+        <w:rPr>
+          <w:rFonts w:ascii="Times New Roman" w:hAnsi="Times New Roman"/>
+        </w:rPr>
+        <w:t xml:space="preserve"> </w:t>
+      </w:r>
+      <w:r>
+        <w:rPr>
+          <w:rFonts w:ascii="Times New Roman" w:hAnsi="Times New Roman"/>
+        </w:rPr>
+        <w:t xml:space="preserve">writes</w:t>
+      </w:r>
+      <w:r>
+        <w:rPr>
+          <w:rFonts w:ascii="Times New Roman" w:hAnsi="Times New Roman"/>
+        </w:rPr>
+        <w:t xml:space="preserve"> </w:t>
+      </w:r>
+      <m:oMath>
+        <m:r>
+          <m:t>r</m:t>
+        </m:r>
+      </m:oMath>
+      <w:r>
+        <w:rPr>
+          <w:rFonts w:ascii="Times New Roman" w:hAnsi="Times New Roman"/>
+        </w:rPr>
+        <w:t xml:space="preserve"> </w:t>
+      </w:r>
+      <w:r>
+        <w:rPr>
+          <w:rFonts w:ascii="Times New Roman" w:hAnsi="Times New Roman"/>
+        </w:rPr>
+        <w:t xml:space="preserve">first-order Trotter steps </w:t>
+      </w:r>
+      <w:r>
+        <w:rPr>
+          <w:rFonts w:ascii="Times New Roman" w:hAnsi="Times New Roman"/>
+        </w:rPr>
+        <w:t xml:space="preserve">(</w:t>
+      </w:r>
+      <w:hyperlink w:anchor="ref-lloyd1996simulators">
+        <w:r>
+          <w:rPr>
+            <w:rStyle w:val="Hyperlink"/>
+          </w:rPr>
+          <w:t xml:space="preserve">Lloyd 1996</w:t>
+        </w:r>
+      </w:hyperlink>
+      <w:r>
+        <w:rPr>
+          <w:rFonts w:ascii="Times New Roman" w:hAnsi="Times New Roman"/>
+        </w:rPr>
+        <w:t xml:space="preserve">)</w:t>
+      </w:r>
+      <w:r>
+        <w:rPr>
+          <w:rFonts w:ascii="Times New Roman" w:hAnsi="Times New Roman"/>
+        </w:rPr>
+        <w:t xml:space="preserve"> </w:t>
+      </w:r>
+      <w:r>
+        <w:rPr>
+          <w:rFonts w:ascii="Times New Roman" w:hAnsi="Times New Roman"/>
+        </w:rPr>
+        <w:t xml:space="preserve">(fields, odd bonds, even bonds) with RZ and XX+YY gates, all weight-preserving, so the filter applies;</w:t>
+      </w:r>
+      <w:r>
+        <w:rPr>
+          <w:rFonts w:ascii="Times New Roman" w:hAnsi="Times New Roman"/>
+        </w:rPr>
+        <w:t xml:space="preserve"> </w:t>
+      </w:r>
+      <w:r>
+        <w:rPr>
+          <w:rStyle w:val="VerbatimChar"/>
+          <w:rFonts w:ascii="Times New Roman" w:hAnsi="Times New Roman"/>
+        </w:rPr>
+        <w:t xml:space="preserve">xy_exact_occupations</w:t>
+      </w:r>
+      <w:r>
+        <w:rPr>
+          <w:rFonts w:ascii="Times New Roman" w:hAnsi="Times New Roman"/>
+        </w:rPr>
+        <w:t xml:space="preserve"> </w:t>
+      </w:r>
+      <w:r>
+        <w:rPr>
+          <w:rFonts w:ascii="Times New Roman" w:hAnsi="Times New Roman"/>
+        </w:rPr>
+        <w:t xml:space="preserve">gives the exact single-excitation dynamics. The spread of a walker started</w:t>
+      </w:r>
+      <w:r>
+        <w:rPr>
+          <w:rFonts w:ascii="Times New Roman" w:hAnsi="Times New Roman"/>
+        </w:rPr>
+        <w:t xml:space="preserve"> </w:t>
+      </w:r>
+      <w:r>
+        <w:rPr>
+          <w:rFonts w:ascii="Times New Roman" w:hAnsi="Times New Roman"/>
+        </w:rPr>
+        <w:t xml:space="preserve">on site</w:t>
+      </w:r>
+      <w:r>
+        <w:rPr>
+          <w:rFonts w:ascii="Times New Roman" w:hAnsi="Times New Roman"/>
+        </w:rPr>
+        <w:t xml:space="preserve"> </w:t>
+      </w:r>
+      <m:oMath>
+        <m:r>
+          <m:t>c</m:t>
+        </m:r>
+      </m:oMath>
+      <w:r>
+        <w:rPr>
+          <w:rFonts w:ascii="Times New Roman" w:hAnsi="Times New Roman"/>
+        </w:rPr>
+        <w:t xml:space="preserve"> </w:t>
+      </w:r>
+      <w:r>
+        <w:rPr>
+          <w:rFonts w:ascii="Times New Roman" w:hAnsi="Times New Roman"/>
+        </w:rPr>
+        <w:t xml:space="preserve">is</w:t>
+      </w:r>
+      <w:r>
+        <w:rPr>
+          <w:rFonts w:ascii="Times New Roman" w:hAnsi="Times New Roman"/>
+        </w:rPr>
+        <w:t xml:space="preserve"> </w:t>
+      </w:r>
+      <m:oMath>
+        <m:sSup>
+          <m:e>
+            <m:r>
+              <m:t>σ</m:t>
+            </m:r>
+          </m:e>
+          <m:sup>
+            <m:r>
+              <m:t>2</m:t>
+            </m:r>
+          </m:sup>
+        </m:sSup>
+        <m:r>
+          <m:rPr>
+            <m:sty m:val="p"/>
+          </m:rPr>
+          <m:t>=</m:t>
+        </m:r>
+        <m:nary>
+          <m:naryPr>
+            <m:chr m:val="∑"/>
+            <m:limLoc m:val="undOvr"/>
+            <m:subHide m:val="off"/>
+            <m:supHide m:val="on"/>
+          </m:naryPr>
+          <m:sub>
+            <m:r>
+              <m:t>k</m:t>
+            </m:r>
+          </m:sub>
+          <m:sup>
+            <m:r>
+              <m:t>​</m:t>
+            </m:r>
+          </m:sup>
+          <m:e>
+            <m:sSub>
+              <m:e>
+                <m:r>
+                  <m:t>P</m:t>
+                </m:r>
+              </m:e>
+              <m:sub>
+                <m:r>
+                  <m:t>k</m:t>
+                </m:r>
+              </m:sub>
+            </m:sSub>
+          </m:e>
+        </m:nary>
+        <m:sSup>
+          <m:e>
+            <m:d>
+              <m:dPr>
+                <m:begChr m:val="("/>
+                <m:endChr m:val=")"/>
+                <m:sepChr m:val=""/>
+                <m:grow/>
+              </m:dPr>
+              <m:e>
+                <m:r>
+                  <m:t>k</m:t>
+                </m:r>
+                <m:r>
+                  <m:rPr>
+                    <m:sty m:val="p"/>
+                  </m:rPr>
+                  <m:t>−</m:t>
+                </m:r>
+                <m:r>
+                  <m:t>c</m:t>
+                </m:r>
+              </m:e>
+            </m:d>
+          </m:e>
+          <m:sup>
+            <m:r>
+              <m:t>2</m:t>
+            </m:r>
+          </m:sup>
+        </m:sSup>
+      </m:oMath>
+      <w:r>
+        <w:rPr>
+          <w:rFonts w:ascii="Times New Roman" w:hAnsi="Times New Roman"/>
+        </w:rPr>
+        <w:t xml:space="preserve"> </w:t>
+      </w:r>
+      <w:r>
+        <w:rPr>
+          <w:rFonts w:ascii="Times New Roman" w:hAnsi="Times New Roman"/>
+        </w:rPr>
+        <w:t xml:space="preserve">with</w:t>
+      </w:r>
+      <w:r>
+        <w:rPr>
+          <w:rFonts w:ascii="Times New Roman" w:hAnsi="Times New Roman"/>
+        </w:rPr>
+        <w:t xml:space="preserve"> </w:t>
+      </w:r>
+      <m:oMath>
+        <m:sSub>
+          <m:e>
+            <m:r>
+              <m:t>P</m:t>
+            </m:r>
+          </m:e>
+          <m:sub>
+            <m:r>
+              <m:t>k</m:t>
+            </m:r>
+          </m:sub>
+        </m:sSub>
+      </m:oMath>
+      <w:r>
+        <w:rPr>
+          <w:rFonts w:ascii="Times New Roman" w:hAnsi="Times New Roman"/>
+        </w:rPr>
+        <w:t xml:space="preserve"> </w:t>
+      </w:r>
+      <w:r>
+        <w:rPr>
+          <w:rFonts w:ascii="Times New Roman" w:hAnsi="Times New Roman"/>
+        </w:rPr>
+        <w:t xml:space="preserve">the normalized occupations; ballistic spreading gives</w:t>
+      </w:r>
+      <w:r>
+        <w:rPr>
+          <w:rFonts w:ascii="Times New Roman" w:hAnsi="Times New Roman"/>
+        </w:rPr>
+        <w:t xml:space="preserve"> </w:t>
+      </w:r>
+      <m:oMath>
+        <m:sSup>
+          <m:e>
+            <m:r>
+              <m:t>σ</m:t>
+            </m:r>
+          </m:e>
+          <m:sup>
+            <m:r>
+              <m:t>2</m:t>
+            </m:r>
+          </m:sup>
+        </m:sSup>
+        <m:r>
+          <m:rPr>
+            <m:sty m:val="p"/>
+          </m:rPr>
+          <m:t>∝</m:t>
+        </m:r>
+        <m:sSup>
+          <m:e>
+            <m:r>
+              <m:t>t</m:t>
+            </m:r>
+          </m:e>
+          <m:sup>
+            <m:r>
+              <m:t>2</m:t>
+            </m:r>
+          </m:sup>
+        </m:sSup>
+      </m:oMath>
+      <w:r>
+        <w:rPr>
+          <w:rFonts w:ascii="Times New Roman" w:hAnsi="Times New Roman"/>
+        </w:rPr>
+        <w:t xml:space="preserve">, a classical random walk</w:t>
+      </w:r>
+      <w:r>
+        <w:rPr>
+          <w:rFonts w:ascii="Times New Roman" w:hAnsi="Times New Roman"/>
+        </w:rPr>
+        <w:t xml:space="preserve"> </w:t>
+      </w:r>
+      <m:oMath>
+        <m:sSup>
+          <m:e>
+            <m:r>
+              <m:t>σ</m:t>
+            </m:r>
+          </m:e>
+          <m:sup>
+            <m:r>
+              <m:t>2</m:t>
+            </m:r>
+          </m:sup>
+        </m:sSup>
+        <m:r>
+          <m:rPr>
+            <m:sty m:val="p"/>
+          </m:rPr>
+          <m:t>∝</m:t>
+        </m:r>
+        <m:r>
+          <m:t>t</m:t>
+        </m:r>
+      </m:oMath>
+      <w:r>
+        <w:rPr>
+          <w:rFonts w:ascii="Times New Roman" w:hAnsi="Times New Roman"/>
+        </w:rPr>
+        <w:t xml:space="preserve">.</w:t>
+      </w:r>
+    </w:p>
+    <w:bookmarkEnd w:id="28"/>
+    <w:bookmarkStart w:id="29" w:name="test-circuits."/>
     <w:p>
       <w:pPr>
         <w:pStyle w:val="Heading4"/>
@@ -7823,9 +9088,9 @@
         <w:t xml:space="preserve">over qubits and circuits. Transpilation uses optimization level 1 and seed 137.</w:t>
       </w:r>
     </w:p>
-    <w:bookmarkEnd w:id="28"/>
     <w:bookmarkEnd w:id="29"/>
-    <w:bookmarkStart w:id="41" w:name="results"/>
+    <w:bookmarkEnd w:id="30"/>
+    <w:bookmarkStart w:id="46" w:name="results"/>
     <w:p>
       <w:pPr>
         <w:pStyle w:val="Heading1"/>
@@ -7837,7 +9102,7 @@
         <w:t xml:space="preserve">Results</w:t>
       </w:r>
     </w:p>
-    <w:bookmarkStart w:id="31" w:name="read-out-on-three-devices-137-142"/>
+    <w:bookmarkStart w:id="32" w:name="read-out-on-three-devices-137-142"/>
     <w:p>
       <w:pPr>
         <w:pStyle w:val="Heading2"/>
@@ -7849,7 +9114,7 @@
         <w:t xml:space="preserve">Read-out on three devices (§137, §142)</w:t>
       </w:r>
     </w:p>
-    <w:bookmarkStart w:id="30" w:name="tab:three"/>
+    <w:bookmarkStart w:id="31" w:name="tab:three"/>
     <w:p>
       <w:pPr>
         <w:pStyle w:val="TableCaption"/>
@@ -8275,7 +9540,7 @@
         </w:tc>
       </w:tr>
     </w:tbl>
-    <w:bookmarkEnd w:id="30"/>
+    <w:bookmarkEnd w:id="31"/>
     <w:p>
       <w:pPr>
         <w:pStyle w:val="BodyText"/>
@@ -8381,8 +9646,8 @@
         <w:t xml:space="preserve">combination was filter + ZNE on two devices and filter + read-out on Torino (so both of those predictions failed).</w:t>
       </w:r>
     </w:p>
-    <w:bookmarkEnd w:id="31"/>
-    <w:bookmarkStart w:id="35" w:name="twenty-devices-144"/>
+    <w:bookmarkEnd w:id="32"/>
+    <w:bookmarkStart w:id="36" w:name="twenty-devices-144"/>
     <w:p>
       <w:pPr>
         <w:pStyle w:val="Heading2"/>
@@ -8407,18 +9672,18 @@
           <wp:inline>
             <wp:extent cx="4800600" cy="4336025"/>
             <wp:effectExtent b="0" l="0" r="0" t="0"/>
-            <wp:docPr descr="" title="" id="33" name="Picture"/>
+            <wp:docPr descr="" title="" id="34" name="Picture"/>
             <a:graphic>
               <a:graphicData uri="http://schemas.openxmlformats.org/drawingml/2006/picture">
                 <pic:pic>
                   <pic:nvPicPr>
-                    <pic:cNvPr descr="fig_fleet.png" id="34" name="Picture"/>
+                    <pic:cNvPr descr="fig_fleet.png" id="35" name="Picture"/>
                     <pic:cNvPicPr>
                       <a:picLocks noChangeArrowheads="1" noChangeAspect="1"/>
                     </pic:cNvPicPr>
                   </pic:nvPicPr>
                   <pic:blipFill>
-                    <a:blip r:embed="rId32"/>
+                    <a:blip r:embed="rId33"/>
                     <a:stretch>
                       <a:fillRect/>
                     </a:stretch>
@@ -8663,8 +9928,8 @@
         <w:t xml:space="preserve">filtered error from 0.098 to 0.021 (exploratory).</w:t>
       </w:r>
     </w:p>
-    <w:bookmarkEnd w:id="35"/>
-    <w:bookmarkStart w:id="36" w:name="X65a55fb3e65eb3767af4294710aef69a3875982"/>
+    <w:bookmarkEnd w:id="36"/>
+    <w:bookmarkStart w:id="37" w:name="X65a55fb3e65eb3767af4294710aef69a3875982"/>
     <w:p>
       <w:pPr>
         <w:pStyle w:val="Heading2"/>
@@ -8822,8 +10087,8 @@
         <w:t xml:space="preserve">three predictions passed).</w:t>
       </w:r>
     </w:p>
-    <w:bookmarkEnd w:id="36"/>
-    <w:bookmarkStart w:id="37" w:name="shot-planning-143"/>
+    <w:bookmarkEnd w:id="37"/>
+    <w:bookmarkStart w:id="38" w:name="shot-planning-143"/>
     <w:p>
       <w:pPr>
         <w:pStyle w:val="Heading2"/>
@@ -9004,8 +10269,8 @@
         <w:t xml:space="preserve">; the plan is set by the worst qubit and still met the target.</w:t>
       </w:r>
     </w:p>
-    <w:bookmarkEnd w:id="37"/>
-    <w:bookmarkStart w:id="39" w:name="the-qnn-139141"/>
+    <w:bookmarkEnd w:id="38"/>
+    <w:bookmarkStart w:id="40" w:name="the-qnn-139141"/>
     <w:p>
       <w:pPr>
         <w:pStyle w:val="Heading2"/>
@@ -9017,7 +10282,7 @@
         <w:t xml:space="preserve">The QNN (§139–§141)</w:t>
       </w:r>
     </w:p>
-    <w:bookmarkStart w:id="38" w:name="tab:qnn"/>
+    <w:bookmarkStart w:id="39" w:name="tab:qnn"/>
     <w:p>
       <w:pPr>
         <w:pStyle w:val="TableCaption"/>
@@ -9357,7 +10622,7 @@
         </w:tc>
       </w:tr>
     </w:tbl>
-    <w:bookmarkEnd w:id="38"/>
+    <w:bookmarkEnd w:id="39"/>
     <w:p>
       <w:pPr>
         <w:pStyle w:val="BodyText"/>
@@ -9549,8 +10814,8 @@
         <w:t xml:space="preserve">issue was reported upstream.</w:t>
       </w:r>
     </w:p>
-    <w:bookmarkEnd w:id="39"/>
-    <w:bookmarkStart w:id="40" w:name="a-pca-spectrum-146"/>
+    <w:bookmarkEnd w:id="40"/>
+    <w:bookmarkStart w:id="41" w:name="a-pca-spectrum-146"/>
     <w:p>
       <w:pPr>
         <w:pStyle w:val="Heading2"/>
@@ -10073,9 +11338,868 @@
         <w:t xml:space="preserve">experiment makes no claim on it.</w:t>
       </w:r>
     </w:p>
-    <w:bookmarkEnd w:id="40"/>
     <w:bookmarkEnd w:id="41"/>
-    <w:bookmarkStart w:id="42" w:name="discussion"/>
+    <w:bookmarkStart w:id="45" w:name="X03c72f5e8247cfdd082e31dcd37cd01bcafba1a"/>
+    <w:p>
+      <w:pPr>
+        <w:pStyle w:val="Heading2"/>
+      </w:pPr>
+      <w:r>
+        <w:rPr>
+          <w:rFonts w:ascii="Times New Roman" w:hAnsi="Times New Roman"/>
+        </w:rPr>
+        <w:t xml:space="preserve">Hamiltonian simulation and a quantum walk (§147)</w:t>
+      </w:r>
+    </w:p>
+    <w:p>
+      <w:pPr>
+        <w:pStyle w:val="CaptionedFigure"/>
+      </w:pPr>
+      <w:r>
+        <w:rPr>
+          <w:rFonts w:ascii="Times New Roman" w:hAnsi="Times New Roman"/>
+          <w:sz w:val="18"/>
+        </w:rPr>
+        <w:drawing>
+          <wp:inline>
+            <wp:extent cx="4800600" cy="1878495"/>
+            <wp:effectExtent b="0" l="0" r="0" t="0"/>
+            <wp:docPr descr="" title="" id="43" name="Picture"/>
+            <a:graphic>
+              <a:graphicData uri="http://schemas.openxmlformats.org/drawingml/2006/picture">
+                <pic:pic>
+                  <pic:nvPicPr>
+                    <pic:cNvPr descr="fig_trotter.png" id="44" name="Picture"/>
+                    <pic:cNvPicPr>
+                      <a:picLocks noChangeArrowheads="1" noChangeAspect="1"/>
+                    </pic:cNvPicPr>
+                  </pic:nvPicPr>
+                  <pic:blipFill>
+                    <a:blip r:embed="rId42"/>
+                    <a:stretch>
+                      <a:fillRect/>
+                    </a:stretch>
+                  </pic:blipFill>
+                  <pic:spPr bwMode="auto">
+                    <a:xfrm>
+                      <a:off x="0" y="0"/>
+                      <a:ext cx="4800600" cy="1878495"/>
+                    </a:xfrm>
+                    <a:prstGeom prst="rect">
+                      <a:avLst/>
+                    </a:prstGeom>
+                    <a:noFill/>
+                    <a:ln w="9525">
+                      <a:noFill/>
+                      <a:headEnd/>
+                      <a:tailEnd/>
+                    </a:ln>
+                  </pic:spPr>
+                </pic:pic>
+              </a:graphicData>
+            </a:graphic>
+          </wp:inline>
+        </w:drawing>
+      </w:r>
+    </w:p>
+    <w:p>
+      <w:pPr>
+        <w:pStyle w:val="ImageCaption"/>
+      </w:pPr>
+      <w:r>
+        <w:rPr>
+          <w:rFonts w:ascii="Times New Roman" w:hAnsi="Times New Roman"/>
+          <w:sz w:val="18"/>
+        </w:rPr>
+        <w:t xml:space="preserve">(a) Error of the simulated occupations at</w:t>
+      </w:r>
+      <w:r>
+        <w:rPr>
+          <w:rFonts w:ascii="Times New Roman" w:hAnsi="Times New Roman"/>
+          <w:sz w:val="18"/>
+        </w:rPr>
+        <w:t xml:space="preserve"> </w:t>
+      </w:r>
+      <m:oMath>
+        <m:r>
+          <m:t>T</m:t>
+        </m:r>
+        <m:r>
+          <m:rPr>
+            <m:sty m:val="p"/>
+          </m:rPr>
+          <m:t>=</m:t>
+        </m:r>
+        <m:r>
+          <m:t>3</m:t>
+        </m:r>
+      </m:oMath>
+      <w:r>
+        <w:rPr>
+          <w:rFonts w:ascii="Times New Roman" w:hAnsi="Times New Roman"/>
+          <w:sz w:val="18"/>
+        </w:rPr>
+        <w:t xml:space="preserve"> </w:t>
+      </w:r>
+      <w:r>
+        <w:rPr>
+          <w:rFonts w:ascii="Times New Roman" w:hAnsi="Times New Roman"/>
+          <w:sz w:val="18"/>
+        </w:rPr>
+        <w:t xml:space="preserve">against the number of Trotter steps (five qubits,</w:t>
+      </w:r>
+      <w:r>
+        <w:rPr>
+          <w:rFonts w:ascii="Times New Roman" w:hAnsi="Times New Roman"/>
+          <w:sz w:val="18"/>
+        </w:rPr>
+        <w:t xml:space="preserve"> </w:t>
+      </w:r>
+      <w:r>
+        <w:rPr>
+          <w:rFonts w:ascii="Times New Roman" w:hAnsi="Times New Roman"/>
+          <w:sz w:val="18"/>
+        </w:rPr>
+        <w:t xml:space="preserve">random fields): more steps lower the Trotter error (dashed) and add noise; the filter keeps the error falling</w:t>
+      </w:r>
+      <w:r>
+        <w:rPr>
+          <w:rFonts w:ascii="Times New Roman" w:hAnsi="Times New Roman"/>
+          <w:sz w:val="18"/>
+        </w:rPr>
+        <w:t xml:space="preserve"> </w:t>
+      </w:r>
+      <w:r>
+        <w:rPr>
+          <w:rFonts w:ascii="Times New Roman" w:hAnsi="Times New Roman"/>
+          <w:sz w:val="18"/>
+        </w:rPr>
+        <w:t xml:space="preserve">to deeper circuits. (b) Spread of a quantum walk on seven qubits: raw data follow a classical random walk;</w:t>
+      </w:r>
+      <w:r>
+        <w:rPr>
+          <w:rFonts w:ascii="Times New Roman" w:hAnsi="Times New Roman"/>
+          <w:sz w:val="18"/>
+        </w:rPr>
+        <w:t xml:space="preserve"> </w:t>
+      </w:r>
+      <w:r>
+        <w:rPr>
+          <w:rFonts w:ascii="Times New Roman" w:hAnsi="Times New Roman"/>
+          <w:sz w:val="18"/>
+        </w:rPr>
+        <w:t xml:space="preserve">filtered data follow the exact quantum walk. Medians over twenty-one device noise models, 4000 shots.</w:t>
+      </w:r>
+    </w:p>
+    <w:p>
+      <w:pPr>
+        <w:pStyle w:val="BodyText"/>
+      </w:pPr>
+      <w:r>
+        <w:rPr>
+          <w:rFonts w:ascii="Times New Roman" w:hAnsi="Times New Roman"/>
+        </w:rPr>
+        <w:t xml:space="preserve">Part A:</w:t>
+      </w:r>
+      <w:r>
+        <w:rPr>
+          <w:rFonts w:ascii="Times New Roman" w:hAnsi="Times New Roman"/>
+        </w:rPr>
+        <w:t xml:space="preserve"> </w:t>
+      </w:r>
+      <m:oMath>
+        <m:r>
+          <m:t>n</m:t>
+        </m:r>
+        <m:r>
+          <m:rPr>
+            <m:sty m:val="p"/>
+          </m:rPr>
+          <m:t>=</m:t>
+        </m:r>
+        <m:r>
+          <m:t>5</m:t>
+        </m:r>
+      </m:oMath>
+      <w:r>
+        <w:rPr>
+          <w:rFonts w:ascii="Times New Roman" w:hAnsi="Times New Roman"/>
+        </w:rPr>
+        <w:t xml:space="preserve">,</w:t>
+      </w:r>
+      <w:r>
+        <w:rPr>
+          <w:rFonts w:ascii="Times New Roman" w:hAnsi="Times New Roman"/>
+        </w:rPr>
+        <w:t xml:space="preserve"> </w:t>
+      </w:r>
+      <m:oMath>
+        <m:r>
+          <m:t>J</m:t>
+        </m:r>
+        <m:r>
+          <m:rPr>
+            <m:sty m:val="p"/>
+          </m:rPr>
+          <m:t>=</m:t>
+        </m:r>
+        <m:r>
+          <m:t>1</m:t>
+        </m:r>
+      </m:oMath>
+      <w:r>
+        <w:rPr>
+          <w:rFonts w:ascii="Times New Roman" w:hAnsi="Times New Roman"/>
+        </w:rPr>
+        <w:t xml:space="preserve">,</w:t>
+      </w:r>
+      <w:r>
+        <w:rPr>
+          <w:rFonts w:ascii="Times New Roman" w:hAnsi="Times New Roman"/>
+        </w:rPr>
+        <w:t xml:space="preserve"> </w:t>
+      </w:r>
+      <m:oMath>
+        <m:sSub>
+          <m:e>
+            <m:r>
+              <m:t>h</m:t>
+            </m:r>
+          </m:e>
+          <m:sub>
+            <m:r>
+              <m:t>k</m:t>
+            </m:r>
+          </m:sub>
+        </m:sSub>
+      </m:oMath>
+      <w:r>
+        <w:rPr>
+          <w:rFonts w:ascii="Times New Roman" w:hAnsi="Times New Roman"/>
+        </w:rPr>
+        <w:t xml:space="preserve"> </w:t>
+      </w:r>
+      <w:r>
+        <w:rPr>
+          <w:rFonts w:ascii="Times New Roman" w:hAnsi="Times New Roman"/>
+        </w:rPr>
+        <w:t xml:space="preserve">uniform in</w:t>
+      </w:r>
+      <w:r>
+        <w:rPr>
+          <w:rFonts w:ascii="Times New Roman" w:hAnsi="Times New Roman"/>
+        </w:rPr>
+        <w:t xml:space="preserve"> </w:t>
+      </w:r>
+      <m:oMath>
+        <m:d>
+          <m:dPr>
+            <m:begChr m:val="["/>
+            <m:endChr m:val="]"/>
+            <m:sepChr m:val=""/>
+            <m:grow/>
+          </m:dPr>
+          <m:e>
+            <m:r>
+              <m:rPr>
+                <m:sty m:val="p"/>
+              </m:rPr>
+              <m:t>−</m:t>
+            </m:r>
+            <m:r>
+              <m:t>1</m:t>
+            </m:r>
+            <m:r>
+              <m:rPr>
+                <m:sty m:val="p"/>
+              </m:rPr>
+              <m:t>,</m:t>
+            </m:r>
+            <m:r>
+              <m:t>1</m:t>
+            </m:r>
+          </m:e>
+        </m:d>
+      </m:oMath>
+      <w:r>
+        <w:rPr>
+          <w:rFonts w:ascii="Times New Roman" w:hAnsi="Times New Roman"/>
+        </w:rPr>
+        <w:t xml:space="preserve">,</w:t>
+      </w:r>
+      <w:r>
+        <w:rPr>
+          <w:rFonts w:ascii="Times New Roman" w:hAnsi="Times New Roman"/>
+        </w:rPr>
+        <w:t xml:space="preserve"> </w:t>
+      </w:r>
+      <m:oMath>
+        <m:r>
+          <m:t>T</m:t>
+        </m:r>
+        <m:r>
+          <m:rPr>
+            <m:sty m:val="p"/>
+          </m:rPr>
+          <m:t>=</m:t>
+        </m:r>
+        <m:r>
+          <m:t>3</m:t>
+        </m:r>
+      </m:oMath>
+      <w:r>
+        <w:rPr>
+          <w:rFonts w:ascii="Times New Roman" w:hAnsi="Times New Roman"/>
+        </w:rPr>
+        <w:t xml:space="preserve">,</w:t>
+      </w:r>
+      <w:r>
+        <w:rPr>
+          <w:rFonts w:ascii="Times New Roman" w:hAnsi="Times New Roman"/>
+        </w:rPr>
+        <w:t xml:space="preserve"> </w:t>
+      </w:r>
+      <m:oMath>
+        <m:r>
+          <m:t>r</m:t>
+        </m:r>
+        <m:r>
+          <m:rPr>
+            <m:sty m:val="p"/>
+          </m:rPr>
+          <m:t>∈</m:t>
+        </m:r>
+        <m:r>
+          <m:rPr>
+            <m:sty m:val="p"/>
+          </m:rPr>
+          <m:t>{</m:t>
+        </m:r>
+        <m:r>
+          <m:t>1</m:t>
+        </m:r>
+        <m:r>
+          <m:rPr>
+            <m:sty m:val="p"/>
+          </m:rPr>
+          <m:t>,</m:t>
+        </m:r>
+        <m:r>
+          <m:t>2</m:t>
+        </m:r>
+        <m:r>
+          <m:rPr>
+            <m:sty m:val="p"/>
+          </m:rPr>
+          <m:t>,</m:t>
+        </m:r>
+        <m:r>
+          <m:t>3</m:t>
+        </m:r>
+        <m:r>
+          <m:rPr>
+            <m:sty m:val="p"/>
+          </m:rPr>
+          <m:t>,</m:t>
+        </m:r>
+        <m:r>
+          <m:t>4</m:t>
+        </m:r>
+        <m:r>
+          <m:rPr>
+            <m:sty m:val="p"/>
+          </m:rPr>
+          <m:t>,</m:t>
+        </m:r>
+        <m:r>
+          <m:t>6</m:t>
+        </m:r>
+        <m:r>
+          <m:rPr>
+            <m:sty m:val="p"/>
+          </m:rPr>
+          <m:t>,</m:t>
+        </m:r>
+        <m:r>
+          <m:t>8</m:t>
+        </m:r>
+        <m:r>
+          <m:rPr>
+            <m:sty m:val="p"/>
+          </m:rPr>
+          <m:t>,</m:t>
+        </m:r>
+        <m:r>
+          <m:t>12</m:t>
+        </m:r>
+        <m:r>
+          <m:rPr>
+            <m:sty m:val="p"/>
+          </m:rPr>
+          <m:t>}</m:t>
+        </m:r>
+      </m:oMath>
+      <w:r>
+        <w:rPr>
+          <w:rFonts w:ascii="Times New Roman" w:hAnsi="Times New Roman"/>
+        </w:rPr>
+        <w:t xml:space="preserve"> </w:t>
+      </w:r>
+      <w:r>
+        <w:rPr>
+          <w:rFonts w:ascii="Times New Roman" w:hAnsi="Times New Roman"/>
+        </w:rPr>
+        <w:t xml:space="preserve">(up to 96 native two-qubit</w:t>
+      </w:r>
+      <w:r>
+        <w:rPr>
+          <w:rFonts w:ascii="Times New Roman" w:hAnsi="Times New Roman"/>
+        </w:rPr>
+        <w:t xml:space="preserve"> </w:t>
+      </w:r>
+      <w:r>
+        <w:rPr>
+          <w:rFonts w:ascii="Times New Roman" w:hAnsi="Times New Roman"/>
+        </w:rPr>
+        <w:t xml:space="preserve">gates). Without noise the Trotter error falls from 0.38 to 0.033; on a device it has a minimum at some</w:t>
+      </w:r>
+      <w:r>
+        <w:rPr>
+          <w:rFonts w:ascii="Times New Roman" w:hAnsi="Times New Roman"/>
+        </w:rPr>
+        <w:t xml:space="preserve"> </w:t>
+      </w:r>
+      <m:oMath>
+        <m:sSup>
+          <m:e>
+            <m:r>
+              <m:t>r</m:t>
+            </m:r>
+          </m:e>
+          <m:sup>
+            <m:r>
+              <m:rPr>
+                <m:sty m:val="p"/>
+              </m:rPr>
+              <m:t>*</m:t>
+            </m:r>
+          </m:sup>
+        </m:sSup>
+      </m:oMath>
+      <w:r>
+        <w:rPr>
+          <w:rFonts w:ascii="Times New Roman" w:hAnsi="Times New Roman"/>
+        </w:rPr>
+        <w:t xml:space="preserve">.</w:t>
+      </w:r>
+      <w:r>
+        <w:rPr>
+          <w:rFonts w:ascii="Times New Roman" w:hAnsi="Times New Roman"/>
+        </w:rPr>
+        <w:t xml:space="preserve"> </w:t>
+      </w:r>
+      <w:r>
+        <w:rPr>
+          <w:rFonts w:ascii="Times New Roman" w:hAnsi="Times New Roman"/>
+        </w:rPr>
+        <w:t xml:space="preserve">All three predictions passed (Figure </w:t>
+      </w:r>
+      <w:hyperlink w:anchor="fig:trotter">
+        <w:r>
+          <w:rPr>
+            <w:rStyle w:val="Hyperlink"/>
+          </w:rPr>
+          <w:t xml:space="preserve">2</w:t>
+        </w:r>
+      </w:hyperlink>
+      <w:r>
+        <w:rPr>
+          <w:rFonts w:ascii="Times New Roman" w:hAnsi="Times New Roman"/>
+        </w:rPr>
+        <w:t xml:space="preserve">a): with filter + read-out the best error is lower than</w:t>
+      </w:r>
+      <w:r>
+        <w:rPr>
+          <w:rFonts w:ascii="Times New Roman" w:hAnsi="Times New Roman"/>
+        </w:rPr>
+        <w:t xml:space="preserve"> </w:t>
+      </w:r>
+      <w:r>
+        <w:rPr>
+          <w:rFonts w:ascii="Times New Roman" w:hAnsi="Times New Roman"/>
+        </w:rPr>
+        <w:t xml:space="preserve">the best raw error on all twenty-one devices (1.6–2.8</w:t>
+      </w:r>
+      <m:oMath>
+        <m:r>
+          <m:rPr>
+            <m:sty m:val="p"/>
+          </m:rPr>
+          <m:t>×</m:t>
+        </m:r>
+      </m:oMath>
+      <w:r>
+        <w:rPr>
+          <w:rFonts w:ascii="Times New Roman" w:hAnsi="Times New Roman"/>
+        </w:rPr>
+        <w:t xml:space="preserve">, median 2.0</w:t>
+      </w:r>
+      <m:oMath>
+        <m:r>
+          <m:rPr>
+            <m:sty m:val="p"/>
+          </m:rPr>
+          <m:t>×</m:t>
+        </m:r>
+      </m:oMath>
+      <w:r>
+        <w:rPr>
+          <w:rFonts w:ascii="Times New Roman" w:hAnsi="Times New Roman"/>
+        </w:rPr>
+        <w:t xml:space="preserve">),</w:t>
+      </w:r>
+      <w:r>
+        <w:rPr>
+          <w:rFonts w:ascii="Times New Roman" w:hAnsi="Times New Roman"/>
+        </w:rPr>
+        <w:t xml:space="preserve"> </w:t>
+      </w:r>
+      <m:oMath>
+        <m:sSup>
+          <m:e>
+            <m:r>
+              <m:t>r</m:t>
+            </m:r>
+          </m:e>
+          <m:sup>
+            <m:r>
+              <m:rPr>
+                <m:sty m:val="p"/>
+              </m:rPr>
+              <m:t>*</m:t>
+            </m:r>
+          </m:sup>
+        </m:sSup>
+      </m:oMath>
+      <w:r>
+        <w:rPr>
+          <w:rFonts w:ascii="Times New Roman" w:hAnsi="Times New Roman"/>
+        </w:rPr>
+        <w:t xml:space="preserve"> </w:t>
+      </w:r>
+      <w:r>
+        <w:rPr>
+          <w:rFonts w:ascii="Times New Roman" w:hAnsi="Times New Roman"/>
+        </w:rPr>
+        <w:t xml:space="preserve">is never smaller,</w:t>
+      </w:r>
+      <w:r>
+        <w:rPr>
+          <w:rFonts w:ascii="Times New Roman" w:hAnsi="Times New Roman"/>
+        </w:rPr>
+        <w:t xml:space="preserve"> </w:t>
+      </w:r>
+      <w:r>
+        <w:rPr>
+          <w:rFonts w:ascii="Times New Roman" w:hAnsi="Times New Roman"/>
+        </w:rPr>
+        <w:t xml:space="preserve">and it is larger on 16 of 21 (median 12 against 8). On eleven devices</w:t>
+      </w:r>
+      <w:r>
+        <w:rPr>
+          <w:rFonts w:ascii="Times New Roman" w:hAnsi="Times New Roman"/>
+        </w:rPr>
+        <w:t xml:space="preserve"> </w:t>
+      </w:r>
+      <m:oMath>
+        <m:sSup>
+          <m:e>
+            <m:r>
+              <m:t>r</m:t>
+            </m:r>
+          </m:e>
+          <m:sup>
+            <m:r>
+              <m:rPr>
+                <m:sty m:val="p"/>
+              </m:rPr>
+              <m:t>*</m:t>
+            </m:r>
+          </m:sup>
+        </m:sSup>
+        <m:r>
+          <m:rPr>
+            <m:sty m:val="p"/>
+          </m:rPr>
+          <m:t>=</m:t>
+        </m:r>
+        <m:r>
+          <m:t>12</m:t>
+        </m:r>
+      </m:oMath>
+      <w:r>
+        <w:rPr>
+          <w:rFonts w:ascii="Times New Roman" w:hAnsi="Times New Roman"/>
+        </w:rPr>
+        <w:t xml:space="preserve">, the deepest tested, so the</w:t>
+      </w:r>
+      <w:r>
+        <w:rPr>
+          <w:rFonts w:ascii="Times New Roman" w:hAnsi="Times New Roman"/>
+        </w:rPr>
+        <w:t xml:space="preserve"> </w:t>
+      </w:r>
+      <w:r>
+        <w:rPr>
+          <w:rFonts w:ascii="Times New Roman" w:hAnsi="Times New Roman"/>
+        </w:rPr>
+        <w:t xml:space="preserve">shift is a lower bound. Part B:</w:t>
+      </w:r>
+      <w:r>
+        <w:rPr>
+          <w:rFonts w:ascii="Times New Roman" w:hAnsi="Times New Roman"/>
+        </w:rPr>
+        <w:t xml:space="preserve"> </w:t>
+      </w:r>
+      <m:oMath>
+        <m:r>
+          <m:t>h</m:t>
+        </m:r>
+        <m:r>
+          <m:rPr>
+            <m:sty m:val="p"/>
+          </m:rPr>
+          <m:t>=</m:t>
+        </m:r>
+        <m:r>
+          <m:t>0</m:t>
+        </m:r>
+      </m:oMath>
+      <w:r>
+        <w:rPr>
+          <w:rFonts w:ascii="Times New Roman" w:hAnsi="Times New Roman"/>
+        </w:rPr>
+        <w:t xml:space="preserve">,</w:t>
+      </w:r>
+      <w:r>
+        <w:rPr>
+          <w:rFonts w:ascii="Times New Roman" w:hAnsi="Times New Roman"/>
+        </w:rPr>
+        <w:t xml:space="preserve"> </w:t>
+      </w:r>
+      <m:oMath>
+        <m:r>
+          <m:t>n</m:t>
+        </m:r>
+        <m:r>
+          <m:rPr>
+            <m:sty m:val="p"/>
+          </m:rPr>
+          <m:t>=</m:t>
+        </m:r>
+        <m:r>
+          <m:t>7</m:t>
+        </m:r>
+      </m:oMath>
+      <w:r>
+        <w:rPr>
+          <w:rFonts w:ascii="Times New Roman" w:hAnsi="Times New Roman"/>
+        </w:rPr>
+        <w:t xml:space="preserve">, the walker on the middle qubit,</w:t>
+      </w:r>
+      <w:r>
+        <w:rPr>
+          <w:rFonts w:ascii="Times New Roman" w:hAnsi="Times New Roman"/>
+        </w:rPr>
+        <w:t xml:space="preserve"> </w:t>
+      </w:r>
+      <m:oMath>
+        <m:r>
+          <m:t>t</m:t>
+        </m:r>
+        <m:r>
+          <m:rPr>
+            <m:sty m:val="p"/>
+          </m:rPr>
+          <m:t>∈</m:t>
+        </m:r>
+        <m:r>
+          <m:rPr>
+            <m:sty m:val="p"/>
+          </m:rPr>
+          <m:t>{</m:t>
+        </m:r>
+        <m:r>
+          <m:t>0.4</m:t>
+        </m:r>
+        <m:r>
+          <m:rPr>
+            <m:sty m:val="p"/>
+          </m:rPr>
+          <m:t>,</m:t>
+        </m:r>
+        <m:r>
+          <m:t>0.8</m:t>
+        </m:r>
+        <m:r>
+          <m:rPr>
+            <m:sty m:val="p"/>
+          </m:rPr>
+          <m:t>,</m:t>
+        </m:r>
+        <m:r>
+          <m:t>1.2</m:t>
+        </m:r>
+        <m:r>
+          <m:rPr>
+            <m:sty m:val="p"/>
+          </m:rPr>
+          <m:t>,</m:t>
+        </m:r>
+        <m:r>
+          <m:t>1.6</m:t>
+        </m:r>
+        <m:r>
+          <m:rPr>
+            <m:sty m:val="p"/>
+          </m:rPr>
+          <m:t>}</m:t>
+        </m:r>
+      </m:oMath>
+      <w:r>
+        <w:rPr>
+          <w:rFonts w:ascii="Times New Roman" w:hAnsi="Times New Roman"/>
+        </w:rPr>
+        <w:t xml:space="preserve"> </w:t>
+      </w:r>
+      <w:r>
+        <w:rPr>
+          <w:rFonts w:ascii="Times New Roman" w:hAnsi="Times New Roman"/>
+        </w:rPr>
+        <w:t xml:space="preserve">with</w:t>
+      </w:r>
+      <w:r>
+        <w:rPr>
+          <w:rFonts w:ascii="Times New Roman" w:hAnsi="Times New Roman"/>
+        </w:rPr>
+        <w:t xml:space="preserve"> </w:t>
+      </w:r>
+      <w:r>
+        <w:rPr>
+          <w:rFonts w:ascii="Times New Roman" w:hAnsi="Times New Roman"/>
+        </w:rPr>
+        <w:t xml:space="preserve">Trotter step 0.2; the exact spread grows with exponent 1.94, a classical random walk with the same rate with</w:t>
+      </w:r>
+      <w:r>
+        <w:rPr>
+          <w:rFonts w:ascii="Times New Roman" w:hAnsi="Times New Roman"/>
+        </w:rPr>
+        <w:t xml:space="preserve"> </w:t>
+      </w:r>
+      <w:r>
+        <w:rPr>
+          <w:rFonts w:ascii="Times New Roman" w:hAnsi="Times New Roman"/>
+        </w:rPr>
+        <w:t xml:space="preserve">0.85. Raw data give a median exponent of 0.87: noise spreads the walker from the start and the walk looks</w:t>
+      </w:r>
+      <w:r>
+        <w:rPr>
+          <w:rFonts w:ascii="Times New Roman" w:hAnsi="Times New Roman"/>
+        </w:rPr>
+        <w:t xml:space="preserve"> </w:t>
+      </w:r>
+      <w:r>
+        <w:rPr>
+          <w:rFonts w:ascii="Times New Roman" w:hAnsi="Times New Roman"/>
+        </w:rPr>
+        <w:t xml:space="preserve">classical (Figure </w:t>
+      </w:r>
+      <w:hyperlink w:anchor="fig:trotter">
+        <w:r>
+          <w:rPr>
+            <w:rStyle w:val="Hyperlink"/>
+          </w:rPr>
+          <w:t xml:space="preserve">2</w:t>
+        </w:r>
+      </w:hyperlink>
+      <w:r>
+        <w:rPr>
+          <w:rFonts w:ascii="Times New Roman" w:hAnsi="Times New Roman"/>
+        </w:rPr>
+        <w:t xml:space="preserve">b). With filter + read-out the median exponent is 1.84, the raw exponent is</w:t>
+      </w:r>
+      <w:r>
+        <w:rPr>
+          <w:rFonts w:ascii="Times New Roman" w:hAnsi="Times New Roman"/>
+        </w:rPr>
+        <w:t xml:space="preserve"> </w:t>
+      </w:r>
+      <w:r>
+        <w:rPr>
+          <w:rFonts w:ascii="Times New Roman" w:hAnsi="Times New Roman"/>
+        </w:rPr>
+        <w:t xml:space="preserve">lower on 20 of 21 (passed), and</w:t>
+      </w:r>
+      <w:r>
+        <w:rPr>
+          <w:rFonts w:ascii="Times New Roman" w:hAnsi="Times New Roman"/>
+        </w:rPr>
+        <w:t xml:space="preserve"> </w:t>
+      </w:r>
+      <m:oMath>
+        <m:sSup>
+          <m:e>
+            <m:r>
+              <m:t>σ</m:t>
+            </m:r>
+          </m:e>
+          <m:sup>
+            <m:r>
+              <m:t>2</m:t>
+            </m:r>
+          </m:sup>
+        </m:sSup>
+      </m:oMath>
+      <w:r>
+        <w:rPr>
+          <w:rFonts w:ascii="Times New Roman" w:hAnsi="Times New Roman"/>
+        </w:rPr>
+        <w:t xml:space="preserve"> </w:t>
+      </w:r>
+      <w:r>
+        <w:rPr>
+          <w:rFonts w:ascii="Times New Roman" w:hAnsi="Times New Roman"/>
+        </w:rPr>
+        <w:t xml:space="preserve">is within 20% of the exact value at all four times on 15 of 21</w:t>
+      </w:r>
+      <w:r>
+        <w:rPr>
+          <w:rFonts w:ascii="Times New Roman" w:hAnsi="Times New Roman"/>
+        </w:rPr>
+        <w:t xml:space="preserve"> </w:t>
+      </w:r>
+      <w:r>
+        <w:rPr>
+          <w:rFonts w:ascii="Times New Roman" w:hAnsi="Times New Roman"/>
+        </w:rPr>
+        <w:t xml:space="preserve">(raw: none; passed). The exponent reached 1.5 on 16 devices, not the predicted 18 (failed): the four noisiest</w:t>
+      </w:r>
+      <w:r>
+        <w:rPr>
+          <w:rFonts w:ascii="Times New Roman" w:hAnsi="Times New Roman"/>
+        </w:rPr>
+        <w:t xml:space="preserve"> </w:t>
+      </w:r>
+      <w:r>
+        <w:rPr>
+          <w:rFonts w:ascii="Times New Roman" w:hAnsi="Times New Roman"/>
+        </w:rPr>
+        <w:t xml:space="preserve">after FakeKyoto give 1.26–1.38, and on FakeKyoto (15% of shots kept at 96 gates) the walk is lost.</w:t>
+      </w:r>
+    </w:p>
+    <w:bookmarkEnd w:id="45"/>
+    <w:bookmarkEnd w:id="46"/>
+    <w:bookmarkStart w:id="47" w:name="discussion"/>
     <w:p>
       <w:pPr>
         <w:pStyle w:val="Heading1"/>
@@ -10215,7 +12339,31 @@
         <w:rPr>
           <w:rFonts w:ascii="Times New Roman" w:hAnsi="Times New Roman"/>
         </w:rPr>
-        <w:t xml:space="preserve">). Nine of the twenty-seven predictions failed as written, several through the analysis rather</w:t>
+        <w:t xml:space="preserve">), and so does</w:t>
+      </w:r>
+      <w:r>
+        <w:rPr>
+          <w:rFonts w:ascii="Times New Roman" w:hAnsi="Times New Roman"/>
+        </w:rPr>
+        <w:t xml:space="preserve"> </w:t>
+      </w:r>
+      <w:r>
+        <w:rPr>
+          <w:rFonts w:ascii="Times New Roman" w:hAnsi="Times New Roman"/>
+        </w:rPr>
+        <w:t xml:space="preserve">dynamics: the filter lets a Trotter simulation use more steps and makes the ballistic spreading of a quantum</w:t>
+      </w:r>
+      <w:r>
+        <w:rPr>
+          <w:rFonts w:ascii="Times New Roman" w:hAnsi="Times New Roman"/>
+        </w:rPr>
+        <w:t xml:space="preserve"> </w:t>
+      </w:r>
+      <w:r>
+        <w:rPr>
+          <w:rFonts w:ascii="Times New Roman" w:hAnsi="Times New Roman"/>
+        </w:rPr>
+        <w:t xml:space="preserve">walk visible where raw data look classical. Ten of the thirty-three predictions failed as written, several through the analysis rather</w:t>
       </w:r>
       <w:r>
         <w:rPr>
@@ -10266,8 +12414,8 @@
         <w:t xml:space="preserve">are absent. A run on hardware is the next step.</w:t>
       </w:r>
     </w:p>
-    <w:bookmarkEnd w:id="42"/>
-    <w:bookmarkStart w:id="66" w:name="code-and-data-availability"/>
+    <w:bookmarkEnd w:id="47"/>
+    <w:bookmarkStart w:id="75" w:name="code-and-data-availability"/>
     <w:p>
       <w:pPr>
         <w:pStyle w:val="Heading1"/>
@@ -10299,15 +12447,15 @@
         <w:rPr>
           <w:rFonts w:ascii="Times New Roman" w:hAnsi="Times New Roman"/>
         </w:rPr>
-        <w:t xml:space="preserve">functions of §146 are in the repository and in the next release):</w:t>
-      </w:r>
-      <w:r>
-        <w:rPr>
-          <w:rFonts w:ascii="Times New Roman" w:hAnsi="Times New Roman"/>
-        </w:rPr>
-        <w:t xml:space="preserve"> </w:t>
-      </w:r>
-      <w:hyperlink r:id="rId43">
+        <w:t xml:space="preserve">functions of §146–§147 are in the repository and in the next release):</w:t>
+      </w:r>
+      <w:r>
+        <w:rPr>
+          <w:rFonts w:ascii="Times New Roman" w:hAnsi="Times New Roman"/>
+        </w:rPr>
+        <w:t xml:space="preserve"> </w:t>
+      </w:r>
+      <w:hyperlink r:id="rId48">
         <w:r>
           <w:rPr>
             <w:rStyle w:val="Hyperlink"/>
@@ -10594,8 +12742,8 @@
         <w:t xml:space="preserve">]</w:t>
       </w:r>
     </w:p>
-    <w:bookmarkStart w:id="65" w:name="refs"/>
-    <w:bookmarkStart w:id="44" w:name="ref-bonetmonroig2018"/>
+    <w:bookmarkStart w:id="74" w:name="refs"/>
+    <w:bookmarkStart w:id="49" w:name="ref-bonetmonroig2018"/>
     <w:p>
       <w:pPr>
         <w:pStyle w:val="Bibliography"/>
@@ -10645,8 +12793,8 @@
         <w:t xml:space="preserve">98: 062339.</w:t>
       </w:r>
     </w:p>
-    <w:bookmarkEnd w:id="44"/>
-    <w:bookmarkStart w:id="46" w:name="ref-bravyi2021readout"/>
+    <w:bookmarkEnd w:id="49"/>
+    <w:bookmarkStart w:id="51" w:name="ref-bravyi2021readout"/>
     <w:p>
       <w:pPr>
         <w:pStyle w:val="Bibliography"/>
@@ -10701,7 +12849,7 @@
         </w:rPr>
         <w:t xml:space="preserve"> </w:t>
       </w:r>
-      <w:hyperlink r:id="rId45">
+      <w:hyperlink r:id="rId50">
         <w:r>
           <w:rPr>
             <w:rStyle w:val="Hyperlink"/>
@@ -10716,8 +12864,8 @@
         <w:t xml:space="preserve">.</w:t>
       </w:r>
     </w:p>
-    <w:bookmarkEnd w:id="46"/>
-    <w:bookmarkStart w:id="48" w:name="ref-giurgicatiron2020"/>
+    <w:bookmarkEnd w:id="51"/>
+    <w:bookmarkStart w:id="53" w:name="ref-giurgicatiron2020"/>
     <w:p>
       <w:pPr>
         <w:pStyle w:val="Bibliography"/>
@@ -10778,7 +12926,7 @@
         </w:rPr>
         <w:t xml:space="preserve"> </w:t>
       </w:r>
-      <w:hyperlink r:id="rId47">
+      <w:hyperlink r:id="rId52">
         <w:r>
           <w:rPr>
             <w:rStyle w:val="Hyperlink"/>
@@ -10793,8 +12941,8 @@
         <w:t xml:space="preserve">.</w:t>
       </w:r>
     </w:p>
-    <w:bookmarkEnd w:id="48"/>
-    <w:bookmarkStart w:id="50" w:name="ref-qiskitibmruntime"/>
+    <w:bookmarkEnd w:id="53"/>
+    <w:bookmarkStart w:id="55" w:name="ref-qiskitibmruntime"/>
     <w:p>
       <w:pPr>
         <w:pStyle w:val="Bibliography"/>
@@ -10847,7 +12995,7 @@
         </w:rPr>
         <w:t xml:space="preserve"> </w:t>
       </w:r>
-      <w:hyperlink r:id="rId49">
+      <w:hyperlink r:id="rId54">
         <w:r>
           <w:rPr>
             <w:rStyle w:val="Hyperlink"/>
@@ -10862,8 +13010,8 @@
         <w:t xml:space="preserve">.</w:t>
       </w:r>
     </w:p>
-    <w:bookmarkEnd w:id="50"/>
-    <w:bookmarkStart w:id="52" w:name="ref-javadiabhari2024qiskit"/>
+    <w:bookmarkEnd w:id="55"/>
+    <w:bookmarkStart w:id="57" w:name="ref-javadiabhari2024qiskit"/>
     <w:p>
       <w:pPr>
         <w:pStyle w:val="Bibliography"/>
@@ -10910,7 +13058,7 @@
         </w:rPr>
         <w:t xml:space="preserve"> </w:t>
       </w:r>
-      <w:hyperlink r:id="rId51">
+      <w:hyperlink r:id="rId56">
         <w:r>
           <w:rPr>
             <w:rStyle w:val="Hyperlink"/>
@@ -10925,8 +13073,8 @@
         <w:t xml:space="preserve">.</w:t>
       </w:r>
     </w:p>
-    <w:bookmarkEnd w:id="52"/>
-    <w:bookmarkStart w:id="54" w:name="ref-lloyd2014qpca"/>
+    <w:bookmarkEnd w:id="57"/>
+    <w:bookmarkStart w:id="59" w:name="ref-kempe2003walks"/>
     <w:p>
       <w:pPr>
         <w:pStyle w:val="Bibliography"/>
@@ -10935,6 +13083,148 @@
         <w:rPr>
           <w:rFonts w:ascii="Times New Roman" w:hAnsi="Times New Roman"/>
         </w:rPr>
+        <w:t xml:space="preserve">Kempe, Julia. 2003.</w:t>
+      </w:r>
+      <w:r>
+        <w:rPr>
+          <w:rFonts w:ascii="Times New Roman" w:hAnsi="Times New Roman"/>
+        </w:rPr>
+        <w:t xml:space="preserve"> </w:t>
+      </w:r>
+      <w:r>
+        <w:rPr>
+          <w:rFonts w:ascii="Times New Roman" w:hAnsi="Times New Roman"/>
+        </w:rPr>
+        <w:t xml:space="preserve">“Quantum Random Walks: An Introductory Overview.”</w:t>
+      </w:r>
+      <w:r>
+        <w:rPr>
+          <w:rFonts w:ascii="Times New Roman" w:hAnsi="Times New Roman"/>
+        </w:rPr>
+        <w:t xml:space="preserve"> </w:t>
+      </w:r>
+      <w:r>
+        <w:rPr>
+          <w:iCs/>
+          <w:rFonts w:ascii="Times New Roman" w:hAnsi="Times New Roman"/>
+          <w:i/>
+        </w:rPr>
+        <w:t xml:space="preserve">Contemporary Physics</w:t>
+      </w:r>
+      <w:r>
+        <w:rPr>
+          <w:rFonts w:ascii="Times New Roman" w:hAnsi="Times New Roman"/>
+        </w:rPr>
+        <w:t xml:space="preserve"> </w:t>
+      </w:r>
+      <w:r>
+        <w:rPr>
+          <w:rFonts w:ascii="Times New Roman" w:hAnsi="Times New Roman"/>
+        </w:rPr>
+        <w:t xml:space="preserve">44 (4): 307–27.</w:t>
+      </w:r>
+      <w:r>
+        <w:rPr>
+          <w:rFonts w:ascii="Times New Roman" w:hAnsi="Times New Roman"/>
+        </w:rPr>
+        <w:t xml:space="preserve"> </w:t>
+      </w:r>
+      <w:hyperlink r:id="rId58">
+        <w:r>
+          <w:rPr>
+            <w:rStyle w:val="Hyperlink"/>
+          </w:rPr>
+          <w:t xml:space="preserve">https://doi.org/10.1080/00107151031000110776</w:t>
+        </w:r>
+      </w:hyperlink>
+      <w:r>
+        <w:rPr>
+          <w:rFonts w:ascii="Times New Roman" w:hAnsi="Times New Roman"/>
+        </w:rPr>
+        <w:t xml:space="preserve">.</w:t>
+      </w:r>
+    </w:p>
+    <w:bookmarkEnd w:id="59"/>
+    <w:bookmarkStart w:id="61" w:name="ref-lloyd1996simulators"/>
+    <w:p>
+      <w:pPr>
+        <w:pStyle w:val="Bibliography"/>
+      </w:pPr>
+      <w:r>
+        <w:rPr>
+          <w:rFonts w:ascii="Times New Roman" w:hAnsi="Times New Roman"/>
+        </w:rPr>
+        <w:t xml:space="preserve">Lloyd, Seth. 1996.</w:t>
+      </w:r>
+      <w:r>
+        <w:rPr>
+          <w:rFonts w:ascii="Times New Roman" w:hAnsi="Times New Roman"/>
+        </w:rPr>
+        <w:t xml:space="preserve"> </w:t>
+      </w:r>
+      <w:r>
+        <w:rPr>
+          <w:rFonts w:ascii="Times New Roman" w:hAnsi="Times New Roman"/>
+        </w:rPr>
+        <w:t xml:space="preserve">“Universal Quantum Simulators.”</w:t>
+      </w:r>
+      <w:r>
+        <w:rPr>
+          <w:rFonts w:ascii="Times New Roman" w:hAnsi="Times New Roman"/>
+        </w:rPr>
+        <w:t xml:space="preserve"> </w:t>
+      </w:r>
+      <w:r>
+        <w:rPr>
+          <w:iCs/>
+          <w:rFonts w:ascii="Times New Roman" w:hAnsi="Times New Roman"/>
+          <w:i/>
+        </w:rPr>
+        <w:t xml:space="preserve">Science</w:t>
+      </w:r>
+      <w:r>
+        <w:rPr>
+          <w:rFonts w:ascii="Times New Roman" w:hAnsi="Times New Roman"/>
+        </w:rPr>
+        <w:t xml:space="preserve"> </w:t>
+      </w:r>
+      <w:r>
+        <w:rPr>
+          <w:rFonts w:ascii="Times New Roman" w:hAnsi="Times New Roman"/>
+        </w:rPr>
+        <w:t xml:space="preserve">273 (5278): 1073–78.</w:t>
+      </w:r>
+      <w:r>
+        <w:rPr>
+          <w:rFonts w:ascii="Times New Roman" w:hAnsi="Times New Roman"/>
+        </w:rPr>
+        <w:t xml:space="preserve"> </w:t>
+      </w:r>
+      <w:hyperlink r:id="rId60">
+        <w:r>
+          <w:rPr>
+            <w:rStyle w:val="Hyperlink"/>
+          </w:rPr>
+          <w:t xml:space="preserve">https://doi.org/10.1126/science.273.5278.1073</w:t>
+        </w:r>
+      </w:hyperlink>
+      <w:r>
+        <w:rPr>
+          <w:rFonts w:ascii="Times New Roman" w:hAnsi="Times New Roman"/>
+        </w:rPr>
+        <w:t xml:space="preserve">.</w:t>
+      </w:r>
+    </w:p>
+    <w:bookmarkEnd w:id="61"/>
+    <w:bookmarkStart w:id="63" w:name="ref-lloyd2014qpca"/>
+    <w:p>
+      <w:pPr>
+        <w:pStyle w:val="Bibliography"/>
+      </w:pPr>
+      <w:r>
+        <w:rPr>
+          <w:rFonts w:ascii="Times New Roman" w:hAnsi="Times New Roman"/>
+        </w:rPr>
         <w:t xml:space="preserve">Lloyd, Seth, Masoud Mohseni, and Patrick Rebentrost. 2014.</w:t>
       </w:r>
       <w:r>
@@ -10981,7 +13271,7 @@
         </w:rPr>
         <w:t xml:space="preserve"> </w:t>
       </w:r>
-      <w:hyperlink r:id="rId53">
+      <w:hyperlink r:id="rId62">
         <w:r>
           <w:rPr>
             <w:rStyle w:val="Hyperlink"/>
@@ -10996,8 +13286,8 @@
         <w:t xml:space="preserve">.</w:t>
       </w:r>
     </w:p>
-    <w:bookmarkEnd w:id="54"/>
-    <w:bookmarkStart w:id="55" w:name="ref-mcardle2019"/>
+    <w:bookmarkEnd w:id="63"/>
+    <w:bookmarkStart w:id="64" w:name="ref-mcardle2019"/>
     <w:p>
       <w:pPr>
         <w:pStyle w:val="Bibliography"/>
@@ -11047,8 +13337,8 @@
         <w:t xml:space="preserve">122: 180501.</w:t>
       </w:r>
     </w:p>
-    <w:bookmarkEnd w:id="55"/>
-    <w:bookmarkStart w:id="57" w:name="ref-monteverde2026qang"/>
+    <w:bookmarkEnd w:id="64"/>
+    <w:bookmarkStart w:id="66" w:name="ref-monteverde2026qang"/>
     <w:p>
       <w:pPr>
         <w:pStyle w:val="Bibliography"/>
@@ -11101,7 +13391,7 @@
         </w:rPr>
         <w:t xml:space="preserve"> </w:t>
       </w:r>
-      <w:hyperlink r:id="rId56">
+      <w:hyperlink r:id="rId65">
         <w:r>
           <w:rPr>
             <w:rStyle w:val="Hyperlink"/>
@@ -11116,8 +13406,8 @@
         <w:t xml:space="preserve">.</w:t>
       </w:r>
     </w:p>
-    <w:bookmarkEnd w:id="57"/>
-    <w:bookmarkStart w:id="58" w:name="ref-monteverde2026qml"/>
+    <w:bookmarkEnd w:id="66"/>
+    <w:bookmarkStart w:id="67" w:name="ref-monteverde2026qml"/>
     <w:p>
       <w:pPr>
         <w:pStyle w:val="Bibliography"/>
@@ -11159,8 +13449,8 @@
         <w:t xml:space="preserve">-Limited Hardware: What the Qg Symmetry Filter Does and Does Not Do.”</w:t>
       </w:r>
     </w:p>
-    <w:bookmarkEnd w:id="58"/>
-    <w:bookmarkStart w:id="60" w:name="ref-qiskitml"/>
+    <w:bookmarkEnd w:id="67"/>
+    <w:bookmarkStart w:id="69" w:name="ref-qiskitml"/>
     <w:p>
       <w:pPr>
         <w:pStyle w:val="Bibliography"/>
@@ -11189,7 +13479,7 @@
         </w:rPr>
         <w:t xml:space="preserve"> </w:t>
       </w:r>
-      <w:hyperlink r:id="rId59">
+      <w:hyperlink r:id="rId68">
         <w:r>
           <w:rPr>
             <w:rStyle w:val="Hyperlink"/>
@@ -11204,8 +13494,8 @@
         <w:t xml:space="preserve">.</w:t>
       </w:r>
     </w:p>
-    <w:bookmarkEnd w:id="60"/>
-    <w:bookmarkStart w:id="62" w:name="ref-tang2021qpca"/>
+    <w:bookmarkEnd w:id="69"/>
+    <w:bookmarkStart w:id="71" w:name="ref-tang2021qpca"/>
     <w:p>
       <w:pPr>
         <w:pStyle w:val="Bibliography"/>
@@ -11260,7 +13550,7 @@
         </w:rPr>
         <w:t xml:space="preserve"> </w:t>
       </w:r>
-      <w:hyperlink r:id="rId61">
+      <w:hyperlink r:id="rId70">
         <w:r>
           <w:rPr>
             <w:rStyle w:val="Hyperlink"/>
@@ -11275,8 +13565,8 @@
         <w:t xml:space="preserve">.</w:t>
       </w:r>
     </w:p>
-    <w:bookmarkEnd w:id="62"/>
-    <w:bookmarkStart w:id="64" w:name="ref-temme2017"/>
+    <w:bookmarkEnd w:id="71"/>
+    <w:bookmarkStart w:id="73" w:name="ref-temme2017"/>
     <w:p>
       <w:pPr>
         <w:pStyle w:val="Bibliography"/>
@@ -11331,7 +13621,7 @@
         </w:rPr>
         <w:t xml:space="preserve"> </w:t>
       </w:r>
-      <w:hyperlink r:id="rId63">
+      <w:hyperlink r:id="rId72">
         <w:r>
           <w:rPr>
             <w:rStyle w:val="Hyperlink"/>
@@ -11346,9 +13636,9 @@
         <w:t xml:space="preserve">.</w:t>
       </w:r>
     </w:p>
-    <w:bookmarkEnd w:id="64"/>
-    <w:bookmarkEnd w:id="65"/>
-    <w:bookmarkEnd w:id="66"/>
+    <w:bookmarkEnd w:id="73"/>
+    <w:bookmarkEnd w:id="74"/>
+    <w:bookmarkEnd w:id="75"/>
     <w:sectPr/>
   </w:body>
 </w:document>

</xml_diff>

<commit_message>
IBM paper (EN and ES): section 148, interacting excitations in the XXZ chain; Zenodo record updated
Co-Authored-By: Claude Opus 5.5 <noreply@anthropic.com>
Claude-Session: https://claude.ai/code/session_01VmfpwzVWvRWhRHG7VzpiEN
</commit_message>
<xml_diff>
--- a/manuscript/qang_ibm.docx
+++ b/manuscript/qang_ibm.docx
@@ -4870,6 +4870,304 @@
         <w:rPr>
           <w:rFonts w:ascii="Times New Roman" w:hAnsi="Times New Roman"/>
         </w:rPr>
+        <w:t xml:space="preserve">With</w:t>
+      </w:r>
+      <w:r>
+        <w:rPr>
+          <w:rFonts w:ascii="Times New Roman" w:hAnsi="Times New Roman"/>
+        </w:rPr>
+        <w:t xml:space="preserve"> </w:t>
+      </w:r>
+      <w:r>
+        <w:rPr>
+          <w:rFonts w:ascii="Times New Roman" w:hAnsi="Times New Roman"/>
+        </w:rPr>
+        <w:t xml:space="preserve">two</w:t>
+      </w:r>
+      <w:r>
+        <w:rPr>
+          <w:rFonts w:ascii="Times New Roman" w:hAnsi="Times New Roman"/>
+        </w:rPr>
+        <w:t xml:space="preserve"> </w:t>
+      </w:r>
+      <w:r>
+        <w:rPr>
+          <w:rFonts w:ascii="Times New Roman" w:hAnsi="Times New Roman"/>
+        </w:rPr>
+        <w:t xml:space="preserve">or</w:t>
+      </w:r>
+      <w:r>
+        <w:rPr>
+          <w:rFonts w:ascii="Times New Roman" w:hAnsi="Times New Roman"/>
+        </w:rPr>
+        <w:t xml:space="preserve"> </w:t>
+      </w:r>
+      <w:r>
+        <w:rPr>
+          <w:rFonts w:ascii="Times New Roman" w:hAnsi="Times New Roman"/>
+        </w:rPr>
+        <w:t xml:space="preserve">three</w:t>
+      </w:r>
+      <w:r>
+        <w:rPr>
+          <w:rFonts w:ascii="Times New Roman" w:hAnsi="Times New Roman"/>
+        </w:rPr>
+        <w:t xml:space="preserve"> </w:t>
+      </w:r>
+      <w:r>
+        <w:rPr>
+          <w:rFonts w:ascii="Times New Roman" w:hAnsi="Times New Roman"/>
+        </w:rPr>
+        <w:t xml:space="preserve">interacting</w:t>
+      </w:r>
+      <w:r>
+        <w:rPr>
+          <w:rFonts w:ascii="Times New Roman" w:hAnsi="Times New Roman"/>
+        </w:rPr>
+        <w:t xml:space="preserve"> </w:t>
+      </w:r>
+      <w:r>
+        <w:rPr>
+          <w:rFonts w:ascii="Times New Roman" w:hAnsi="Times New Roman"/>
+        </w:rPr>
+        <w:t xml:space="preserve">excitations</w:t>
+      </w:r>
+      <w:r>
+        <w:rPr>
+          <w:rFonts w:ascii="Times New Roman" w:hAnsi="Times New Roman"/>
+        </w:rPr>
+        <w:t xml:space="preserve"> </w:t>
+      </w:r>
+      <w:r>
+        <w:rPr>
+          <w:rFonts w:ascii="Times New Roman" w:hAnsi="Times New Roman"/>
+        </w:rPr>
+        <w:t xml:space="preserve">(XXZ</w:t>
+      </w:r>
+      <w:r>
+        <w:rPr>
+          <w:rFonts w:ascii="Times New Roman" w:hAnsi="Times New Roman"/>
+        </w:rPr>
+        <w:t xml:space="preserve"> </w:t>
+      </w:r>
+      <w:r>
+        <w:rPr>
+          <w:rFonts w:ascii="Times New Roman" w:hAnsi="Times New Roman"/>
+        </w:rPr>
+        <w:t xml:space="preserve">chain)</w:t>
+      </w:r>
+      <w:r>
+        <w:rPr>
+          <w:rFonts w:ascii="Times New Roman" w:hAnsi="Times New Roman"/>
+        </w:rPr>
+        <w:t xml:space="preserve"> </w:t>
+      </w:r>
+      <w:r>
+        <w:rPr>
+          <w:rFonts w:ascii="Times New Roman" w:hAnsi="Times New Roman"/>
+        </w:rPr>
+        <w:t xml:space="preserve">the</w:t>
+      </w:r>
+      <w:r>
+        <w:rPr>
+          <w:rFonts w:ascii="Times New Roman" w:hAnsi="Times New Roman"/>
+        </w:rPr>
+        <w:t xml:space="preserve"> </w:t>
+      </w:r>
+      <w:r>
+        <w:rPr>
+          <w:rFonts w:ascii="Times New Roman" w:hAnsi="Times New Roman"/>
+        </w:rPr>
+        <w:t xml:space="preserve">gain</w:t>
+      </w:r>
+      <w:r>
+        <w:rPr>
+          <w:rFonts w:ascii="Times New Roman" w:hAnsi="Times New Roman"/>
+        </w:rPr>
+        <w:t xml:space="preserve"> </w:t>
+      </w:r>
+      <w:r>
+        <w:rPr>
+          <w:rFonts w:ascii="Times New Roman" w:hAnsi="Times New Roman"/>
+        </w:rPr>
+        <w:t xml:space="preserve">falls</w:t>
+      </w:r>
+      <w:r>
+        <w:rPr>
+          <w:rFonts w:ascii="Times New Roman" w:hAnsi="Times New Roman"/>
+        </w:rPr>
+        <w:t xml:space="preserve"> </w:t>
+      </w:r>
+      <w:r>
+        <w:rPr>
+          <w:rFonts w:ascii="Times New Roman" w:hAnsi="Times New Roman"/>
+        </w:rPr>
+        <w:t xml:space="preserve">from</w:t>
+      </w:r>
+      <w:r>
+        <w:rPr>
+          <w:rFonts w:ascii="Times New Roman" w:hAnsi="Times New Roman"/>
+        </w:rPr>
+        <w:t xml:space="preserve"> </w:t>
+      </w:r>
+      <w:r>
+        <w:rPr>
+          <w:rFonts w:ascii="Times New Roman" w:hAnsi="Times New Roman"/>
+        </w:rPr>
+        <w:t xml:space="preserve">5.6</w:t>
+      </w:r>
+      <m:oMath>
+        <m:r>
+          <m:rPr>
+            <m:sty m:val="p"/>
+          </m:rPr>
+          <m:t>×</m:t>
+        </m:r>
+      </m:oMath>
+      <w:r>
+        <w:rPr>
+          <w:rFonts w:ascii="Times New Roman" w:hAnsi="Times New Roman"/>
+        </w:rPr>
+        <w:t xml:space="preserve"> </w:t>
+      </w:r>
+      <w:r>
+        <w:rPr>
+          <w:rFonts w:ascii="Times New Roman" w:hAnsi="Times New Roman"/>
+        </w:rPr>
+        <w:t xml:space="preserve">to</w:t>
+      </w:r>
+      <w:r>
+        <w:rPr>
+          <w:rFonts w:ascii="Times New Roman" w:hAnsi="Times New Roman"/>
+        </w:rPr>
+        <w:t xml:space="preserve"> </w:t>
+      </w:r>
+      <w:r>
+        <w:rPr>
+          <w:rFonts w:ascii="Times New Roman" w:hAnsi="Times New Roman"/>
+        </w:rPr>
+        <w:t xml:space="preserve">2.6</w:t>
+      </w:r>
+      <m:oMath>
+        <m:r>
+          <m:rPr>
+            <m:sty m:val="p"/>
+          </m:rPr>
+          <m:t>×</m:t>
+        </m:r>
+      </m:oMath>
+      <w:r>
+        <w:rPr>
+          <w:rFonts w:ascii="Times New Roman" w:hAnsi="Times New Roman"/>
+        </w:rPr>
+        <w:t xml:space="preserve">:</w:t>
+      </w:r>
+      <w:r>
+        <w:rPr>
+          <w:rFonts w:ascii="Times New Roman" w:hAnsi="Times New Roman"/>
+        </w:rPr>
+        <w:t xml:space="preserve"> </w:t>
+      </w:r>
+      <w:r>
+        <w:rPr>
+          <w:rFonts w:ascii="Times New Roman" w:hAnsi="Times New Roman"/>
+        </w:rPr>
+        <w:t xml:space="preserve">larger</w:t>
+      </w:r>
+      <w:r>
+        <w:rPr>
+          <w:rFonts w:ascii="Times New Roman" w:hAnsi="Times New Roman"/>
+        </w:rPr>
+        <w:t xml:space="preserve"> </w:t>
+      </w:r>
+      <w:r>
+        <w:rPr>
+          <w:rFonts w:ascii="Times New Roman" w:hAnsi="Times New Roman"/>
+        </w:rPr>
+        <w:t xml:space="preserve">sectors</w:t>
+      </w:r>
+      <w:r>
+        <w:rPr>
+          <w:rFonts w:ascii="Times New Roman" w:hAnsi="Times New Roman"/>
+        </w:rPr>
+        <w:t xml:space="preserve"> </w:t>
+      </w:r>
+      <w:r>
+        <w:rPr>
+          <w:rFonts w:ascii="Times New Roman" w:hAnsi="Times New Roman"/>
+        </w:rPr>
+        <w:t xml:space="preserve">let</w:t>
+      </w:r>
+      <w:r>
+        <w:rPr>
+          <w:rFonts w:ascii="Times New Roman" w:hAnsi="Times New Roman"/>
+        </w:rPr>
+        <w:t xml:space="preserve"> </w:t>
+      </w:r>
+      <w:r>
+        <w:rPr>
+          <w:rFonts w:ascii="Times New Roman" w:hAnsi="Times New Roman"/>
+        </w:rPr>
+        <w:t xml:space="preserve">more</w:t>
+      </w:r>
+      <w:r>
+        <w:rPr>
+          <w:rFonts w:ascii="Times New Roman" w:hAnsi="Times New Roman"/>
+        </w:rPr>
+        <w:t xml:space="preserve"> </w:t>
+      </w:r>
+      <w:r>
+        <w:rPr>
+          <w:rFonts w:ascii="Times New Roman" w:hAnsi="Times New Roman"/>
+        </w:rPr>
+        <w:t xml:space="preserve">of</w:t>
+      </w:r>
+      <w:r>
+        <w:rPr>
+          <w:rFonts w:ascii="Times New Roman" w:hAnsi="Times New Roman"/>
+        </w:rPr>
+        <w:t xml:space="preserve"> </w:t>
+      </w:r>
+      <w:r>
+        <w:rPr>
+          <w:rFonts w:ascii="Times New Roman" w:hAnsi="Times New Roman"/>
+        </w:rPr>
+        <w:t xml:space="preserve">the</w:t>
+      </w:r>
+      <w:r>
+        <w:rPr>
+          <w:rFonts w:ascii="Times New Roman" w:hAnsi="Times New Roman"/>
+        </w:rPr>
+        <w:t xml:space="preserve"> </w:t>
+      </w:r>
+      <w:r>
+        <w:rPr>
+          <w:rFonts w:ascii="Times New Roman" w:hAnsi="Times New Roman"/>
+        </w:rPr>
+        <w:t xml:space="preserve">noise</w:t>
+      </w:r>
+      <w:r>
+        <w:rPr>
+          <w:rFonts w:ascii="Times New Roman" w:hAnsi="Times New Roman"/>
+        </w:rPr>
+        <w:t xml:space="preserve"> </w:t>
+      </w:r>
+      <w:r>
+        <w:rPr>
+          <w:rFonts w:ascii="Times New Roman" w:hAnsi="Times New Roman"/>
+        </w:rPr>
+        <w:t xml:space="preserve">through.</w:t>
+      </w:r>
+      <w:r>
+        <w:rPr>
+          <w:rFonts w:ascii="Times New Roman" w:hAnsi="Times New Roman"/>
+        </w:rPr>
+        <w:t xml:space="preserve"> </w:t>
+      </w:r>
+      <w:r>
+        <w:rPr>
+          <w:rFonts w:ascii="Times New Roman" w:hAnsi="Times New Roman"/>
+        </w:rPr>
         <w:t xml:space="preserve">Two</w:t>
       </w:r>
       <w:r>
@@ -5565,7 +5863,7 @@
         <w:rPr>
           <w:rFonts w:ascii="Times New Roman" w:hAnsi="Times New Roman"/>
         </w:rPr>
-        <w:t xml:space="preserve">§137–§147 refer to the research notes of the repository, where every number below is reproduced by a</w:t>
+        <w:t xml:space="preserve">§137–§148 refer to the research notes of the repository, where every number below is reproduced by a</w:t>
       </w:r>
       <w:r>
         <w:rPr>
@@ -8921,7 +9219,303 @@
         <w:rPr>
           <w:rFonts w:ascii="Times New Roman" w:hAnsi="Times New Roman"/>
         </w:rPr>
-        <w:t xml:space="preserve">.</w:t>
+        <w:t xml:space="preserve">. The XXZ chain adds</w:t>
+      </w:r>
+      <w:r>
+        <w:rPr>
+          <w:rFonts w:ascii="Times New Roman" w:hAnsi="Times New Roman"/>
+        </w:rPr>
+        <w:t xml:space="preserve"> </w:t>
+      </w:r>
+      <m:oMath>
+        <m:r>
+          <m:t>V</m:t>
+        </m:r>
+        <m:nary>
+          <m:naryPr>
+            <m:chr m:val="∑"/>
+            <m:limLoc m:val="undOvr"/>
+            <m:subHide m:val="off"/>
+            <m:supHide m:val="on"/>
+          </m:naryPr>
+          <m:sub>
+            <m:r>
+              <m:t>k</m:t>
+            </m:r>
+          </m:sub>
+          <m:sup>
+            <m:r>
+              <m:t>​</m:t>
+            </m:r>
+          </m:sup>
+          <m:e>
+            <m:sSub>
+              <m:e>
+                <m:r>
+                  <m:t>Z</m:t>
+                </m:r>
+              </m:e>
+              <m:sub>
+                <m:r>
+                  <m:t>k</m:t>
+                </m:r>
+              </m:sub>
+            </m:sSub>
+          </m:e>
+        </m:nary>
+        <m:sSub>
+          <m:e>
+            <m:r>
+              <m:t>Z</m:t>
+            </m:r>
+          </m:e>
+          <m:sub>
+            <m:r>
+              <m:t>k</m:t>
+            </m:r>
+            <m:r>
+              <m:rPr>
+                <m:sty m:val="p"/>
+              </m:rPr>
+              <m:t>+</m:t>
+            </m:r>
+            <m:r>
+              <m:t>1</m:t>
+            </m:r>
+          </m:sub>
+        </m:sSub>
+        <m:r>
+          <m:rPr>
+            <m:sty m:val="p"/>
+          </m:rPr>
+          <m:t>/</m:t>
+        </m:r>
+        <m:r>
+          <m:t>4</m:t>
+        </m:r>
+      </m:oMath>
+      <w:r>
+        <w:rPr>
+          <w:rFonts w:ascii="Times New Roman" w:hAnsi="Times New Roman"/>
+        </w:rPr>
+        <w:t xml:space="preserve">, which</w:t>
+      </w:r>
+      <w:r>
+        <w:rPr>
+          <w:rFonts w:ascii="Times New Roman" w:hAnsi="Times New Roman"/>
+        </w:rPr>
+        <w:t xml:space="preserve"> </w:t>
+      </w:r>
+      <w:r>
+        <w:rPr>
+          <w:rFonts w:ascii="Times New Roman" w:hAnsi="Times New Roman"/>
+        </w:rPr>
+        <w:t xml:space="preserve">makes the excitations interact and still conserves the weight;</w:t>
+      </w:r>
+      <w:r>
+        <w:rPr>
+          <w:rFonts w:ascii="Times New Roman" w:hAnsi="Times New Roman"/>
+        </w:rPr>
+        <w:t xml:space="preserve"> </w:t>
+      </w:r>
+      <w:r>
+        <w:rPr>
+          <w:rStyle w:val="VerbatimChar"/>
+          <w:rFonts w:ascii="Times New Roman" w:hAnsi="Times New Roman"/>
+        </w:rPr>
+        <w:t xml:space="preserve">xxz_trotter</w:t>
+      </w:r>
+      <w:r>
+        <w:rPr>
+          <w:rFonts w:ascii="Times New Roman" w:hAnsi="Times New Roman"/>
+        </w:rPr>
+        <w:t xml:space="preserve"> </w:t>
+      </w:r>
+      <w:r>
+        <w:rPr>
+          <w:rFonts w:ascii="Times New Roman" w:hAnsi="Times New Roman"/>
+        </w:rPr>
+        <w:t xml:space="preserve">writes each bond as one</w:t>
+      </w:r>
+      <w:r>
+        <w:rPr>
+          <w:rFonts w:ascii="Times New Roman" w:hAnsi="Times New Roman"/>
+        </w:rPr>
+        <w:t xml:space="preserve"> </w:t>
+      </w:r>
+      <w:r>
+        <w:rPr>
+          <w:rFonts w:ascii="Times New Roman" w:hAnsi="Times New Roman"/>
+        </w:rPr>
+        <w:t xml:space="preserve">two-qubit gate</w:t>
+      </w:r>
+      <w:r>
+        <w:rPr>
+          <w:rFonts w:ascii="Times New Roman" w:hAnsi="Times New Roman"/>
+        </w:rPr>
+        <w:t xml:space="preserve"> </w:t>
+      </w:r>
+      <m:oMath>
+        <m:r>
+          <m:rPr>
+            <m:sty m:val="p"/>
+          </m:rPr>
+          <m:t>exp</m:t>
+        </m:r>
+        <m:d>
+          <m:dPr>
+            <m:begChr m:val="("/>
+            <m:endChr m:val=")"/>
+            <m:sepChr m:val=""/>
+            <m:grow/>
+          </m:dPr>
+          <m:e>
+            <m:r>
+              <m:rPr>
+                <m:sty m:val="p"/>
+              </m:rPr>
+              <m:t>−</m:t>
+            </m:r>
+            <m:r>
+              <m:t>i</m:t>
+            </m:r>
+            <m:r>
+              <m:t> </m:t>
+            </m:r>
+            <m:r>
+              <m:t>δ</m:t>
+            </m:r>
+            <m:r>
+              <m:t>t</m:t>
+            </m:r>
+            <m:r>
+              <m:t> </m:t>
+            </m:r>
+            <m:d>
+              <m:dPr>
+                <m:begChr m:val="["/>
+                <m:endChr m:val="]"/>
+                <m:sepChr m:val=""/>
+                <m:grow/>
+              </m:dPr>
+              <m:e>
+                <m:r>
+                  <m:t>J</m:t>
+                </m:r>
+                <m:d>
+                  <m:dPr>
+                    <m:begChr m:val="("/>
+                    <m:endChr m:val=")"/>
+                    <m:sepChr m:val=""/>
+                    <m:grow/>
+                  </m:dPr>
+                  <m:e>
+                    <m:r>
+                      <m:t>X</m:t>
+                    </m:r>
+                    <m:r>
+                      <m:t>X</m:t>
+                    </m:r>
+                    <m:r>
+                      <m:rPr>
+                        <m:sty m:val="p"/>
+                      </m:rPr>
+                      <m:t>+</m:t>
+                    </m:r>
+                    <m:r>
+                      <m:t>Y</m:t>
+                    </m:r>
+                    <m:r>
+                      <m:t>Y</m:t>
+                    </m:r>
+                  </m:e>
+                </m:d>
+                <m:r>
+                  <m:rPr>
+                    <m:sty m:val="p"/>
+                  </m:rPr>
+                  <m:t>/</m:t>
+                </m:r>
+                <m:r>
+                  <m:t>2</m:t>
+                </m:r>
+                <m:r>
+                  <m:rPr>
+                    <m:sty m:val="p"/>
+                  </m:rPr>
+                  <m:t>+</m:t>
+                </m:r>
+                <m:r>
+                  <m:t>V</m:t>
+                </m:r>
+                <m:r>
+                  <m:t>Z</m:t>
+                </m:r>
+                <m:r>
+                  <m:t>Z</m:t>
+                </m:r>
+                <m:r>
+                  <m:rPr>
+                    <m:sty m:val="p"/>
+                  </m:rPr>
+                  <m:t>/</m:t>
+                </m:r>
+                <m:r>
+                  <m:t>4</m:t>
+                </m:r>
+              </m:e>
+            </m:d>
+          </m:e>
+        </m:d>
+      </m:oMath>
+      <w:r>
+        <w:rPr>
+          <w:rFonts w:ascii="Times New Roman" w:hAnsi="Times New Roman"/>
+        </w:rPr>
+        <w:t xml:space="preserve"> </w:t>
+      </w:r>
+      <w:r>
+        <w:rPr>
+          <w:rFonts w:ascii="Times New Roman" w:hAnsi="Times New Roman"/>
+        </w:rPr>
+        <w:t xml:space="preserve">(the two parts commute), in first- or second-order</w:t>
+      </w:r>
+      <w:r>
+        <w:rPr>
+          <w:rFonts w:ascii="Times New Roman" w:hAnsi="Times New Roman"/>
+        </w:rPr>
+        <w:t xml:space="preserve"> </w:t>
+      </w:r>
+      <w:r>
+        <w:rPr>
+          <w:rFonts w:ascii="Times New Roman" w:hAnsi="Times New Roman"/>
+        </w:rPr>
+        <w:t xml:space="preserve">(symmetric) Trotter steps, and</w:t>
+      </w:r>
+      <w:r>
+        <w:rPr>
+          <w:rFonts w:ascii="Times New Roman" w:hAnsi="Times New Roman"/>
+        </w:rPr>
+        <w:t xml:space="preserve"> </w:t>
+      </w:r>
+      <w:r>
+        <w:rPr>
+          <w:rStyle w:val="VerbatimChar"/>
+          <w:rFonts w:ascii="Times New Roman" w:hAnsi="Times New Roman"/>
+        </w:rPr>
+        <w:t xml:space="preserve">xxz_exact_occupations</w:t>
+      </w:r>
+      <w:r>
+        <w:rPr>
+          <w:rFonts w:ascii="Times New Roman" w:hAnsi="Times New Roman"/>
+        </w:rPr>
+        <w:t xml:space="preserve"> </w:t>
+      </w:r>
+      <w:r>
+        <w:rPr>
+          <w:rFonts w:ascii="Times New Roman" w:hAnsi="Times New Roman"/>
+        </w:rPr>
+        <w:t xml:space="preserve">evolves in the full Hilbert space.</w:t>
       </w:r>
     </w:p>
     <w:bookmarkEnd w:id="28"/>
@@ -9090,7 +9684,7 @@
     </w:p>
     <w:bookmarkEnd w:id="29"/>
     <w:bookmarkEnd w:id="30"/>
-    <w:bookmarkStart w:id="46" w:name="results"/>
+    <w:bookmarkStart w:id="48" w:name="results"/>
     <w:p>
       <w:pPr>
         <w:pStyle w:val="Heading1"/>
@@ -12198,8 +12792,746 @@
       </w:r>
     </w:p>
     <w:bookmarkEnd w:id="45"/>
+    <w:bookmarkStart w:id="47" w:name="interacting-excitations-148"/>
+    <w:p>
+      <w:pPr>
+        <w:pStyle w:val="Heading2"/>
+      </w:pPr>
+      <w:r>
+        <w:rPr>
+          <w:rFonts w:ascii="Times New Roman" w:hAnsi="Times New Roman"/>
+        </w:rPr>
+        <w:t xml:space="preserve">Interacting excitations (§148)</w:t>
+      </w:r>
+    </w:p>
+    <w:bookmarkStart w:id="46" w:name="tab:xxz"/>
+    <w:p>
+      <w:pPr>
+        <w:pStyle w:val="TableCaption"/>
+      </w:pPr>
+      <w:r>
+        <w:rPr>
+          <w:rFonts w:ascii="Times New Roman" w:hAnsi="Times New Roman"/>
+          <w:sz w:val="18"/>
+        </w:rPr>
+        <w:t xml:space="preserve">XXZ chain,</w:t>
+      </w:r>
+      <w:r>
+        <w:rPr>
+          <w:rFonts w:ascii="Times New Roman" w:hAnsi="Times New Roman"/>
+          <w:sz w:val="18"/>
+        </w:rPr>
+        <w:t xml:space="preserve"> </w:t>
+      </w:r>
+      <m:oMath>
+        <m:r>
+          <m:t>n</m:t>
+        </m:r>
+        <m:r>
+          <m:rPr>
+            <m:sty m:val="p"/>
+          </m:rPr>
+          <m:t>=</m:t>
+        </m:r>
+        <m:r>
+          <m:t>6</m:t>
+        </m:r>
+      </m:oMath>
+      <w:r>
+        <w:rPr>
+          <w:rFonts w:ascii="Times New Roman" w:hAnsi="Times New Roman"/>
+          <w:sz w:val="18"/>
+        </w:rPr>
+        <w:t xml:space="preserve">,</w:t>
+      </w:r>
+      <w:r>
+        <w:rPr>
+          <w:rFonts w:ascii="Times New Roman" w:hAnsi="Times New Roman"/>
+          <w:sz w:val="18"/>
+        </w:rPr>
+        <w:t xml:space="preserve"> </w:t>
+      </w:r>
+      <m:oMath>
+        <m:r>
+          <m:t>V</m:t>
+        </m:r>
+        <m:r>
+          <m:rPr>
+            <m:sty m:val="p"/>
+          </m:rPr>
+          <m:t>=</m:t>
+        </m:r>
+        <m:r>
+          <m:t>2</m:t>
+        </m:r>
+      </m:oMath>
+      <w:r>
+        <w:rPr>
+          <w:rFonts w:ascii="Times New Roman" w:hAnsi="Times New Roman"/>
+          <w:sz w:val="18"/>
+        </w:rPr>
+        <w:t xml:space="preserve">,</w:t>
+      </w:r>
+      <w:r>
+        <w:rPr>
+          <w:rFonts w:ascii="Times New Roman" w:hAnsi="Times New Roman"/>
+          <w:sz w:val="18"/>
+        </w:rPr>
+        <w:t xml:space="preserve"> </w:t>
+      </w:r>
+      <m:oMath>
+        <m:r>
+          <m:t>T</m:t>
+        </m:r>
+        <m:r>
+          <m:rPr>
+            <m:sty m:val="p"/>
+          </m:rPr>
+          <m:t>=</m:t>
+        </m:r>
+        <m:r>
+          <m:t>2</m:t>
+        </m:r>
+      </m:oMath>
+      <w:r>
+        <w:rPr>
+          <w:rFonts w:ascii="Times New Roman" w:hAnsi="Times New Roman"/>
+          <w:sz w:val="18"/>
+        </w:rPr>
+        <w:t xml:space="preserve">: best error over Trotter order (1, 2) and steps (1–8), median over</w:t>
+      </w:r>
+      <w:r>
+        <w:rPr>
+          <w:rFonts w:ascii="Times New Roman" w:hAnsi="Times New Roman"/>
+          <w:sz w:val="18"/>
+        </w:rPr>
+        <w:t xml:space="preserve"> </w:t>
+      </w:r>
+      <w:r>
+        <w:rPr>
+          <w:rFonts w:ascii="Times New Roman" w:hAnsi="Times New Roman"/>
+          <w:sz w:val="18"/>
+        </w:rPr>
+        <w:t xml:space="preserve">twenty-one device noise models; the last column is the median ratio and its range across devices.</w:t>
+      </w:r>
+    </w:p>
+    <w:tbl>
+      <w:tblPr>
+        <w:tblStyle w:val="Table"/>
+        <w:tblW w:type="auto" w:w="0"/>
+        <w:tblLook w:firstRow="1" w:lastRow="0" w:firstColumn="0" w:lastColumn="0" w:noHBand="0" w:noVBand="0" w:val="0020"/>
+        <w:jc w:val="start"/>
+        <w:tblCaption w:val="XXZ chain, n=6, V=2, T=2: best error over Trotter order (1, 2) and steps (1–8), median over twenty-one device noise models; the last column is the median ratio and its range across devices."/>
+      </w:tblPr>
+      <w:tblGrid>
+        <w:gridCol w:w="1320"/>
+        <w:gridCol w:w="1320"/>
+        <w:gridCol w:w="1320"/>
+        <w:gridCol w:w="1320"/>
+        <w:gridCol w:w="1320"/>
+        <w:gridCol w:w="1320"/>
+      </w:tblGrid>
+      <w:tr>
+        <w:trPr>
+          <w:tblHeader w:val="true"/>
+        </w:trPr>
+        <w:tc>
+          <w:tcPr/>
+          <w:p>
+            <w:pPr>
+              <w:pStyle w:val="Compact"/>
+              <w:jc w:val="left"/>
+            </w:pPr>
+            <w:r>
+              <w:t xml:space="preserve">excitations</w:t>
+            </w:r>
+          </w:p>
+        </w:tc>
+        <w:tc>
+          <w:tcPr/>
+          <w:p>
+            <w:pPr>
+              <w:pStyle w:val="Compact"/>
+              <w:jc w:val="center"/>
+            </w:pPr>
+            <w:r>
+              <w:t xml:space="preserve">raw</w:t>
+            </w:r>
+          </w:p>
+        </w:tc>
+        <w:tc>
+          <w:tcPr/>
+          <w:p>
+            <w:pPr>
+              <w:pStyle w:val="Compact"/>
+              <w:jc w:val="center"/>
+            </w:pPr>
+            <w:r>
+              <w:t xml:space="preserve">read-out</w:t>
+            </w:r>
+          </w:p>
+        </w:tc>
+        <w:tc>
+          <w:tcPr/>
+          <w:p>
+            <w:pPr>
+              <w:pStyle w:val="Compact"/>
+              <w:jc w:val="center"/>
+            </w:pPr>
+            <w:r>
+              <w:t xml:space="preserve">filter</w:t>
+            </w:r>
+          </w:p>
+        </w:tc>
+        <w:tc>
+          <w:tcPr/>
+          <w:p>
+            <w:pPr>
+              <w:pStyle w:val="Compact"/>
+              <w:jc w:val="center"/>
+            </w:pPr>
+            <w:r>
+              <w:t xml:space="preserve">filter + read-out</w:t>
+            </w:r>
+          </w:p>
+        </w:tc>
+        <w:tc>
+          <w:tcPr/>
+          <w:p>
+            <w:pPr>
+              <w:pStyle w:val="Compact"/>
+              <w:jc w:val="center"/>
+            </w:pPr>
+            <w:r>
+              <w:t xml:space="preserve">raw / filter + read-out</w:t>
+            </w:r>
+          </w:p>
+        </w:tc>
+      </w:tr>
+      <w:tr>
+        <w:tc>
+          <w:tcPr/>
+          <w:p>
+            <w:pPr>
+              <w:pStyle w:val="Compact"/>
+              <w:jc w:val="left"/>
+            </w:pPr>
+            <w:r>
+              <w:t xml:space="preserve">1</w:t>
+            </w:r>
+          </w:p>
+        </w:tc>
+        <w:tc>
+          <w:tcPr/>
+          <w:p>
+            <w:pPr>
+              <w:pStyle w:val="Compact"/>
+              <w:jc w:val="center"/>
+            </w:pPr>
+            <w:r>
+              <w:t xml:space="preserve">0.066</w:t>
+            </w:r>
+          </w:p>
+        </w:tc>
+        <w:tc>
+          <w:tcPr/>
+          <w:p>
+            <w:pPr>
+              <w:pStyle w:val="Compact"/>
+              <w:jc w:val="center"/>
+            </w:pPr>
+            <w:r>
+              <w:t xml:space="preserve">0.038</w:t>
+            </w:r>
+          </w:p>
+        </w:tc>
+        <w:tc>
+          <w:tcPr/>
+          <w:p>
+            <w:pPr>
+              <w:pStyle w:val="Compact"/>
+              <w:jc w:val="center"/>
+            </w:pPr>
+            <w:r>
+              <w:t xml:space="preserve">0.008</w:t>
+            </w:r>
+          </w:p>
+        </w:tc>
+        <w:tc>
+          <w:tcPr/>
+          <w:p>
+            <w:pPr>
+              <w:pStyle w:val="Compact"/>
+              <w:jc w:val="center"/>
+            </w:pPr>
+            <w:r>
+              <w:t xml:space="preserve">0.009</w:t>
+            </w:r>
+          </w:p>
+        </w:tc>
+        <w:tc>
+          <w:tcPr/>
+          <w:p>
+            <w:pPr>
+              <w:pStyle w:val="Compact"/>
+              <w:jc w:val="center"/>
+            </w:pPr>
+            <w:r>
+              <w:t xml:space="preserve">5.6 (2.4–14.4)</w:t>
+            </w:r>
+          </w:p>
+        </w:tc>
+      </w:tr>
+      <w:tr>
+        <w:tc>
+          <w:tcPr/>
+          <w:p>
+            <w:pPr>
+              <w:pStyle w:val="Compact"/>
+              <w:jc w:val="left"/>
+            </w:pPr>
+            <w:r>
+              <w:t xml:space="preserve">2</w:t>
+            </w:r>
+          </w:p>
+        </w:tc>
+        <w:tc>
+          <w:tcPr/>
+          <w:p>
+            <w:pPr>
+              <w:pStyle w:val="Compact"/>
+              <w:jc w:val="center"/>
+            </w:pPr>
+            <w:r>
+              <w:t xml:space="preserve">0.080</w:t>
+            </w:r>
+          </w:p>
+        </w:tc>
+        <w:tc>
+          <w:tcPr/>
+          <w:p>
+            <w:pPr>
+              <w:pStyle w:val="Compact"/>
+              <w:jc w:val="center"/>
+            </w:pPr>
+            <w:r>
+              <w:t xml:space="preserve">0.072</w:t>
+            </w:r>
+          </w:p>
+        </w:tc>
+        <w:tc>
+          <w:tcPr/>
+          <w:p>
+            <w:pPr>
+              <w:pStyle w:val="Compact"/>
+              <w:jc w:val="center"/>
+            </w:pPr>
+            <w:r>
+              <w:t xml:space="preserve">0.030</w:t>
+            </w:r>
+          </w:p>
+        </w:tc>
+        <w:tc>
+          <w:tcPr/>
+          <w:p>
+            <w:pPr>
+              <w:pStyle w:val="Compact"/>
+              <w:jc w:val="center"/>
+            </w:pPr>
+            <w:r>
+              <w:t xml:space="preserve">0.028</w:t>
+            </w:r>
+          </w:p>
+        </w:tc>
+        <w:tc>
+          <w:tcPr/>
+          <w:p>
+            <w:pPr>
+              <w:pStyle w:val="Compact"/>
+              <w:jc w:val="center"/>
+            </w:pPr>
+            <w:r>
+              <w:t xml:space="preserve">2.6 (1.1–3.8)</w:t>
+            </w:r>
+          </w:p>
+        </w:tc>
+      </w:tr>
+      <w:tr>
+        <w:tc>
+          <w:tcPr/>
+          <w:p>
+            <w:pPr>
+              <w:pStyle w:val="Compact"/>
+              <w:jc w:val="left"/>
+            </w:pPr>
+            <w:r>
+              <w:t xml:space="preserve">3</w:t>
+            </w:r>
+          </w:p>
+        </w:tc>
+        <w:tc>
+          <w:tcPr/>
+          <w:p>
+            <w:pPr>
+              <w:pStyle w:val="Compact"/>
+              <w:jc w:val="center"/>
+            </w:pPr>
+            <w:r>
+              <w:t xml:space="preserve">0.065</w:t>
+            </w:r>
+          </w:p>
+        </w:tc>
+        <w:tc>
+          <w:tcPr/>
+          <w:p>
+            <w:pPr>
+              <w:pStyle w:val="Compact"/>
+              <w:jc w:val="center"/>
+            </w:pPr>
+            <w:r>
+              <w:t xml:space="preserve">0.055</w:t>
+            </w:r>
+          </w:p>
+        </w:tc>
+        <w:tc>
+          <w:tcPr/>
+          <w:p>
+            <w:pPr>
+              <w:pStyle w:val="Compact"/>
+              <w:jc w:val="center"/>
+            </w:pPr>
+            <w:r>
+              <w:t xml:space="preserve">0.030</w:t>
+            </w:r>
+          </w:p>
+        </w:tc>
+        <w:tc>
+          <w:tcPr/>
+          <w:p>
+            <w:pPr>
+              <w:pStyle w:val="Compact"/>
+              <w:jc w:val="center"/>
+            </w:pPr>
+            <w:r>
+              <w:t xml:space="preserve">0.024</w:t>
+            </w:r>
+          </w:p>
+        </w:tc>
+        <w:tc>
+          <w:tcPr/>
+          <w:p>
+            <w:pPr>
+              <w:pStyle w:val="Compact"/>
+              <w:jc w:val="center"/>
+            </w:pPr>
+            <w:r>
+              <w:t xml:space="preserve">2.6 (1.0–4.6)</w:t>
+            </w:r>
+          </w:p>
+        </w:tc>
+      </w:tr>
+    </w:tbl>
     <w:bookmarkEnd w:id="46"/>
-    <w:bookmarkStart w:id="47" w:name="discussion"/>
+    <w:p>
+      <w:pPr>
+        <w:pStyle w:val="BodyText"/>
+      </w:pPr>
+      <w:r>
+        <w:rPr>
+          <w:rFonts w:ascii="Times New Roman" w:hAnsi="Times New Roman"/>
+        </w:rPr>
+        <w:t xml:space="preserve">One excitation is the filter’s easiest case and is easy classically too. With</w:t>
+      </w:r>
+      <w:r>
+        <w:rPr>
+          <w:rFonts w:ascii="Times New Roman" w:hAnsi="Times New Roman"/>
+        </w:rPr>
+        <w:t xml:space="preserve"> </w:t>
+      </w:r>
+      <m:oMath>
+        <m:r>
+          <m:t>V</m:t>
+        </m:r>
+        <m:r>
+          <m:rPr>
+            <m:sty m:val="p"/>
+          </m:rPr>
+          <m:t>=</m:t>
+        </m:r>
+        <m:r>
+          <m:t>2</m:t>
+        </m:r>
+      </m:oMath>
+      <w:r>
+        <w:rPr>
+          <w:rFonts w:ascii="Times New Roman" w:hAnsi="Times New Roman"/>
+        </w:rPr>
+        <w:t xml:space="preserve">, random fields in</w:t>
+      </w:r>
+      <w:r>
+        <w:rPr>
+          <w:rFonts w:ascii="Times New Roman" w:hAnsi="Times New Roman"/>
+        </w:rPr>
+        <w:t xml:space="preserve"> </w:t>
+      </w:r>
+      <m:oMath>
+        <m:d>
+          <m:dPr>
+            <m:begChr m:val="["/>
+            <m:endChr m:val="]"/>
+            <m:sepChr m:val=""/>
+            <m:grow/>
+          </m:dPr>
+          <m:e>
+            <m:r>
+              <m:rPr>
+                <m:sty m:val="p"/>
+              </m:rPr>
+              <m:t>−</m:t>
+            </m:r>
+            <m:r>
+              <m:t>0.5</m:t>
+            </m:r>
+            <m:r>
+              <m:rPr>
+                <m:sty m:val="p"/>
+              </m:rPr>
+              <m:t>,</m:t>
+            </m:r>
+            <m:r>
+              <m:t>0.5</m:t>
+            </m:r>
+          </m:e>
+        </m:d>
+      </m:oMath>
+      <w:r>
+        <w:rPr>
+          <w:rFonts w:ascii="Times New Roman" w:hAnsi="Times New Roman"/>
+        </w:rPr>
+        <w:t xml:space="preserve">,</w:t>
+      </w:r>
+      <w:r>
+        <w:rPr>
+          <w:rFonts w:ascii="Times New Roman" w:hAnsi="Times New Roman"/>
+        </w:rPr>
+        <w:t xml:space="preserve"> </w:t>
+      </w:r>
+      <m:oMath>
+        <m:r>
+          <m:t>T</m:t>
+        </m:r>
+        <m:r>
+          <m:rPr>
+            <m:sty m:val="p"/>
+          </m:rPr>
+          <m:t>=</m:t>
+        </m:r>
+        <m:r>
+          <m:t>2</m:t>
+        </m:r>
+      </m:oMath>
+      <w:r>
+        <w:rPr>
+          <w:rFonts w:ascii="Times New Roman" w:hAnsi="Times New Roman"/>
+        </w:rPr>
+        <w:t xml:space="preserve"> </w:t>
+      </w:r>
+      <w:r>
+        <w:rPr>
+          <w:rFonts w:ascii="Times New Roman" w:hAnsi="Times New Roman"/>
+        </w:rPr>
+        <w:t xml:space="preserve">and 1, 2 or 3 excitations starting on the first qubits of a six-qubit chain, the dynamics</w:t>
+      </w:r>
+      <w:r>
+        <w:rPr>
+          <w:rFonts w:ascii="Times New Roman" w:hAnsi="Times New Roman"/>
+        </w:rPr>
+        <w:t xml:space="preserve"> </w:t>
+      </w:r>
+      <w:r>
+        <w:rPr>
+          <w:rFonts w:ascii="Times New Roman" w:hAnsi="Times New Roman"/>
+        </w:rPr>
+        <w:t xml:space="preserve">is many-body. The filter’s benefit falls from 5.6</w:t>
+      </w:r>
+      <m:oMath>
+        <m:r>
+          <m:rPr>
+            <m:sty m:val="p"/>
+          </m:rPr>
+          <m:t>×</m:t>
+        </m:r>
+      </m:oMath>
+      <w:r>
+        <w:rPr>
+          <w:rFonts w:ascii="Times New Roman" w:hAnsi="Times New Roman"/>
+        </w:rPr>
+        <w:t xml:space="preserve"> </w:t>
+      </w:r>
+      <w:r>
+        <w:rPr>
+          <w:rFonts w:ascii="Times New Roman" w:hAnsi="Times New Roman"/>
+        </w:rPr>
+        <w:t xml:space="preserve">with one excitation to 2.6</w:t>
+      </w:r>
+      <m:oMath>
+        <m:r>
+          <m:rPr>
+            <m:sty m:val="p"/>
+          </m:rPr>
+          <m:t>×</m:t>
+        </m:r>
+      </m:oMath>
+      <w:r>
+        <w:rPr>
+          <w:rFonts w:ascii="Times New Roman" w:hAnsi="Times New Roman"/>
+        </w:rPr>
+        <w:t xml:space="preserve"> </w:t>
+      </w:r>
+      <w:r>
+        <w:rPr>
+          <w:rFonts w:ascii="Times New Roman" w:hAnsi="Times New Roman"/>
+        </w:rPr>
+        <w:t xml:space="preserve">with two and with</w:t>
+      </w:r>
+      <w:r>
+        <w:rPr>
+          <w:rFonts w:ascii="Times New Roman" w:hAnsi="Times New Roman"/>
+        </w:rPr>
+        <w:t xml:space="preserve"> </w:t>
+      </w:r>
+      <w:r>
+        <w:rPr>
+          <w:rFonts w:ascii="Times New Roman" w:hAnsi="Times New Roman"/>
+        </w:rPr>
+        <w:t xml:space="preserve">three (Table </w:t>
+      </w:r>
+      <w:hyperlink w:anchor="tab:xxz">
+        <w:r>
+          <w:rPr>
+            <w:rStyle w:val="Hyperlink"/>
+          </w:rPr>
+          <w:t xml:space="preserve">3</w:t>
+        </w:r>
+      </w:hyperlink>
+      <w:r>
+        <w:rPr>
+          <w:rFonts w:ascii="Times New Roman" w:hAnsi="Times New Roman"/>
+        </w:rPr>
+        <w:t xml:space="preserve">; predicted to fall with each excitation, passed only just between two and three).</w:t>
+      </w:r>
+      <w:r>
+        <w:rPr>
+          <w:rFonts w:ascii="Times New Roman" w:hAnsi="Times New Roman"/>
+        </w:rPr>
+        <w:t xml:space="preserve"> </w:t>
+      </w:r>
+      <w:r>
+        <w:rPr>
+          <w:rFonts w:ascii="Times New Roman" w:hAnsi="Times New Roman"/>
+        </w:rPr>
+        <w:t xml:space="preserve">Sectors with more excitations keep more shots (0.49 against 0.43 at 120 two-qubit gates) yet gain less: more</w:t>
+      </w:r>
+      <w:r>
+        <w:rPr>
+          <w:rFonts w:ascii="Times New Roman" w:hAnsi="Times New Roman"/>
+        </w:rPr>
+        <w:t xml:space="preserve"> </w:t>
+      </w:r>
+      <w:r>
+        <w:rPr>
+          <w:rFonts w:ascii="Times New Roman" w:hAnsi="Times New Roman"/>
+        </w:rPr>
+        <w:t xml:space="preserve">of the noise lands inside a larger sector (20 of 64 states at half filling, against 6), where the filter</w:t>
+      </w:r>
+      <w:r>
+        <w:rPr>
+          <w:rFonts w:ascii="Times New Roman" w:hAnsi="Times New Roman"/>
+        </w:rPr>
+        <w:t xml:space="preserve"> </w:t>
+      </w:r>
+      <w:r>
+        <w:rPr>
+          <w:rFonts w:ascii="Times New Roman" w:hAnsi="Times New Roman"/>
+        </w:rPr>
+        <w:t xml:space="preserve">cannot see it. Filter + read-out was best on 62 of the 63 device–sector pairs; on FakeKyoto at half filling</w:t>
+      </w:r>
+      <w:r>
+        <w:rPr>
+          <w:rFonts w:ascii="Times New Roman" w:hAnsi="Times New Roman"/>
+        </w:rPr>
+        <w:t xml:space="preserve"> </w:t>
+      </w:r>
+      <w:r>
+        <w:rPr>
+          <w:rFonts w:ascii="Times New Roman" w:hAnsi="Times New Roman"/>
+        </w:rPr>
+        <w:t xml:space="preserve">it was not (0.238 against 0.231), so that prediction failed. The filter again moved the optimal number of</w:t>
+      </w:r>
+      <w:r>
+        <w:rPr>
+          <w:rFonts w:ascii="Times New Roman" w:hAnsi="Times New Roman"/>
+        </w:rPr>
+        <w:t xml:space="preserve"> </w:t>
+      </w:r>
+      <w:r>
+        <w:rPr>
+          <w:rFonts w:ascii="Times New Roman" w:hAnsi="Times New Roman"/>
+        </w:rPr>
+        <w:t xml:space="preserve">Trotter steps deeper (61 of 63; median 8 or 6 against 4), and second-order Trotter was better with two</w:t>
+      </w:r>
+      <w:r>
+        <w:rPr>
+          <w:rFonts w:ascii="Times New Roman" w:hAnsi="Times New Roman"/>
+        </w:rPr>
+        <w:t xml:space="preserve"> </w:t>
+      </w:r>
+      <w:r>
+        <w:rPr>
+          <w:rFonts w:ascii="Times New Roman" w:hAnsi="Times New Roman"/>
+        </w:rPr>
+        <w:t xml:space="preserve">excitations on 20 of 21 devices (passed); with three, only on 5, because its extra gates cost more than its</w:t>
+      </w:r>
+      <w:r>
+        <w:rPr>
+          <w:rFonts w:ascii="Times New Roman" w:hAnsi="Times New Roman"/>
+        </w:rPr>
+        <w:t xml:space="preserve"> </w:t>
+      </w:r>
+      <w:r>
+        <w:rPr>
+          <w:rFonts w:ascii="Times New Roman" w:hAnsi="Times New Roman"/>
+        </w:rPr>
+        <w:t xml:space="preserve">smaller Trotter error saves. Building this experiment showed that the transpiler pass read state-preparation</w:t>
+      </w:r>
+      <w:r>
+        <w:rPr>
+          <w:rFonts w:ascii="Times New Roman" w:hAnsi="Times New Roman"/>
+        </w:rPr>
+        <w:t xml:space="preserve"> </w:t>
+      </w:r>
+      <w:r>
+        <w:rPr>
+          <w:rFonts w:ascii="Times New Roman" w:hAnsi="Times New Roman"/>
+        </w:rPr>
+        <w:t xml:space="preserve">X gates in the order the DAG lists them and could misreport the initial weight; it now takes an X as</w:t>
+      </w:r>
+      <w:r>
+        <w:rPr>
+          <w:rFonts w:ascii="Times New Roman" w:hAnsi="Times New Roman"/>
+        </w:rPr>
+        <w:t xml:space="preserve"> </w:t>
+      </w:r>
+      <w:r>
+        <w:rPr>
+          <w:rFonts w:ascii="Times New Roman" w:hAnsi="Times New Roman"/>
+        </w:rPr>
+        <w:t xml:space="preserve">preparation when it is the first operation on its qubit.</w:t>
+      </w:r>
+    </w:p>
+    <w:bookmarkEnd w:id="47"/>
+    <w:bookmarkEnd w:id="48"/>
+    <w:bookmarkStart w:id="49" w:name="discussion"/>
     <w:p>
       <w:pPr>
         <w:pStyle w:val="Heading1"/>
@@ -12363,7 +13695,19 @@
         <w:rPr>
           <w:rFonts w:ascii="Times New Roman" w:hAnsi="Times New Roman"/>
         </w:rPr>
-        <w:t xml:space="preserve">walk visible where raw data look classical. Ten of the thirty-three predictions failed as written, several through the analysis rather</w:t>
+        <w:t xml:space="preserve">walk visible where raw data look classical. Its benefit is largest with one excitation and halves when the</w:t>
+      </w:r>
+      <w:r>
+        <w:rPr>
+          <w:rFonts w:ascii="Times New Roman" w:hAnsi="Times New Roman"/>
+        </w:rPr>
+        <w:t xml:space="preserve"> </w:t>
+      </w:r>
+      <w:r>
+        <w:rPr>
+          <w:rFonts w:ascii="Times New Roman" w:hAnsi="Times New Roman"/>
+        </w:rPr>
+        <w:t xml:space="preserve">excitations interact. Eleven of the thirty-seven predictions failed as written, several through the analysis rather</w:t>
       </w:r>
       <w:r>
         <w:rPr>
@@ -12414,8 +13758,8 @@
         <w:t xml:space="preserve">are absent. A run on hardware is the next step.</w:t>
       </w:r>
     </w:p>
-    <w:bookmarkEnd w:id="47"/>
-    <w:bookmarkStart w:id="75" w:name="code-and-data-availability"/>
+    <w:bookmarkEnd w:id="49"/>
+    <w:bookmarkStart w:id="77" w:name="code-and-data-availability"/>
     <w:p>
       <w:pPr>
         <w:pStyle w:val="Heading1"/>
@@ -12447,15 +13791,15 @@
         <w:rPr>
           <w:rFonts w:ascii="Times New Roman" w:hAnsi="Times New Roman"/>
         </w:rPr>
-        <w:t xml:space="preserve">functions of §146–§147 are in the repository and in the next release):</w:t>
-      </w:r>
-      <w:r>
-        <w:rPr>
-          <w:rFonts w:ascii="Times New Roman" w:hAnsi="Times New Roman"/>
-        </w:rPr>
-        <w:t xml:space="preserve"> </w:t>
-      </w:r>
-      <w:hyperlink r:id="rId48">
+        <w:t xml:space="preserve">functions of §146–§148 are in the repository and in the next release):</w:t>
+      </w:r>
+      <w:r>
+        <w:rPr>
+          <w:rFonts w:ascii="Times New Roman" w:hAnsi="Times New Roman"/>
+        </w:rPr>
+        <w:t xml:space="preserve"> </w:t>
+      </w:r>
+      <w:hyperlink r:id="rId50">
         <w:r>
           <w:rPr>
             <w:rStyle w:val="Hyperlink"/>
@@ -12742,8 +14086,8 @@
         <w:t xml:space="preserve">]</w:t>
       </w:r>
     </w:p>
-    <w:bookmarkStart w:id="74" w:name="refs"/>
-    <w:bookmarkStart w:id="49" w:name="ref-bonetmonroig2018"/>
+    <w:bookmarkStart w:id="76" w:name="refs"/>
+    <w:bookmarkStart w:id="51" w:name="ref-bonetmonroig2018"/>
     <w:p>
       <w:pPr>
         <w:pStyle w:val="Bibliography"/>
@@ -12793,8 +14137,8 @@
         <w:t xml:space="preserve">98: 062339.</w:t>
       </w:r>
     </w:p>
-    <w:bookmarkEnd w:id="49"/>
-    <w:bookmarkStart w:id="51" w:name="ref-bravyi2021readout"/>
+    <w:bookmarkEnd w:id="51"/>
+    <w:bookmarkStart w:id="53" w:name="ref-bravyi2021readout"/>
     <w:p>
       <w:pPr>
         <w:pStyle w:val="Bibliography"/>
@@ -12849,7 +14193,7 @@
         </w:rPr>
         <w:t xml:space="preserve"> </w:t>
       </w:r>
-      <w:hyperlink r:id="rId50">
+      <w:hyperlink r:id="rId52">
         <w:r>
           <w:rPr>
             <w:rStyle w:val="Hyperlink"/>
@@ -12864,8 +14208,8 @@
         <w:t xml:space="preserve">.</w:t>
       </w:r>
     </w:p>
-    <w:bookmarkEnd w:id="51"/>
-    <w:bookmarkStart w:id="53" w:name="ref-giurgicatiron2020"/>
+    <w:bookmarkEnd w:id="53"/>
+    <w:bookmarkStart w:id="55" w:name="ref-giurgicatiron2020"/>
     <w:p>
       <w:pPr>
         <w:pStyle w:val="Bibliography"/>
@@ -12926,7 +14270,7 @@
         </w:rPr>
         <w:t xml:space="preserve"> </w:t>
       </w:r>
-      <w:hyperlink r:id="rId52">
+      <w:hyperlink r:id="rId54">
         <w:r>
           <w:rPr>
             <w:rStyle w:val="Hyperlink"/>
@@ -12941,8 +14285,8 @@
         <w:t xml:space="preserve">.</w:t>
       </w:r>
     </w:p>
-    <w:bookmarkEnd w:id="53"/>
-    <w:bookmarkStart w:id="55" w:name="ref-qiskitibmruntime"/>
+    <w:bookmarkEnd w:id="55"/>
+    <w:bookmarkStart w:id="57" w:name="ref-qiskitibmruntime"/>
     <w:p>
       <w:pPr>
         <w:pStyle w:val="Bibliography"/>
@@ -12995,7 +14339,7 @@
         </w:rPr>
         <w:t xml:space="preserve"> </w:t>
       </w:r>
-      <w:hyperlink r:id="rId54">
+      <w:hyperlink r:id="rId56">
         <w:r>
           <w:rPr>
             <w:rStyle w:val="Hyperlink"/>
@@ -13010,8 +14354,8 @@
         <w:t xml:space="preserve">.</w:t>
       </w:r>
     </w:p>
-    <w:bookmarkEnd w:id="55"/>
-    <w:bookmarkStart w:id="57" w:name="ref-javadiabhari2024qiskit"/>
+    <w:bookmarkEnd w:id="57"/>
+    <w:bookmarkStart w:id="59" w:name="ref-javadiabhari2024qiskit"/>
     <w:p>
       <w:pPr>
         <w:pStyle w:val="Bibliography"/>
@@ -13058,7 +14402,7 @@
         </w:rPr>
         <w:t xml:space="preserve"> </w:t>
       </w:r>
-      <w:hyperlink r:id="rId56">
+      <w:hyperlink r:id="rId58">
         <w:r>
           <w:rPr>
             <w:rStyle w:val="Hyperlink"/>
@@ -13073,8 +14417,8 @@
         <w:t xml:space="preserve">.</w:t>
       </w:r>
     </w:p>
-    <w:bookmarkEnd w:id="57"/>
-    <w:bookmarkStart w:id="59" w:name="ref-kempe2003walks"/>
+    <w:bookmarkEnd w:id="59"/>
+    <w:bookmarkStart w:id="61" w:name="ref-kempe2003walks"/>
     <w:p>
       <w:pPr>
         <w:pStyle w:val="Bibliography"/>
@@ -13129,7 +14473,7 @@
         </w:rPr>
         <w:t xml:space="preserve"> </w:t>
       </w:r>
-      <w:hyperlink r:id="rId58">
+      <w:hyperlink r:id="rId60">
         <w:r>
           <w:rPr>
             <w:rStyle w:val="Hyperlink"/>
@@ -13144,8 +14488,8 @@
         <w:t xml:space="preserve">.</w:t>
       </w:r>
     </w:p>
-    <w:bookmarkEnd w:id="59"/>
-    <w:bookmarkStart w:id="61" w:name="ref-lloyd1996simulators"/>
+    <w:bookmarkEnd w:id="61"/>
+    <w:bookmarkStart w:id="63" w:name="ref-lloyd1996simulators"/>
     <w:p>
       <w:pPr>
         <w:pStyle w:val="Bibliography"/>
@@ -13200,7 +14544,7 @@
         </w:rPr>
         <w:t xml:space="preserve"> </w:t>
       </w:r>
-      <w:hyperlink r:id="rId60">
+      <w:hyperlink r:id="rId62">
         <w:r>
           <w:rPr>
             <w:rStyle w:val="Hyperlink"/>
@@ -13215,8 +14559,8 @@
         <w:t xml:space="preserve">.</w:t>
       </w:r>
     </w:p>
-    <w:bookmarkEnd w:id="61"/>
-    <w:bookmarkStart w:id="63" w:name="ref-lloyd2014qpca"/>
+    <w:bookmarkEnd w:id="63"/>
+    <w:bookmarkStart w:id="65" w:name="ref-lloyd2014qpca"/>
     <w:p>
       <w:pPr>
         <w:pStyle w:val="Bibliography"/>
@@ -13271,7 +14615,7 @@
         </w:rPr>
         <w:t xml:space="preserve"> </w:t>
       </w:r>
-      <w:hyperlink r:id="rId62">
+      <w:hyperlink r:id="rId64">
         <w:r>
           <w:rPr>
             <w:rStyle w:val="Hyperlink"/>
@@ -13286,8 +14630,8 @@
         <w:t xml:space="preserve">.</w:t>
       </w:r>
     </w:p>
-    <w:bookmarkEnd w:id="63"/>
-    <w:bookmarkStart w:id="64" w:name="ref-mcardle2019"/>
+    <w:bookmarkEnd w:id="65"/>
+    <w:bookmarkStart w:id="66" w:name="ref-mcardle2019"/>
     <w:p>
       <w:pPr>
         <w:pStyle w:val="Bibliography"/>
@@ -13337,8 +14681,8 @@
         <w:t xml:space="preserve">122: 180501.</w:t>
       </w:r>
     </w:p>
-    <w:bookmarkEnd w:id="64"/>
-    <w:bookmarkStart w:id="66" w:name="ref-monteverde2026qang"/>
+    <w:bookmarkEnd w:id="66"/>
+    <w:bookmarkStart w:id="68" w:name="ref-monteverde2026qang"/>
     <w:p>
       <w:pPr>
         <w:pStyle w:val="Bibliography"/>
@@ -13391,7 +14735,7 @@
         </w:rPr>
         <w:t xml:space="preserve"> </w:t>
       </w:r>
-      <w:hyperlink r:id="rId65">
+      <w:hyperlink r:id="rId67">
         <w:r>
           <w:rPr>
             <w:rStyle w:val="Hyperlink"/>
@@ -13406,8 +14750,8 @@
         <w:t xml:space="preserve">.</w:t>
       </w:r>
     </w:p>
-    <w:bookmarkEnd w:id="66"/>
-    <w:bookmarkStart w:id="67" w:name="ref-monteverde2026qml"/>
+    <w:bookmarkEnd w:id="68"/>
+    <w:bookmarkStart w:id="69" w:name="ref-monteverde2026qml"/>
     <w:p>
       <w:pPr>
         <w:pStyle w:val="Bibliography"/>
@@ -13449,8 +14793,8 @@
         <w:t xml:space="preserve">-Limited Hardware: What the Qg Symmetry Filter Does and Does Not Do.”</w:t>
       </w:r>
     </w:p>
-    <w:bookmarkEnd w:id="67"/>
-    <w:bookmarkStart w:id="69" w:name="ref-qiskitml"/>
+    <w:bookmarkEnd w:id="69"/>
+    <w:bookmarkStart w:id="71" w:name="ref-qiskitml"/>
     <w:p>
       <w:pPr>
         <w:pStyle w:val="Bibliography"/>
@@ -13479,7 +14823,7 @@
         </w:rPr>
         <w:t xml:space="preserve"> </w:t>
       </w:r>
-      <w:hyperlink r:id="rId68">
+      <w:hyperlink r:id="rId70">
         <w:r>
           <w:rPr>
             <w:rStyle w:val="Hyperlink"/>
@@ -13494,8 +14838,8 @@
         <w:t xml:space="preserve">.</w:t>
       </w:r>
     </w:p>
-    <w:bookmarkEnd w:id="69"/>
-    <w:bookmarkStart w:id="71" w:name="ref-tang2021qpca"/>
+    <w:bookmarkEnd w:id="71"/>
+    <w:bookmarkStart w:id="73" w:name="ref-tang2021qpca"/>
     <w:p>
       <w:pPr>
         <w:pStyle w:val="Bibliography"/>
@@ -13550,7 +14894,7 @@
         </w:rPr>
         <w:t xml:space="preserve"> </w:t>
       </w:r>
-      <w:hyperlink r:id="rId70">
+      <w:hyperlink r:id="rId72">
         <w:r>
           <w:rPr>
             <w:rStyle w:val="Hyperlink"/>
@@ -13565,8 +14909,8 @@
         <w:t xml:space="preserve">.</w:t>
       </w:r>
     </w:p>
-    <w:bookmarkEnd w:id="71"/>
-    <w:bookmarkStart w:id="73" w:name="ref-temme2017"/>
+    <w:bookmarkEnd w:id="73"/>
+    <w:bookmarkStart w:id="75" w:name="ref-temme2017"/>
     <w:p>
       <w:pPr>
         <w:pStyle w:val="Bibliography"/>
@@ -13621,7 +14965,7 @@
         </w:rPr>
         <w:t xml:space="preserve"> </w:t>
       </w:r>
-      <w:hyperlink r:id="rId72">
+      <w:hyperlink r:id="rId74">
         <w:r>
           <w:rPr>
             <w:rStyle w:val="Hyperlink"/>
@@ -13636,9 +14980,9 @@
         <w:t xml:space="preserve">.</w:t>
       </w:r>
     </w:p>
-    <w:bookmarkEnd w:id="73"/>
-    <w:bookmarkEnd w:id="74"/>
     <w:bookmarkEnd w:id="75"/>
+    <w:bookmarkEnd w:id="76"/>
+    <w:bookmarkEnd w:id="77"/>
     <w:sectPr/>
   </w:body>
 </w:document>

</xml_diff>

<commit_message>
Release 0.10.0: PCA spectra, Trotter simulation and quantum walks, interacting excitations (sections 146-148)
Version 0.10.0 in pyproject, __init__, CITATION.cff, .zenodo.json and the
Zenodo pack; CHANGELOG [0.10.0]; README 'What's new in 0.10'; the IBM paper
cites 0.10.0.

Co-Authored-By: Claude Opus 5.5 <noreply@anthropic.com>
Claude-Session: https://claude.ai/code/session_01VmfpwzVWvRWhRHG7VzpiEN
</commit_message>
<xml_diff>
--- a/manuscript/qang_ibm.docx
+++ b/manuscript/qang_ibm.docx
@@ -13779,19 +13779,7 @@
         <w:rPr>
           <w:rFonts w:ascii="Times New Roman" w:hAnsi="Times New Roman"/>
         </w:rPr>
-        <w:t xml:space="preserve">Everything is in the open-source library qang (MIT license), version 0.9.0 and later (the</w:t>
-      </w:r>
-      <w:r>
-        <w:rPr>
-          <w:rFonts w:ascii="Times New Roman" w:hAnsi="Times New Roman"/>
-        </w:rPr>
-        <w:t xml:space="preserve"> </w:t>
-      </w:r>
-      <w:r>
-        <w:rPr>
-          <w:rFonts w:ascii="Times New Roman" w:hAnsi="Times New Roman"/>
-        </w:rPr>
-        <w:t xml:space="preserve">functions of §146–§148 are in the repository and in the next release):</w:t>
+        <w:t xml:space="preserve">Everything is in the open-source library qang (MIT license), version 0.10.0 and later:</w:t>
       </w:r>
       <w:r>
         <w:rPr>

</xml_diff>

<commit_message>
IBM paper (EN and ES): section 149, swap test, inversion test and a fidelity classifier; Zenodo record updated
Co-Authored-By: Claude Opus 5.5 <noreply@anthropic.com>
Claude-Session: https://claude.ai/code/session_01VmfpwzVWvRWhRHG7VzpiEN
</commit_message>
<xml_diff>
--- a/manuscript/qang_ibm.docx
+++ b/manuscript/qang_ibm.docx
@@ -5168,6 +5168,472 @@
         <w:rPr>
           <w:rFonts w:ascii="Times New Roman" w:hAnsi="Times New Roman"/>
         </w:rPr>
+        <w:t xml:space="preserve">Estimating</w:t>
+      </w:r>
+      <w:r>
+        <w:rPr>
+          <w:rFonts w:ascii="Times New Roman" w:hAnsi="Times New Roman"/>
+        </w:rPr>
+        <w:t xml:space="preserve"> </w:t>
+      </w:r>
+      <w:r>
+        <w:rPr>
+          <w:rFonts w:ascii="Times New Roman" w:hAnsi="Times New Roman"/>
+        </w:rPr>
+        <w:t xml:space="preserve">the</w:t>
+      </w:r>
+      <w:r>
+        <w:rPr>
+          <w:rFonts w:ascii="Times New Roman" w:hAnsi="Times New Roman"/>
+        </w:rPr>
+        <w:t xml:space="preserve"> </w:t>
+      </w:r>
+      <w:r>
+        <w:rPr>
+          <w:rFonts w:ascii="Times New Roman" w:hAnsi="Times New Roman"/>
+        </w:rPr>
+        <w:t xml:space="preserve">fidelity</w:t>
+      </w:r>
+      <w:r>
+        <w:rPr>
+          <w:rFonts w:ascii="Times New Roman" w:hAnsi="Times New Roman"/>
+        </w:rPr>
+        <w:t xml:space="preserve"> </w:t>
+      </w:r>
+      <w:r>
+        <w:rPr>
+          <w:rFonts w:ascii="Times New Roman" w:hAnsi="Times New Roman"/>
+        </w:rPr>
+        <w:t xml:space="preserve">of</w:t>
+      </w:r>
+      <w:r>
+        <w:rPr>
+          <w:rFonts w:ascii="Times New Roman" w:hAnsi="Times New Roman"/>
+        </w:rPr>
+        <w:t xml:space="preserve"> </w:t>
+      </w:r>
+      <w:r>
+        <w:rPr>
+          <w:rFonts w:ascii="Times New Roman" w:hAnsi="Times New Roman"/>
+        </w:rPr>
+        <w:t xml:space="preserve">two</w:t>
+      </w:r>
+      <w:r>
+        <w:rPr>
+          <w:rFonts w:ascii="Times New Roman" w:hAnsi="Times New Roman"/>
+        </w:rPr>
+        <w:t xml:space="preserve"> </w:t>
+      </w:r>
+      <w:r>
+        <w:rPr>
+          <w:rFonts w:ascii="Times New Roman" w:hAnsi="Times New Roman"/>
+        </w:rPr>
+        <w:t xml:space="preserve">states,</w:t>
+      </w:r>
+      <w:r>
+        <w:rPr>
+          <w:rFonts w:ascii="Times New Roman" w:hAnsi="Times New Roman"/>
+        </w:rPr>
+        <w:t xml:space="preserve"> </w:t>
+      </w:r>
+      <w:r>
+        <w:rPr>
+          <w:rFonts w:ascii="Times New Roman" w:hAnsi="Times New Roman"/>
+        </w:rPr>
+        <w:t xml:space="preserve">the</w:t>
+      </w:r>
+      <w:r>
+        <w:rPr>
+          <w:rFonts w:ascii="Times New Roman" w:hAnsi="Times New Roman"/>
+        </w:rPr>
+        <w:t xml:space="preserve"> </w:t>
+      </w:r>
+      <w:r>
+        <w:rPr>
+          <w:rFonts w:ascii="Times New Roman" w:hAnsi="Times New Roman"/>
+        </w:rPr>
+        <w:t xml:space="preserve">filter</w:t>
+      </w:r>
+      <w:r>
+        <w:rPr>
+          <w:rFonts w:ascii="Times New Roman" w:hAnsi="Times New Roman"/>
+        </w:rPr>
+        <w:t xml:space="preserve"> </w:t>
+      </w:r>
+      <w:r>
+        <w:rPr>
+          <w:rFonts w:ascii="Times New Roman" w:hAnsi="Times New Roman"/>
+        </w:rPr>
+        <w:t xml:space="preserve">cuts</w:t>
+      </w:r>
+      <w:r>
+        <w:rPr>
+          <w:rFonts w:ascii="Times New Roman" w:hAnsi="Times New Roman"/>
+        </w:rPr>
+        <w:t xml:space="preserve"> </w:t>
+      </w:r>
+      <w:r>
+        <w:rPr>
+          <w:rFonts w:ascii="Times New Roman" w:hAnsi="Times New Roman"/>
+        </w:rPr>
+        <w:t xml:space="preserve">the</w:t>
+      </w:r>
+      <w:r>
+        <w:rPr>
+          <w:rFonts w:ascii="Times New Roman" w:hAnsi="Times New Roman"/>
+        </w:rPr>
+        <w:t xml:space="preserve"> </w:t>
+      </w:r>
+      <w:r>
+        <w:rPr>
+          <w:rFonts w:ascii="Times New Roman" w:hAnsi="Times New Roman"/>
+        </w:rPr>
+        <w:t xml:space="preserve">error</w:t>
+      </w:r>
+      <w:r>
+        <w:rPr>
+          <w:rFonts w:ascii="Times New Roman" w:hAnsi="Times New Roman"/>
+        </w:rPr>
+        <w:t xml:space="preserve"> </w:t>
+      </w:r>
+      <w:r>
+        <w:rPr>
+          <w:rFonts w:ascii="Times New Roman" w:hAnsi="Times New Roman"/>
+        </w:rPr>
+        <w:t xml:space="preserve">of</w:t>
+      </w:r>
+      <w:r>
+        <w:rPr>
+          <w:rFonts w:ascii="Times New Roman" w:hAnsi="Times New Roman"/>
+        </w:rPr>
+        <w:t xml:space="preserve"> </w:t>
+      </w:r>
+      <w:r>
+        <w:rPr>
+          <w:rFonts w:ascii="Times New Roman" w:hAnsi="Times New Roman"/>
+        </w:rPr>
+        <w:t xml:space="preserve">a</w:t>
+      </w:r>
+      <w:r>
+        <w:rPr>
+          <w:rFonts w:ascii="Times New Roman" w:hAnsi="Times New Roman"/>
+        </w:rPr>
+        <w:t xml:space="preserve"> </w:t>
+      </w:r>
+      <w:r>
+        <w:rPr>
+          <w:rFonts w:ascii="Times New Roman" w:hAnsi="Times New Roman"/>
+        </w:rPr>
+        <w:t xml:space="preserve">weight-preserving</w:t>
+      </w:r>
+      <w:r>
+        <w:rPr>
+          <w:rFonts w:ascii="Times New Roman" w:hAnsi="Times New Roman"/>
+        </w:rPr>
+        <w:t xml:space="preserve"> </w:t>
+      </w:r>
+      <w:r>
+        <w:rPr>
+          <w:rFonts w:ascii="Times New Roman" w:hAnsi="Times New Roman"/>
+        </w:rPr>
+        <w:t xml:space="preserve">inversion</w:t>
+      </w:r>
+      <w:r>
+        <w:rPr>
+          <w:rFonts w:ascii="Times New Roman" w:hAnsi="Times New Roman"/>
+        </w:rPr>
+        <w:t xml:space="preserve"> </w:t>
+      </w:r>
+      <w:r>
+        <w:rPr>
+          <w:rFonts w:ascii="Times New Roman" w:hAnsi="Times New Roman"/>
+        </w:rPr>
+        <w:t xml:space="preserve">test</w:t>
+      </w:r>
+      <w:r>
+        <w:rPr>
+          <w:rFonts w:ascii="Times New Roman" w:hAnsi="Times New Roman"/>
+        </w:rPr>
+        <w:t xml:space="preserve"> </w:t>
+      </w:r>
+      <w:r>
+        <w:rPr>
+          <w:rFonts w:ascii="Times New Roman" w:hAnsi="Times New Roman"/>
+        </w:rPr>
+        <w:t xml:space="preserve">3.8–11.2</w:t>
+      </w:r>
+      <m:oMath>
+        <m:r>
+          <m:rPr>
+            <m:sty m:val="p"/>
+          </m:rPr>
+          <m:t>×</m:t>
+        </m:r>
+      </m:oMath>
+      <w:r>
+        <w:rPr>
+          <w:rFonts w:ascii="Times New Roman" w:hAnsi="Times New Roman"/>
+        </w:rPr>
+        <w:t xml:space="preserve"> </w:t>
+      </w:r>
+      <w:r>
+        <w:rPr>
+          <w:rFonts w:ascii="Times New Roman" w:hAnsi="Times New Roman"/>
+        </w:rPr>
+        <w:t xml:space="preserve">but</w:t>
+      </w:r>
+      <w:r>
+        <w:rPr>
+          <w:rFonts w:ascii="Times New Roman" w:hAnsi="Times New Roman"/>
+        </w:rPr>
+        <w:t xml:space="preserve"> </w:t>
+      </w:r>
+      <w:r>
+        <w:rPr>
+          <w:rFonts w:ascii="Times New Roman" w:hAnsi="Times New Roman"/>
+        </w:rPr>
+        <w:t xml:space="preserve">that</w:t>
+      </w:r>
+      <w:r>
+        <w:rPr>
+          <w:rFonts w:ascii="Times New Roman" w:hAnsi="Times New Roman"/>
+        </w:rPr>
+        <w:t xml:space="preserve"> </w:t>
+      </w:r>
+      <w:r>
+        <w:rPr>
+          <w:rFonts w:ascii="Times New Roman" w:hAnsi="Times New Roman"/>
+        </w:rPr>
+        <w:t xml:space="preserve">of</w:t>
+      </w:r>
+      <w:r>
+        <w:rPr>
+          <w:rFonts w:ascii="Times New Roman" w:hAnsi="Times New Roman"/>
+        </w:rPr>
+        <w:t xml:space="preserve"> </w:t>
+      </w:r>
+      <w:r>
+        <w:rPr>
+          <w:rFonts w:ascii="Times New Roman" w:hAnsi="Times New Roman"/>
+        </w:rPr>
+        <w:t xml:space="preserve">the</w:t>
+      </w:r>
+      <w:r>
+        <w:rPr>
+          <w:rFonts w:ascii="Times New Roman" w:hAnsi="Times New Roman"/>
+        </w:rPr>
+        <w:t xml:space="preserve"> </w:t>
+      </w:r>
+      <w:r>
+        <w:rPr>
+          <w:rFonts w:ascii="Times New Roman" w:hAnsi="Times New Roman"/>
+        </w:rPr>
+        <w:t xml:space="preserve">swap</w:t>
+      </w:r>
+      <w:r>
+        <w:rPr>
+          <w:rFonts w:ascii="Times New Roman" w:hAnsi="Times New Roman"/>
+        </w:rPr>
+        <w:t xml:space="preserve"> </w:t>
+      </w:r>
+      <w:r>
+        <w:rPr>
+          <w:rFonts w:ascii="Times New Roman" w:hAnsi="Times New Roman"/>
+        </w:rPr>
+        <w:t xml:space="preserve">test</w:t>
+      </w:r>
+      <w:r>
+        <w:rPr>
+          <w:rFonts w:ascii="Times New Roman" w:hAnsi="Times New Roman"/>
+        </w:rPr>
+        <w:t xml:space="preserve"> </w:t>
+      </w:r>
+      <w:r>
+        <w:rPr>
+          <w:rFonts w:ascii="Times New Roman" w:hAnsi="Times New Roman"/>
+        </w:rPr>
+        <w:t xml:space="preserve">only</w:t>
+      </w:r>
+      <w:r>
+        <w:rPr>
+          <w:rFonts w:ascii="Times New Roman" w:hAnsi="Times New Roman"/>
+        </w:rPr>
+        <w:t xml:space="preserve"> </w:t>
+      </w:r>
+      <w:r>
+        <w:rPr>
+          <w:rFonts w:ascii="Times New Roman" w:hAnsi="Times New Roman"/>
+        </w:rPr>
+        <w:t xml:space="preserve">1.4–1.8</w:t>
+      </w:r>
+      <m:oMath>
+        <m:r>
+          <m:rPr>
+            <m:sty m:val="p"/>
+          </m:rPr>
+          <m:t>×</m:t>
+        </m:r>
+      </m:oMath>
+      <w:r>
+        <w:rPr>
+          <w:rFonts w:ascii="Times New Roman" w:hAnsi="Times New Roman"/>
+        </w:rPr>
+        <w:t xml:space="preserve">,</w:t>
+      </w:r>
+      <w:r>
+        <w:rPr>
+          <w:rFonts w:ascii="Times New Roman" w:hAnsi="Times New Roman"/>
+        </w:rPr>
+        <w:t xml:space="preserve"> </w:t>
+      </w:r>
+      <w:r>
+        <w:rPr>
+          <w:rFonts w:ascii="Times New Roman" w:hAnsi="Times New Roman"/>
+        </w:rPr>
+        <w:t xml:space="preserve">because</w:t>
+      </w:r>
+      <w:r>
+        <w:rPr>
+          <w:rFonts w:ascii="Times New Roman" w:hAnsi="Times New Roman"/>
+        </w:rPr>
+        <w:t xml:space="preserve"> </w:t>
+      </w:r>
+      <w:r>
+        <w:rPr>
+          <w:rFonts w:ascii="Times New Roman" w:hAnsi="Times New Roman"/>
+        </w:rPr>
+        <w:t xml:space="preserve">the</w:t>
+      </w:r>
+      <w:r>
+        <w:rPr>
+          <w:rFonts w:ascii="Times New Roman" w:hAnsi="Times New Roman"/>
+        </w:rPr>
+        <w:t xml:space="preserve"> </w:t>
+      </w:r>
+      <w:r>
+        <w:rPr>
+          <w:rFonts w:ascii="Times New Roman" w:hAnsi="Times New Roman"/>
+        </w:rPr>
+        <w:t xml:space="preserve">swap</w:t>
+      </w:r>
+      <w:r>
+        <w:rPr>
+          <w:rFonts w:ascii="Times New Roman" w:hAnsi="Times New Roman"/>
+        </w:rPr>
+        <w:t xml:space="preserve"> </w:t>
+      </w:r>
+      <w:r>
+        <w:rPr>
+          <w:rFonts w:ascii="Times New Roman" w:hAnsi="Times New Roman"/>
+        </w:rPr>
+        <w:t xml:space="preserve">test’s</w:t>
+      </w:r>
+      <w:r>
+        <w:rPr>
+          <w:rFonts w:ascii="Times New Roman" w:hAnsi="Times New Roman"/>
+        </w:rPr>
+        <w:t xml:space="preserve"> </w:t>
+      </w:r>
+      <w:r>
+        <w:rPr>
+          <w:rFonts w:ascii="Times New Roman" w:hAnsi="Times New Roman"/>
+        </w:rPr>
+        <w:t xml:space="preserve">answer</w:t>
+      </w:r>
+      <w:r>
+        <w:rPr>
+          <w:rFonts w:ascii="Times New Roman" w:hAnsi="Times New Roman"/>
+        </w:rPr>
+        <w:t xml:space="preserve"> </w:t>
+      </w:r>
+      <w:r>
+        <w:rPr>
+          <w:rFonts w:ascii="Times New Roman" w:hAnsi="Times New Roman"/>
+        </w:rPr>
+        <w:t xml:space="preserve">is</w:t>
+      </w:r>
+      <w:r>
+        <w:rPr>
+          <w:rFonts w:ascii="Times New Roman" w:hAnsi="Times New Roman"/>
+        </w:rPr>
+        <w:t xml:space="preserve"> </w:t>
+      </w:r>
+      <w:r>
+        <w:rPr>
+          <w:rFonts w:ascii="Times New Roman" w:hAnsi="Times New Roman"/>
+        </w:rPr>
+        <w:t xml:space="preserve">on</w:t>
+      </w:r>
+      <w:r>
+        <w:rPr>
+          <w:rFonts w:ascii="Times New Roman" w:hAnsi="Times New Roman"/>
+        </w:rPr>
+        <w:t xml:space="preserve"> </w:t>
+      </w:r>
+      <w:r>
+        <w:rPr>
+          <w:rFonts w:ascii="Times New Roman" w:hAnsi="Times New Roman"/>
+        </w:rPr>
+        <w:t xml:space="preserve">an</w:t>
+      </w:r>
+      <w:r>
+        <w:rPr>
+          <w:rFonts w:ascii="Times New Roman" w:hAnsi="Times New Roman"/>
+        </w:rPr>
+        <w:t xml:space="preserve"> </w:t>
+      </w:r>
+      <w:r>
+        <w:rPr>
+          <w:rFonts w:ascii="Times New Roman" w:hAnsi="Times New Roman"/>
+        </w:rPr>
+        <w:t xml:space="preserve">ancilla</w:t>
+      </w:r>
+      <w:r>
+        <w:rPr>
+          <w:rFonts w:ascii="Times New Roman" w:hAnsi="Times New Roman"/>
+        </w:rPr>
+        <w:t xml:space="preserve"> </w:t>
+      </w:r>
+      <w:r>
+        <w:rPr>
+          <w:rFonts w:ascii="Times New Roman" w:hAnsi="Times New Roman"/>
+        </w:rPr>
+        <w:t xml:space="preserve">outside</w:t>
+      </w:r>
+      <w:r>
+        <w:rPr>
+          <w:rFonts w:ascii="Times New Roman" w:hAnsi="Times New Roman"/>
+        </w:rPr>
+        <w:t xml:space="preserve"> </w:t>
+      </w:r>
+      <w:r>
+        <w:rPr>
+          <w:rFonts w:ascii="Times New Roman" w:hAnsi="Times New Roman"/>
+        </w:rPr>
+        <w:t xml:space="preserve">the</w:t>
+      </w:r>
+      <w:r>
+        <w:rPr>
+          <w:rFonts w:ascii="Times New Roman" w:hAnsi="Times New Roman"/>
+        </w:rPr>
+        <w:t xml:space="preserve"> </w:t>
+      </w:r>
+      <w:r>
+        <w:rPr>
+          <w:rFonts w:ascii="Times New Roman" w:hAnsi="Times New Roman"/>
+        </w:rPr>
+        <w:t xml:space="preserve">symmetry.</w:t>
+      </w:r>
+      <w:r>
+        <w:rPr>
+          <w:rFonts w:ascii="Times New Roman" w:hAnsi="Times New Roman"/>
+        </w:rPr>
+        <w:t xml:space="preserve"> </w:t>
+      </w:r>
+      <w:r>
+        <w:rPr>
+          <w:rFonts w:ascii="Times New Roman" w:hAnsi="Times New Roman"/>
+        </w:rPr>
         <w:t xml:space="preserve">Two</w:t>
       </w:r>
       <w:r>
@@ -5863,7 +6329,7 @@
         <w:rPr>
           <w:rFonts w:ascii="Times New Roman" w:hAnsi="Times New Roman"/>
         </w:rPr>
-        <w:t xml:space="preserve">§137–§148 refer to the research notes of the repository, where every number below is reproduced by a</w:t>
+        <w:t xml:space="preserve">§137–§149 refer to the research notes of the repository, where every number below is reproduced by a</w:t>
       </w:r>
       <w:r>
         <w:rPr>
@@ -5898,7 +6364,7 @@
       </w:r>
     </w:p>
     <w:bookmarkEnd w:id="20"/>
-    <w:bookmarkStart w:id="30" w:name="methods"/>
+    <w:bookmarkStart w:id="31" w:name="methods"/>
     <w:p>
       <w:pPr>
         <w:pStyle w:val="Heading1"/>
@@ -9519,7 +9985,524 @@
       </w:r>
     </w:p>
     <w:bookmarkEnd w:id="28"/>
-    <w:bookmarkStart w:id="29" w:name="test-circuits."/>
+    <w:bookmarkStart w:id="29" w:name="fidelity-of-two-states."/>
+    <w:p>
+      <w:pPr>
+        <w:pStyle w:val="Heading4"/>
+      </w:pPr>
+      <w:r>
+        <w:rPr>
+          <w:rFonts w:ascii="Times New Roman" w:hAnsi="Times New Roman"/>
+        </w:rPr>
+        <w:t xml:space="preserve">Fidelity of two states.</w:t>
+      </w:r>
+    </w:p>
+    <w:p>
+      <w:pPr>
+        <w:pStyle w:val="FirstParagraph"/>
+      </w:pPr>
+      <w:r>
+        <w:rPr>
+          <w:rFonts w:ascii="Times New Roman" w:hAnsi="Times New Roman"/>
+        </w:rPr>
+        <w:t xml:space="preserve">For unary states the fidelity</w:t>
+      </w:r>
+      <w:r>
+        <w:rPr>
+          <w:rFonts w:ascii="Times New Roman" w:hAnsi="Times New Roman"/>
+        </w:rPr>
+        <w:t xml:space="preserve"> </w:t>
+      </w:r>
+      <m:oMath>
+        <m:r>
+          <m:t>F</m:t>
+        </m:r>
+        <m:r>
+          <m:rPr>
+            <m:sty m:val="p"/>
+          </m:rPr>
+          <m:t>=</m:t>
+        </m:r>
+        <m:d>
+          <m:dPr>
+            <m:begChr m:val="|"/>
+            <m:endChr m:val="|"/>
+            <m:sepChr m:val=""/>
+            <m:grow/>
+          </m:dPr>
+          <m:e>
+            <m:r>
+              <m:rPr>
+                <m:sty m:val="p"/>
+              </m:rPr>
+              <m:t>⟨</m:t>
+            </m:r>
+            <m:r>
+              <m:t>x</m:t>
+            </m:r>
+          </m:e>
+        </m:d>
+        <m:r>
+          <m:t>y</m:t>
+        </m:r>
+        <m:r>
+          <m:rPr>
+            <m:sty m:val="p"/>
+          </m:rPr>
+          <m:t>⟩</m:t>
+        </m:r>
+        <m:sSup>
+          <m:e>
+            <m:r>
+              <m:rPr>
+                <m:sty m:val="p"/>
+              </m:rPr>
+              <m:t>|</m:t>
+            </m:r>
+          </m:e>
+          <m:sup>
+            <m:r>
+              <m:t>2</m:t>
+            </m:r>
+          </m:sup>
+        </m:sSup>
+      </m:oMath>
+      <w:r>
+        <w:rPr>
+          <w:rFonts w:ascii="Times New Roman" w:hAnsi="Times New Roman"/>
+        </w:rPr>
+        <w:t xml:space="preserve"> </w:t>
+      </w:r>
+      <w:r>
+        <w:rPr>
+          <w:rFonts w:ascii="Times New Roman" w:hAnsi="Times New Roman"/>
+        </w:rPr>
+        <w:t xml:space="preserve">is read by an</w:t>
+      </w:r>
+      <w:r>
+        <w:rPr>
+          <w:rFonts w:ascii="Times New Roman" w:hAnsi="Times New Roman"/>
+        </w:rPr>
+        <w:t xml:space="preserve"> </w:t>
+      </w:r>
+      <w:r>
+        <w:rPr>
+          <w:rFonts w:ascii="Times New Roman" w:hAnsi="Times New Roman"/>
+        </w:rPr>
+        <w:t xml:space="preserve">inversion test (</w:t>
+      </w:r>
+      <w:r>
+        <w:rPr>
+          <w:rStyle w:val="VerbatimChar"/>
+          <w:rFonts w:ascii="Times New Roman" w:hAnsi="Times New Roman"/>
+        </w:rPr>
+        <w:t xml:space="preserve">unary_overlap_circuit</w:t>
+      </w:r>
+      <w:r>
+        <w:rPr>
+          <w:rFonts w:ascii="Times New Roman" w:hAnsi="Times New Roman"/>
+        </w:rPr>
+        <w:t xml:space="preserve">: load</w:t>
+      </w:r>
+      <w:r>
+        <w:rPr>
+          <w:rFonts w:ascii="Times New Roman" w:hAnsi="Times New Roman"/>
+        </w:rPr>
+        <w:t xml:space="preserve"> </w:t>
+      </w:r>
+      <m:oMath>
+        <m:r>
+          <m:t>x</m:t>
+        </m:r>
+      </m:oMath>
+      <w:r>
+        <w:rPr>
+          <w:rFonts w:ascii="Times New Roman" w:hAnsi="Times New Roman"/>
+        </w:rPr>
+        <w:t xml:space="preserve">, undo the loader of</w:t>
+      </w:r>
+      <w:r>
+        <w:rPr>
+          <w:rFonts w:ascii="Times New Roman" w:hAnsi="Times New Roman"/>
+        </w:rPr>
+        <w:t xml:space="preserve"> </w:t>
+      </w:r>
+      <m:oMath>
+        <m:r>
+          <m:t>y</m:t>
+        </m:r>
+      </m:oMath>
+      <w:r>
+        <w:rPr>
+          <w:rFonts w:ascii="Times New Roman" w:hAnsi="Times New Roman"/>
+        </w:rPr>
+        <w:t xml:space="preserve">,</w:t>
+      </w:r>
+      <w:r>
+        <w:rPr>
+          <w:rFonts w:ascii="Times New Roman" w:hAnsi="Times New Roman"/>
+        </w:rPr>
+        <w:t xml:space="preserve"> </w:t>
+      </w:r>
+      <m:oMath>
+        <m:r>
+          <m:t>P</m:t>
+        </m:r>
+        <m:d>
+          <m:dPr>
+            <m:begChr m:val="("/>
+            <m:endChr m:val=")"/>
+            <m:sepChr m:val=""/>
+            <m:grow/>
+          </m:dPr>
+          <m:e>
+            <m:sSub>
+              <m:e>
+                <m:r>
+                  <m:t>e</m:t>
+                </m:r>
+              </m:e>
+              <m:sub>
+                <m:r>
+                  <m:t>0</m:t>
+                </m:r>
+              </m:sub>
+            </m:sSub>
+          </m:e>
+        </m:d>
+        <m:r>
+          <m:rPr>
+            <m:sty m:val="p"/>
+          </m:rPr>
+          <m:t>=</m:t>
+        </m:r>
+        <m:r>
+          <m:t>F</m:t>
+        </m:r>
+      </m:oMath>
+      <w:r>
+        <w:rPr>
+          <w:rFonts w:ascii="Times New Roman" w:hAnsi="Times New Roman"/>
+        </w:rPr>
+        <w:t xml:space="preserve">;</w:t>
+      </w:r>
+      <w:r>
+        <w:rPr>
+          <w:rFonts w:ascii="Times New Roman" w:hAnsi="Times New Roman"/>
+        </w:rPr>
+        <w:t xml:space="preserve"> </w:t>
+      </w:r>
+      <m:oMath>
+        <m:r>
+          <m:t>n</m:t>
+        </m:r>
+      </m:oMath>
+      <w:r>
+        <w:rPr>
+          <w:rFonts w:ascii="Times New Roman" w:hAnsi="Times New Roman"/>
+        </w:rPr>
+        <w:t xml:space="preserve"> </w:t>
+      </w:r>
+      <w:r>
+        <w:rPr>
+          <w:rFonts w:ascii="Times New Roman" w:hAnsi="Times New Roman"/>
+        </w:rPr>
+        <w:t xml:space="preserve">qubits, all</w:t>
+      </w:r>
+      <w:r>
+        <w:rPr>
+          <w:rFonts w:ascii="Times New Roman" w:hAnsi="Times New Roman"/>
+        </w:rPr>
+        <w:t xml:space="preserve"> </w:t>
+      </w:r>
+      <w:r>
+        <w:rPr>
+          <w:rFonts w:ascii="Times New Roman" w:hAnsi="Times New Roman"/>
+        </w:rPr>
+        <w:t xml:space="preserve">gates weight-preserving) or by the swap test </w:t>
+      </w:r>
+      <w:r>
+        <w:rPr>
+          <w:rFonts w:ascii="Times New Roman" w:hAnsi="Times New Roman"/>
+        </w:rPr>
+        <w:t xml:space="preserve">(</w:t>
+      </w:r>
+      <w:hyperlink w:anchor="ref-buhrman2001fingerprinting">
+        <w:r>
+          <w:rPr>
+            <w:rStyle w:val="Hyperlink"/>
+          </w:rPr>
+          <w:t xml:space="preserve">Buhrman et al. 2001</w:t>
+        </w:r>
+      </w:hyperlink>
+      <w:r>
+        <w:rPr>
+          <w:rFonts w:ascii="Times New Roman" w:hAnsi="Times New Roman"/>
+        </w:rPr>
+        <w:t xml:space="preserve">)</w:t>
+      </w:r>
+      <w:r>
+        <w:rPr>
+          <w:rFonts w:ascii="Times New Roman" w:hAnsi="Times New Roman"/>
+        </w:rPr>
+        <w:t xml:space="preserve"> </w:t>
+      </w:r>
+      <w:r>
+        <w:rPr>
+          <w:rFonts w:ascii="Times New Roman" w:hAnsi="Times New Roman"/>
+        </w:rPr>
+        <w:t xml:space="preserve">(</w:t>
+      </w:r>
+      <w:r>
+        <w:rPr>
+          <w:rStyle w:val="VerbatimChar"/>
+          <w:rFonts w:ascii="Times New Roman" w:hAnsi="Times New Roman"/>
+        </w:rPr>
+        <w:t xml:space="preserve">swap_test_circuit</w:t>
+      </w:r>
+      <w:r>
+        <w:rPr>
+          <w:rFonts w:ascii="Times New Roman" w:hAnsi="Times New Roman"/>
+        </w:rPr>
+        <w:t xml:space="preserve">: an</w:t>
+      </w:r>
+      <w:r>
+        <w:rPr>
+          <w:rFonts w:ascii="Times New Roman" w:hAnsi="Times New Roman"/>
+        </w:rPr>
+        <w:t xml:space="preserve"> </w:t>
+      </w:r>
+      <w:r>
+        <w:rPr>
+          <w:rFonts w:ascii="Times New Roman" w:hAnsi="Times New Roman"/>
+        </w:rPr>
+        <w:t xml:space="preserve">ancilla in</w:t>
+      </w:r>
+      <w:r>
+        <w:rPr>
+          <w:rFonts w:ascii="Times New Roman" w:hAnsi="Times New Roman"/>
+        </w:rPr>
+        <w:t xml:space="preserve"> </w:t>
+      </w:r>
+      <m:oMath>
+        <m:r>
+          <m:rPr>
+            <m:sty m:val="p"/>
+          </m:rPr>
+          <m:t>|</m:t>
+        </m:r>
+        <m:r>
+          <m:rPr>
+            <m:sty m:val="p"/>
+          </m:rPr>
+          <m:t>+</m:t>
+        </m:r>
+        <m:r>
+          <m:rPr>
+            <m:sty m:val="p"/>
+          </m:rPr>
+          <m:t>⟩</m:t>
+        </m:r>
+      </m:oMath>
+      <w:r>
+        <w:rPr>
+          <w:rFonts w:ascii="Times New Roman" w:hAnsi="Times New Roman"/>
+        </w:rPr>
+        <w:t xml:space="preserve">,</w:t>
+      </w:r>
+      <w:r>
+        <w:rPr>
+          <w:rFonts w:ascii="Times New Roman" w:hAnsi="Times New Roman"/>
+        </w:rPr>
+        <w:t xml:space="preserve"> </w:t>
+      </w:r>
+      <m:oMath>
+        <m:r>
+          <m:t>x</m:t>
+        </m:r>
+      </m:oMath>
+      <w:r>
+        <w:rPr>
+          <w:rFonts w:ascii="Times New Roman" w:hAnsi="Times New Roman"/>
+        </w:rPr>
+        <w:t xml:space="preserve"> </w:t>
+      </w:r>
+      <w:r>
+        <w:rPr>
+          <w:rFonts w:ascii="Times New Roman" w:hAnsi="Times New Roman"/>
+        </w:rPr>
+        <w:t xml:space="preserve">and</w:t>
+      </w:r>
+      <w:r>
+        <w:rPr>
+          <w:rFonts w:ascii="Times New Roman" w:hAnsi="Times New Roman"/>
+        </w:rPr>
+        <w:t xml:space="preserve"> </w:t>
+      </w:r>
+      <m:oMath>
+        <m:r>
+          <m:t>y</m:t>
+        </m:r>
+      </m:oMath>
+      <w:r>
+        <w:rPr>
+          <w:rFonts w:ascii="Times New Roman" w:hAnsi="Times New Roman"/>
+        </w:rPr>
+        <w:t xml:space="preserve"> </w:t>
+      </w:r>
+      <w:r>
+        <w:rPr>
+          <w:rFonts w:ascii="Times New Roman" w:hAnsi="Times New Roman"/>
+        </w:rPr>
+        <w:t xml:space="preserve">on two registers,</w:t>
+      </w:r>
+      <w:r>
+        <w:rPr>
+          <w:rFonts w:ascii="Times New Roman" w:hAnsi="Times New Roman"/>
+        </w:rPr>
+        <w:t xml:space="preserve"> </w:t>
+      </w:r>
+      <m:oMath>
+        <m:r>
+          <m:t>n</m:t>
+        </m:r>
+      </m:oMath>
+      <w:r>
+        <w:rPr>
+          <w:rFonts w:ascii="Times New Roman" w:hAnsi="Times New Roman"/>
+        </w:rPr>
+        <w:t xml:space="preserve"> </w:t>
+      </w:r>
+      <w:r>
+        <w:rPr>
+          <w:rFonts w:ascii="Times New Roman" w:hAnsi="Times New Roman"/>
+        </w:rPr>
+        <w:t xml:space="preserve">controlled SWAPs,</w:t>
+      </w:r>
+      <w:r>
+        <w:rPr>
+          <w:rFonts w:ascii="Times New Roman" w:hAnsi="Times New Roman"/>
+        </w:rPr>
+        <w:t xml:space="preserve"> </w:t>
+      </w:r>
+      <m:oMath>
+        <m:r>
+          <m:t>P</m:t>
+        </m:r>
+        <m:d>
+          <m:dPr>
+            <m:begChr m:val="("/>
+            <m:endChr m:val=")"/>
+            <m:sepChr m:val=""/>
+            <m:grow/>
+          </m:dPr>
+          <m:e>
+            <m:r>
+              <m:rPr>
+                <m:nor/>
+                <m:sty m:val="p"/>
+              </m:rPr>
+              <m:t>ancilla </m:t>
+            </m:r>
+            <m:r>
+              <m:t>0</m:t>
+            </m:r>
+          </m:e>
+        </m:d>
+        <m:r>
+          <m:rPr>
+            <m:sty m:val="p"/>
+          </m:rPr>
+          <m:t>=</m:t>
+        </m:r>
+        <m:d>
+          <m:dPr>
+            <m:begChr m:val="("/>
+            <m:endChr m:val=")"/>
+            <m:sepChr m:val=""/>
+            <m:grow/>
+          </m:dPr>
+          <m:e>
+            <m:r>
+              <m:t>1</m:t>
+            </m:r>
+            <m:r>
+              <m:rPr>
+                <m:sty m:val="p"/>
+              </m:rPr>
+              <m:t>+</m:t>
+            </m:r>
+            <m:r>
+              <m:t>F</m:t>
+            </m:r>
+          </m:e>
+        </m:d>
+        <m:r>
+          <m:rPr>
+            <m:sty m:val="p"/>
+          </m:rPr>
+          <m:t>/</m:t>
+        </m:r>
+        <m:r>
+          <m:t>2</m:t>
+        </m:r>
+      </m:oMath>
+      <w:r>
+        <w:rPr>
+          <w:rFonts w:ascii="Times New Roman" w:hAnsi="Times New Roman"/>
+        </w:rPr>
+        <w:t xml:space="preserve">;</w:t>
+      </w:r>
+      <w:r>
+        <w:rPr>
+          <w:rFonts w:ascii="Times New Roman" w:hAnsi="Times New Roman"/>
+        </w:rPr>
+        <w:t xml:space="preserve"> </w:t>
+      </w:r>
+      <m:oMath>
+        <m:r>
+          <m:t>2</m:t>
+        </m:r>
+        <m:r>
+          <m:t>n</m:t>
+        </m:r>
+        <m:r>
+          <m:rPr>
+            <m:sty m:val="p"/>
+          </m:rPr>
+          <m:t>+</m:t>
+        </m:r>
+        <m:r>
+          <m:t>1</m:t>
+        </m:r>
+      </m:oMath>
+      <w:r>
+        <w:rPr>
+          <w:rFonts w:ascii="Times New Roman" w:hAnsi="Times New Roman"/>
+        </w:rPr>
+        <w:t xml:space="preserve"> </w:t>
+      </w:r>
+      <w:r>
+        <w:rPr>
+          <w:rFonts w:ascii="Times New Roman" w:hAnsi="Times New Roman"/>
+        </w:rPr>
+        <w:t xml:space="preserve">qubits). The controlled SWAPs conserve the total weight of the data registers, so the filter keeps</w:t>
+      </w:r>
+      <w:r>
+        <w:rPr>
+          <w:rFonts w:ascii="Times New Roman" w:hAnsi="Times New Roman"/>
+        </w:rPr>
+        <w:t xml:space="preserve"> </w:t>
+      </w:r>
+      <w:r>
+        <w:rPr>
+          <w:rFonts w:ascii="Times New Roman" w:hAnsi="Times New Roman"/>
+        </w:rPr>
+        <w:t xml:space="preserve">the shots where they hold weight 2; the ancilla is outside the symmetry.</w:t>
+      </w:r>
+    </w:p>
+    <w:bookmarkEnd w:id="29"/>
+    <w:bookmarkStart w:id="30" w:name="test-circuits."/>
     <w:p>
       <w:pPr>
         <w:pStyle w:val="Heading4"/>
@@ -9682,9 +10665,9 @@
         <w:t xml:space="preserve">over qubits and circuits. Transpilation uses optimization level 1 and seed 137.</w:t>
       </w:r>
     </w:p>
-    <w:bookmarkEnd w:id="29"/>
     <w:bookmarkEnd w:id="30"/>
-    <w:bookmarkStart w:id="48" w:name="results"/>
+    <w:bookmarkEnd w:id="31"/>
+    <w:bookmarkStart w:id="50" w:name="results"/>
     <w:p>
       <w:pPr>
         <w:pStyle w:val="Heading1"/>
@@ -9696,7 +10679,7 @@
         <w:t xml:space="preserve">Results</w:t>
       </w:r>
     </w:p>
-    <w:bookmarkStart w:id="32" w:name="read-out-on-three-devices-137-142"/>
+    <w:bookmarkStart w:id="33" w:name="read-out-on-three-devices-137-142"/>
     <w:p>
       <w:pPr>
         <w:pStyle w:val="Heading2"/>
@@ -9708,7 +10691,7 @@
         <w:t xml:space="preserve">Read-out on three devices (§137, §142)</w:t>
       </w:r>
     </w:p>
-    <w:bookmarkStart w:id="31" w:name="tab:three"/>
+    <w:bookmarkStart w:id="32" w:name="tab:three"/>
     <w:p>
       <w:pPr>
         <w:pStyle w:val="TableCaption"/>
@@ -10134,7 +11117,7 @@
         </w:tc>
       </w:tr>
     </w:tbl>
-    <w:bookmarkEnd w:id="31"/>
+    <w:bookmarkEnd w:id="32"/>
     <w:p>
       <w:pPr>
         <w:pStyle w:val="BodyText"/>
@@ -10240,8 +11223,8 @@
         <w:t xml:space="preserve">combination was filter + ZNE on two devices and filter + read-out on Torino (so both of those predictions failed).</w:t>
       </w:r>
     </w:p>
-    <w:bookmarkEnd w:id="32"/>
-    <w:bookmarkStart w:id="36" w:name="twenty-devices-144"/>
+    <w:bookmarkEnd w:id="33"/>
+    <w:bookmarkStart w:id="37" w:name="twenty-devices-144"/>
     <w:p>
       <w:pPr>
         <w:pStyle w:val="Heading2"/>
@@ -10266,18 +11249,18 @@
           <wp:inline>
             <wp:extent cx="4800600" cy="4336025"/>
             <wp:effectExtent b="0" l="0" r="0" t="0"/>
-            <wp:docPr descr="" title="" id="34" name="Picture"/>
+            <wp:docPr descr="" title="" id="35" name="Picture"/>
             <a:graphic>
               <a:graphicData uri="http://schemas.openxmlformats.org/drawingml/2006/picture">
                 <pic:pic>
                   <pic:nvPicPr>
-                    <pic:cNvPr descr="fig_fleet.png" id="35" name="Picture"/>
+                    <pic:cNvPr descr="fig_fleet.png" id="36" name="Picture"/>
                     <pic:cNvPicPr>
                       <a:picLocks noChangeArrowheads="1" noChangeAspect="1"/>
                     </pic:cNvPicPr>
                   </pic:nvPicPr>
                   <pic:blipFill>
-                    <a:blip r:embed="rId33"/>
+                    <a:blip r:embed="rId34"/>
                     <a:stretch>
                       <a:fillRect/>
                     </a:stretch>
@@ -10522,8 +11505,8 @@
         <w:t xml:space="preserve">filtered error from 0.098 to 0.021 (exploratory).</w:t>
       </w:r>
     </w:p>
-    <w:bookmarkEnd w:id="36"/>
-    <w:bookmarkStart w:id="37" w:name="X65a55fb3e65eb3767af4294710aef69a3875982"/>
+    <w:bookmarkEnd w:id="37"/>
+    <w:bookmarkStart w:id="38" w:name="X65a55fb3e65eb3767af4294710aef69a3875982"/>
     <w:p>
       <w:pPr>
         <w:pStyle w:val="Heading2"/>
@@ -10681,8 +11664,8 @@
         <w:t xml:space="preserve">three predictions passed).</w:t>
       </w:r>
     </w:p>
-    <w:bookmarkEnd w:id="37"/>
-    <w:bookmarkStart w:id="38" w:name="shot-planning-143"/>
+    <w:bookmarkEnd w:id="38"/>
+    <w:bookmarkStart w:id="39" w:name="shot-planning-143"/>
     <w:p>
       <w:pPr>
         <w:pStyle w:val="Heading2"/>
@@ -10863,8 +11846,8 @@
         <w:t xml:space="preserve">; the plan is set by the worst qubit and still met the target.</w:t>
       </w:r>
     </w:p>
-    <w:bookmarkEnd w:id="38"/>
-    <w:bookmarkStart w:id="40" w:name="the-qnn-139141"/>
+    <w:bookmarkEnd w:id="39"/>
+    <w:bookmarkStart w:id="41" w:name="the-qnn-139141"/>
     <w:p>
       <w:pPr>
         <w:pStyle w:val="Heading2"/>
@@ -10876,7 +11859,7 @@
         <w:t xml:space="preserve">The QNN (§139–§141)</w:t>
       </w:r>
     </w:p>
-    <w:bookmarkStart w:id="39" w:name="tab:qnn"/>
+    <w:bookmarkStart w:id="40" w:name="tab:qnn"/>
     <w:p>
       <w:pPr>
         <w:pStyle w:val="TableCaption"/>
@@ -11216,7 +12199,7 @@
         </w:tc>
       </w:tr>
     </w:tbl>
-    <w:bookmarkEnd w:id="39"/>
+    <w:bookmarkEnd w:id="40"/>
     <w:p>
       <w:pPr>
         <w:pStyle w:val="BodyText"/>
@@ -11408,8 +12391,8 @@
         <w:t xml:space="preserve">issue was reported upstream.</w:t>
       </w:r>
     </w:p>
-    <w:bookmarkEnd w:id="40"/>
-    <w:bookmarkStart w:id="41" w:name="a-pca-spectrum-146"/>
+    <w:bookmarkEnd w:id="41"/>
+    <w:bookmarkStart w:id="42" w:name="a-pca-spectrum-146"/>
     <w:p>
       <w:pPr>
         <w:pStyle w:val="Heading2"/>
@@ -11932,8 +12915,8 @@
         <w:t xml:space="preserve">experiment makes no claim on it.</w:t>
       </w:r>
     </w:p>
-    <w:bookmarkEnd w:id="41"/>
-    <w:bookmarkStart w:id="45" w:name="X03c72f5e8247cfdd082e31dcd37cd01bcafba1a"/>
+    <w:bookmarkEnd w:id="42"/>
+    <w:bookmarkStart w:id="46" w:name="X03c72f5e8247cfdd082e31dcd37cd01bcafba1a"/>
     <w:p>
       <w:pPr>
         <w:pStyle w:val="Heading2"/>
@@ -11958,18 +12941,18 @@
           <wp:inline>
             <wp:extent cx="4800600" cy="1878495"/>
             <wp:effectExtent b="0" l="0" r="0" t="0"/>
-            <wp:docPr descr="" title="" id="43" name="Picture"/>
+            <wp:docPr descr="" title="" id="44" name="Picture"/>
             <a:graphic>
               <a:graphicData uri="http://schemas.openxmlformats.org/drawingml/2006/picture">
                 <pic:pic>
                   <pic:nvPicPr>
-                    <pic:cNvPr descr="fig_trotter.png" id="44" name="Picture"/>
+                    <pic:cNvPr descr="fig_trotter.png" id="45" name="Picture"/>
                     <pic:cNvPicPr>
                       <a:picLocks noChangeArrowheads="1" noChangeAspect="1"/>
                     </pic:cNvPicPr>
                   </pic:nvPicPr>
                   <pic:blipFill>
-                    <a:blip r:embed="rId42"/>
+                    <a:blip r:embed="rId43"/>
                     <a:stretch>
                       <a:fillRect/>
                     </a:stretch>
@@ -12791,8 +13774,8 @@
         <w:t xml:space="preserve">after FakeKyoto give 1.26–1.38, and on FakeKyoto (15% of shots kept at 96 gates) the walk is lost.</w:t>
       </w:r>
     </w:p>
-    <w:bookmarkEnd w:id="45"/>
-    <w:bookmarkStart w:id="47" w:name="interacting-excitations-148"/>
+    <w:bookmarkEnd w:id="46"/>
+    <w:bookmarkStart w:id="48" w:name="interacting-excitations-148"/>
     <w:p>
       <w:pPr>
         <w:pStyle w:val="Heading2"/>
@@ -12804,7 +13787,7 @@
         <w:t xml:space="preserve">Interacting excitations (§148)</w:t>
       </w:r>
     </w:p>
-    <w:bookmarkStart w:id="46" w:name="tab:xxz"/>
+    <w:bookmarkStart w:id="47" w:name="tab:xxz"/>
     <w:p>
       <w:pPr>
         <w:pStyle w:val="TableCaption"/>
@@ -13231,7 +14214,7 @@
         </w:tc>
       </w:tr>
     </w:tbl>
-    <w:bookmarkEnd w:id="46"/>
+    <w:bookmarkEnd w:id="47"/>
     <w:p>
       <w:pPr>
         <w:pStyle w:val="BodyText"/>
@@ -13529,18 +14512,17 @@
         <w:t xml:space="preserve">preparation when it is the first operation on its qubit.</w:t>
       </w:r>
     </w:p>
-    <w:bookmarkEnd w:id="47"/>
     <w:bookmarkEnd w:id="48"/>
-    <w:bookmarkStart w:id="49" w:name="discussion"/>
+    <w:bookmarkStart w:id="49" w:name="Xfeb0e248cb674cd3fec49251bf3e7e162c1f062"/>
     <w:p>
       <w:pPr>
-        <w:pStyle w:val="Heading1"/>
+        <w:pStyle w:val="Heading2"/>
       </w:pPr>
       <w:r>
         <w:rPr>
           <w:rFonts w:ascii="Times New Roman" w:hAnsi="Times New Roman"/>
         </w:rPr>
-        <w:t xml:space="preserve">Discussion</w:t>
+        <w:t xml:space="preserve">Swap test, inversion test and a fidelity classifier (§149)</w:t>
       </w:r>
     </w:p>
     <w:p>
@@ -13551,6 +14533,361 @@
         <w:rPr>
           <w:rFonts w:ascii="Times New Roman" w:hAnsi="Times New Roman"/>
         </w:rPr>
+        <w:t xml:space="preserve">Five-qubit embeddings</w:t>
+      </w:r>
+      <w:r>
+        <w:rPr>
+          <w:rFonts w:ascii="Times New Roman" w:hAnsi="Times New Roman"/>
+        </w:rPr>
+        <w:t xml:space="preserve"> </w:t>
+      </w:r>
+      <m:oMath>
+        <m:r>
+          <m:t>v</m:t>
+        </m:r>
+        <m:r>
+          <m:rPr>
+            <m:sty m:val="p"/>
+          </m:rPr>
+          <m:t>=</m:t>
+        </m:r>
+        <m:d>
+          <m:dPr>
+            <m:begChr m:val="("/>
+            <m:endChr m:val=")"/>
+            <m:sepChr m:val=""/>
+            <m:grow/>
+          </m:dPr>
+          <m:e>
+            <m:r>
+              <m:t>z</m:t>
+            </m:r>
+            <m:r>
+              <m:rPr>
+                <m:sty m:val="p"/>
+              </m:rPr>
+              <m:t>,</m:t>
+            </m:r>
+            <m:r>
+              <m:t>1</m:t>
+            </m:r>
+          </m:e>
+        </m:d>
+        <m:r>
+          <m:rPr>
+            <m:sty m:val="p"/>
+          </m:rPr>
+          <m:t>/</m:t>
+        </m:r>
+        <m:d>
+          <m:dPr>
+            <m:begChr m:val="|"/>
+            <m:endChr m:val="|"/>
+            <m:sepChr m:val=""/>
+            <m:grow/>
+          </m:dPr>
+          <m:e>
+            <m:d>
+              <m:dPr>
+                <m:begChr m:val="("/>
+                <m:endChr m:val=")"/>
+                <m:sepChr m:val=""/>
+                <m:grow/>
+              </m:dPr>
+              <m:e>
+                <m:r>
+                  <m:t>z</m:t>
+                </m:r>
+                <m:r>
+                  <m:rPr>
+                    <m:sty m:val="p"/>
+                  </m:rPr>
+                  <m:t>,</m:t>
+                </m:r>
+                <m:r>
+                  <m:t>1</m:t>
+                </m:r>
+              </m:e>
+            </m:d>
+          </m:e>
+        </m:d>
+      </m:oMath>
+      <w:r>
+        <w:rPr>
+          <w:rFonts w:ascii="Times New Roman" w:hAnsi="Times New Roman"/>
+        </w:rPr>
+        <w:t xml:space="preserve"> </w:t>
+      </w:r>
+      <w:r>
+        <w:rPr>
+          <w:rFonts w:ascii="Times New Roman" w:hAnsi="Times New Roman"/>
+        </w:rPr>
+        <w:t xml:space="preserve">of iris versicolor and virginica (</w:t>
+      </w:r>
+      <m:oMath>
+        <m:r>
+          <m:t>z</m:t>
+        </m:r>
+      </m:oMath>
+      <w:r>
+        <w:rPr>
+          <w:rFonts w:ascii="Times New Roman" w:hAnsi="Times New Roman"/>
+        </w:rPr>
+        <w:t xml:space="preserve">: four standardized features;</w:t>
+      </w:r>
+      <w:r>
+        <w:rPr>
+          <w:rFonts w:ascii="Times New Roman" w:hAnsi="Times New Roman"/>
+        </w:rPr>
+        <w:t xml:space="preserve"> </w:t>
+      </w:r>
+      <w:r>
+        <w:rPr>
+          <w:rFonts w:ascii="Times New Roman" w:hAnsi="Times New Roman"/>
+        </w:rPr>
+        <w:t xml:space="preserve">15 training and 20 test flowers per class); a test flower goes to the class whose prototype (normalized mean</w:t>
+      </w:r>
+      <w:r>
+        <w:rPr>
+          <w:rFonts w:ascii="Times New Roman" w:hAnsi="Times New Roman"/>
+        </w:rPr>
+        <w:t xml:space="preserve"> </w:t>
+      </w:r>
+      <w:r>
+        <w:rPr>
+          <w:rFonts w:ascii="Times New Roman" w:hAnsi="Times New Roman"/>
+        </w:rPr>
+        <w:t xml:space="preserve">training embedding) has the larger fidelity, as in </w:t>
+      </w:r>
+      <w:r>
+        <w:rPr>
+          <w:rFonts w:ascii="Times New Roman" w:hAnsi="Times New Roman"/>
+        </w:rPr>
+        <w:t xml:space="preserve">(</w:t>
+      </w:r>
+      <w:hyperlink w:anchor="ref-blank2020kernel">
+        <w:r>
+          <w:rPr>
+            <w:rStyle w:val="Hyperlink"/>
+          </w:rPr>
+          <w:t xml:space="preserve">Blank et al. 2020</w:t>
+        </w:r>
+      </w:hyperlink>
+      <w:r>
+        <w:rPr>
+          <w:rFonts w:ascii="Times New Roman" w:hAnsi="Times New Roman"/>
+        </w:rPr>
+        <w:t xml:space="preserve">)</w:t>
+      </w:r>
+      <w:r>
+        <w:rPr>
+          <w:rFonts w:ascii="Times New Roman" w:hAnsi="Times New Roman"/>
+        </w:rPr>
+        <w:t xml:space="preserve">; 37 of 40 noiselessly. Each test</w:t>
+      </w:r>
+      <w:r>
+        <w:rPr>
+          <w:rFonts w:ascii="Times New Roman" w:hAnsi="Times New Roman"/>
+        </w:rPr>
+        <w:t xml:space="preserve"> </w:t>
+      </w:r>
+      <w:r>
+        <w:rPr>
+          <w:rFonts w:ascii="Times New Roman" w:hAnsi="Times New Roman"/>
+        </w:rPr>
+        <w:t xml:space="preserve">estimated 90 fidelities (80 for the classifier, 10 of a state with itself) on six devices, 2000 shots. All</w:t>
+      </w:r>
+      <w:r>
+        <w:rPr>
+          <w:rFonts w:ascii="Times New Roman" w:hAnsi="Times New Roman"/>
+        </w:rPr>
+        <w:t xml:space="preserve"> </w:t>
+      </w:r>
+      <w:r>
+        <w:rPr>
+          <w:rFonts w:ascii="Times New Roman" w:hAnsi="Times New Roman"/>
+        </w:rPr>
+        <w:t xml:space="preserve">five predictions passed. The inversion test (12–16 native two-qubit gates) with filter + read-out reaches a</w:t>
+      </w:r>
+      <w:r>
+        <w:rPr>
+          <w:rFonts w:ascii="Times New Roman" w:hAnsi="Times New Roman"/>
+        </w:rPr>
+        <w:t xml:space="preserve"> </w:t>
+      </w:r>
+      <w:r>
+        <w:rPr>
+          <w:rFonts w:ascii="Times New Roman" w:hAnsi="Times New Roman"/>
+        </w:rPr>
+        <w:t xml:space="preserve">mean error of 0.010–0.036, 3.8–11.2</w:t>
+      </w:r>
+      <m:oMath>
+        <m:r>
+          <m:rPr>
+            <m:sty m:val="p"/>
+          </m:rPr>
+          <m:t>×</m:t>
+        </m:r>
+      </m:oMath>
+      <w:r>
+        <w:rPr>
+          <w:rFonts w:ascii="Times New Roman" w:hAnsi="Times New Roman"/>
+        </w:rPr>
+        <w:t xml:space="preserve"> </w:t>
+      </w:r>
+      <w:r>
+        <w:rPr>
+          <w:rFonts w:ascii="Times New Roman" w:hAnsi="Times New Roman"/>
+        </w:rPr>
+        <w:t xml:space="preserve">below raw; the swap test (113–119 gates) reaches only</w:t>
+      </w:r>
+      <w:r>
+        <w:rPr>
+          <w:rFonts w:ascii="Times New Roman" w:hAnsi="Times New Roman"/>
+        </w:rPr>
+        <w:t xml:space="preserve"> </w:t>
+      </w:r>
+      <w:r>
+        <w:rPr>
+          <w:rFonts w:ascii="Times New Roman" w:hAnsi="Times New Roman"/>
+        </w:rPr>
+        <w:t xml:space="preserve">0.089–0.239, 1.4–1.8</w:t>
+      </w:r>
+      <m:oMath>
+        <m:r>
+          <m:rPr>
+            <m:sty m:val="p"/>
+          </m:rPr>
+          <m:t>×</m:t>
+        </m:r>
+      </m:oMath>
+      <w:r>
+        <w:rPr>
+          <w:rFonts w:ascii="Times New Roman" w:hAnsi="Times New Roman"/>
+        </w:rPr>
+        <w:t xml:space="preserve"> </w:t>
+      </w:r>
+      <w:r>
+        <w:rPr>
+          <w:rFonts w:ascii="Times New Roman" w:hAnsi="Times New Roman"/>
+        </w:rPr>
+        <w:t xml:space="preserve">below raw: its answer is on the ancilla, which the filter cannot protect. The</w:t>
+      </w:r>
+      <w:r>
+        <w:rPr>
+          <w:rFonts w:ascii="Times New Roman" w:hAnsi="Times New Roman"/>
+        </w:rPr>
+        <w:t xml:space="preserve"> </w:t>
+      </w:r>
+      <w:r>
+        <w:rPr>
+          <w:rFonts w:ascii="Times New Roman" w:hAnsi="Times New Roman"/>
+        </w:rPr>
+        <w:t xml:space="preserve">classifier keeps its noiseless score with the filtered inversion test on every device, and the raw swap test</w:t>
+      </w:r>
+      <w:r>
+        <w:rPr>
+          <w:rFonts w:ascii="Times New Roman" w:hAnsi="Times New Roman"/>
+        </w:rPr>
+        <w:t xml:space="preserve"> </w:t>
+      </w:r>
+      <w:r>
+        <w:rPr>
+          <w:rFonts w:ascii="Times New Roman" w:hAnsi="Times New Roman"/>
+        </w:rPr>
+        <w:t xml:space="preserve">scores 36–38: noise shrinks both fidelities of a flower alike, so their comparison survives. The absolute</w:t>
+      </w:r>
+      <w:r>
+        <w:rPr>
+          <w:rFonts w:ascii="Times New Roman" w:hAnsi="Times New Roman"/>
+        </w:rPr>
+        <w:t xml:space="preserve"> </w:t>
+      </w:r>
+      <w:r>
+        <w:rPr>
+          <w:rFonts w:ascii="Times New Roman" w:hAnsi="Times New Roman"/>
+        </w:rPr>
+        <w:t xml:space="preserve">value does not: for a state compared with itself (</w:t>
+      </w:r>
+      <m:oMath>
+        <m:r>
+          <m:t>F</m:t>
+        </m:r>
+        <m:r>
+          <m:rPr>
+            <m:sty m:val="p"/>
+          </m:rPr>
+          <m:t>=</m:t>
+        </m:r>
+        <m:r>
+          <m:t>1</m:t>
+        </m:r>
+      </m:oMath>
+      <w:r>
+        <w:rPr>
+          <w:rFonts w:ascii="Times New Roman" w:hAnsi="Times New Roman"/>
+        </w:rPr>
+        <w:t xml:space="preserve">) the raw swap test reads 0.20–0.65 and the</w:t>
+      </w:r>
+      <w:r>
+        <w:rPr>
+          <w:rFonts w:ascii="Times New Roman" w:hAnsi="Times New Roman"/>
+        </w:rPr>
+        <w:t xml:space="preserve"> </w:t>
+      </w:r>
+      <w:r>
+        <w:rPr>
+          <w:rFonts w:ascii="Times New Roman" w:hAnsi="Times New Roman"/>
+        </w:rPr>
+        <w:t xml:space="preserve">filtered inversion test 0.92–1.00, which is what a test of equality needs. The run was split into one</w:t>
+      </w:r>
+      <w:r>
+        <w:rPr>
+          <w:rFonts w:ascii="Times New Roman" w:hAnsi="Times New Roman"/>
+        </w:rPr>
+        <w:t xml:space="preserve"> </w:t>
+      </w:r>
+      <w:r>
+        <w:rPr>
+          <w:rFonts w:ascii="Times New Roman" w:hAnsi="Times New Roman"/>
+        </w:rPr>
+        <w:t xml:space="preserve">process per device after a single run exceeded the 2-hour limit of the environment, before any result was</w:t>
+      </w:r>
+      <w:r>
+        <w:rPr>
+          <w:rFonts w:ascii="Times New Roman" w:hAnsi="Times New Roman"/>
+        </w:rPr>
+        <w:t xml:space="preserve"> </w:t>
+      </w:r>
+      <w:r>
+        <w:rPr>
+          <w:rFonts w:ascii="Times New Roman" w:hAnsi="Times New Roman"/>
+        </w:rPr>
+        <w:t xml:space="preserve">seen.</w:t>
+      </w:r>
+    </w:p>
+    <w:bookmarkEnd w:id="49"/>
+    <w:bookmarkEnd w:id="50"/>
+    <w:bookmarkStart w:id="51" w:name="discussion"/>
+    <w:p>
+      <w:pPr>
+        <w:pStyle w:val="Heading1"/>
+      </w:pPr>
+      <w:r>
+        <w:rPr>
+          <w:rFonts w:ascii="Times New Roman" w:hAnsi="Times New Roman"/>
+        </w:rPr>
+        <w:t xml:space="preserve">Discussion</w:t>
+      </w:r>
+    </w:p>
+    <w:p>
+      <w:pPr>
+        <w:pStyle w:val="FirstParagraph"/>
+      </w:pPr>
+      <w:r>
+        <w:rPr>
+          <w:rFonts w:ascii="Times New Roman" w:hAnsi="Times New Roman"/>
+        </w:rPr>
         <w:t xml:space="preserve">As a read-out tool the filter is robust: on every one of twenty IBM device noise models it lowered the</w:t>
       </w:r>
       <w:r>
@@ -13707,7 +15044,31 @@
         <w:rPr>
           <w:rFonts w:ascii="Times New Roman" w:hAnsi="Times New Roman"/>
         </w:rPr>
-        <w:t xml:space="preserve">excitations interact. Eleven of the thirty-seven predictions failed as written, several through the analysis rather</w:t>
+        <w:t xml:space="preserve">excitations interact. Where the answer of a circuit lies outside the symmetry, as on the swap test’s</w:t>
+      </w:r>
+      <w:r>
+        <w:rPr>
+          <w:rFonts w:ascii="Times New Roman" w:hAnsi="Times New Roman"/>
+        </w:rPr>
+        <w:t xml:space="preserve"> </w:t>
+      </w:r>
+      <w:r>
+        <w:rPr>
+          <w:rFonts w:ascii="Times New Roman" w:hAnsi="Times New Roman"/>
+        </w:rPr>
+        <w:t xml:space="preserve">ancilla, the filter helps little; a weight-preserving alternative, when one exists, gains far more. Eleven of</w:t>
+      </w:r>
+      <w:r>
+        <w:rPr>
+          <w:rFonts w:ascii="Times New Roman" w:hAnsi="Times New Roman"/>
+        </w:rPr>
+        <w:t xml:space="preserve"> </w:t>
+      </w:r>
+      <w:r>
+        <w:rPr>
+          <w:rFonts w:ascii="Times New Roman" w:hAnsi="Times New Roman"/>
+        </w:rPr>
+        <w:t xml:space="preserve">the forty-two predictions failed as written, several through the analysis rather</w:t>
       </w:r>
       <w:r>
         <w:rPr>
@@ -13758,8 +15119,8 @@
         <w:t xml:space="preserve">are absent. A run on hardware is the next step.</w:t>
       </w:r>
     </w:p>
-    <w:bookmarkEnd w:id="49"/>
-    <w:bookmarkStart w:id="77" w:name="code-and-data-availability"/>
+    <w:bookmarkEnd w:id="51"/>
+    <w:bookmarkStart w:id="83" w:name="code-and-data-availability"/>
     <w:p>
       <w:pPr>
         <w:pStyle w:val="Heading1"/>
@@ -13787,7 +15148,7 @@
         </w:rPr>
         <w:t xml:space="preserve"> </w:t>
       </w:r>
-      <w:hyperlink r:id="rId50">
+      <w:hyperlink r:id="rId52">
         <w:r>
           <w:rPr>
             <w:rStyle w:val="Hyperlink"/>
@@ -14074,8 +15435,8 @@
         <w:t xml:space="preserve">]</w:t>
       </w:r>
     </w:p>
-    <w:bookmarkStart w:id="76" w:name="refs"/>
-    <w:bookmarkStart w:id="51" w:name="ref-bonetmonroig2018"/>
+    <w:bookmarkStart w:id="82" w:name="refs"/>
+    <w:bookmarkStart w:id="54" w:name="ref-blank2020kernel"/>
     <w:p>
       <w:pPr>
         <w:pStyle w:val="Bibliography"/>
@@ -14084,19 +15445,19 @@
         <w:rPr>
           <w:rFonts w:ascii="Times New Roman" w:hAnsi="Times New Roman"/>
         </w:rPr>
-        <w:t xml:space="preserve">Bonet-Monroig, Xavier, Ramiro Sagastizabal, M. Singh, and Thomas E. O’Brien. 2018.</w:t>
-      </w:r>
-      <w:r>
-        <w:rPr>
-          <w:rFonts w:ascii="Times New Roman" w:hAnsi="Times New Roman"/>
-        </w:rPr>
-        <w:t xml:space="preserve"> </w:t>
-      </w:r>
-      <w:r>
-        <w:rPr>
-          <w:rFonts w:ascii="Times New Roman" w:hAnsi="Times New Roman"/>
-        </w:rPr>
-        <w:t xml:space="preserve">“Low-Cost Error Mitigation by Symmetry Verification.”</w:t>
+        <w:t xml:space="preserve">Blank, Carsten, Daniel K. Park, June-Koo Kevin Rhee, and Francesco Petruccione. 2020.</w:t>
+      </w:r>
+      <w:r>
+        <w:rPr>
+          <w:rFonts w:ascii="Times New Roman" w:hAnsi="Times New Roman"/>
+        </w:rPr>
+        <w:t xml:space="preserve"> </w:t>
+      </w:r>
+      <w:r>
+        <w:rPr>
+          <w:rFonts w:ascii="Times New Roman" w:hAnsi="Times New Roman"/>
+        </w:rPr>
+        <w:t xml:space="preserve">“Quantum Classifier with Tailored Quantum Kernel.”</w:t>
       </w:r>
       <w:r>
         <w:rPr>
@@ -14110,23 +15471,43 @@
           <w:rFonts w:ascii="Times New Roman" w:hAnsi="Times New Roman"/>
           <w:i/>
         </w:rPr>
-        <w:t xml:space="preserve">Physical Review A</w:t>
-      </w:r>
-      <w:r>
-        <w:rPr>
-          <w:rFonts w:ascii="Times New Roman" w:hAnsi="Times New Roman"/>
-        </w:rPr>
-        <w:t xml:space="preserve"> </w:t>
-      </w:r>
-      <w:r>
-        <w:rPr>
-          <w:rFonts w:ascii="Times New Roman" w:hAnsi="Times New Roman"/>
-        </w:rPr>
-        <w:t xml:space="preserve">98: 062339.</w:t>
+        <w:t xml:space="preserve">Npj Quantum Information</w:t>
+      </w:r>
+      <w:r>
+        <w:rPr>
+          <w:rFonts w:ascii="Times New Roman" w:hAnsi="Times New Roman"/>
+        </w:rPr>
+        <w:t xml:space="preserve"> </w:t>
+      </w:r>
+      <w:r>
+        <w:rPr>
+          <w:rFonts w:ascii="Times New Roman" w:hAnsi="Times New Roman"/>
+        </w:rPr>
+        <w:t xml:space="preserve">6: 41.</w:t>
+      </w:r>
+      <w:r>
+        <w:rPr>
+          <w:rFonts w:ascii="Times New Roman" w:hAnsi="Times New Roman"/>
+        </w:rPr>
+        <w:t xml:space="preserve"> </w:t>
+      </w:r>
+      <w:hyperlink r:id="rId53">
+        <w:r>
+          <w:rPr>
+            <w:rStyle w:val="Hyperlink"/>
+          </w:rPr>
+          <w:t xml:space="preserve">https://doi.org/10.1038/s41534-020-0272-6</w:t>
+        </w:r>
+      </w:hyperlink>
+      <w:r>
+        <w:rPr>
+          <w:rFonts w:ascii="Times New Roman" w:hAnsi="Times New Roman"/>
+        </w:rPr>
+        <w:t xml:space="preserve">.</w:t>
       </w:r>
     </w:p>
-    <w:bookmarkEnd w:id="51"/>
-    <w:bookmarkStart w:id="53" w:name="ref-bravyi2021readout"/>
+    <w:bookmarkEnd w:id="54"/>
+    <w:bookmarkStart w:id="55" w:name="ref-bonetmonroig2018"/>
     <w:p>
       <w:pPr>
         <w:pStyle w:val="Bibliography"/>
@@ -14135,6 +15516,57 @@
         <w:rPr>
           <w:rFonts w:ascii="Times New Roman" w:hAnsi="Times New Roman"/>
         </w:rPr>
+        <w:t xml:space="preserve">Bonet-Monroig, Xavier, Ramiro Sagastizabal, M. Singh, and Thomas E. O’Brien. 2018.</w:t>
+      </w:r>
+      <w:r>
+        <w:rPr>
+          <w:rFonts w:ascii="Times New Roman" w:hAnsi="Times New Roman"/>
+        </w:rPr>
+        <w:t xml:space="preserve"> </w:t>
+      </w:r>
+      <w:r>
+        <w:rPr>
+          <w:rFonts w:ascii="Times New Roman" w:hAnsi="Times New Roman"/>
+        </w:rPr>
+        <w:t xml:space="preserve">“Low-Cost Error Mitigation by Symmetry Verification.”</w:t>
+      </w:r>
+      <w:r>
+        <w:rPr>
+          <w:rFonts w:ascii="Times New Roman" w:hAnsi="Times New Roman"/>
+        </w:rPr>
+        <w:t xml:space="preserve"> </w:t>
+      </w:r>
+      <w:r>
+        <w:rPr>
+          <w:iCs/>
+          <w:rFonts w:ascii="Times New Roman" w:hAnsi="Times New Roman"/>
+          <w:i/>
+        </w:rPr>
+        <w:t xml:space="preserve">Physical Review A</w:t>
+      </w:r>
+      <w:r>
+        <w:rPr>
+          <w:rFonts w:ascii="Times New Roman" w:hAnsi="Times New Roman"/>
+        </w:rPr>
+        <w:t xml:space="preserve"> </w:t>
+      </w:r>
+      <w:r>
+        <w:rPr>
+          <w:rFonts w:ascii="Times New Roman" w:hAnsi="Times New Roman"/>
+        </w:rPr>
+        <w:t xml:space="preserve">98: 062339.</w:t>
+      </w:r>
+    </w:p>
+    <w:bookmarkEnd w:id="55"/>
+    <w:bookmarkStart w:id="57" w:name="ref-bravyi2021readout"/>
+    <w:p>
+      <w:pPr>
+        <w:pStyle w:val="Bibliography"/>
+      </w:pPr>
+      <w:r>
+        <w:rPr>
+          <w:rFonts w:ascii="Times New Roman" w:hAnsi="Times New Roman"/>
+        </w:rPr>
         <w:t xml:space="preserve">Bravyi, Sergey, Sarah Sheldon, Abhinav Kandala, David C. Mckay, and Jay M. Gambetta. 2021.</w:t>
       </w:r>
       <w:r>
@@ -14181,7 +15613,7 @@
         </w:rPr>
         <w:t xml:space="preserve"> </w:t>
       </w:r>
-      <w:hyperlink r:id="rId52">
+      <w:hyperlink r:id="rId56">
         <w:r>
           <w:rPr>
             <w:rStyle w:val="Hyperlink"/>
@@ -14196,8 +15628,8 @@
         <w:t xml:space="preserve">.</w:t>
       </w:r>
     </w:p>
-    <w:bookmarkEnd w:id="53"/>
-    <w:bookmarkStart w:id="55" w:name="ref-giurgicatiron2020"/>
+    <w:bookmarkEnd w:id="57"/>
+    <w:bookmarkStart w:id="59" w:name="ref-buhrman2001fingerprinting"/>
     <w:p>
       <w:pPr>
         <w:pStyle w:val="Bibliography"/>
@@ -14206,6 +15638,77 @@
         <w:rPr>
           <w:rFonts w:ascii="Times New Roman" w:hAnsi="Times New Roman"/>
         </w:rPr>
+        <w:t xml:space="preserve">Buhrman, Harry, Richard Cleve, John Watrous, and Ronald de Wolf. 2001.</w:t>
+      </w:r>
+      <w:r>
+        <w:rPr>
+          <w:rFonts w:ascii="Times New Roman" w:hAnsi="Times New Roman"/>
+        </w:rPr>
+        <w:t xml:space="preserve"> </w:t>
+      </w:r>
+      <w:r>
+        <w:rPr>
+          <w:rFonts w:ascii="Times New Roman" w:hAnsi="Times New Roman"/>
+        </w:rPr>
+        <w:t xml:space="preserve">“Quantum Fingerprinting.”</w:t>
+      </w:r>
+      <w:r>
+        <w:rPr>
+          <w:rFonts w:ascii="Times New Roman" w:hAnsi="Times New Roman"/>
+        </w:rPr>
+        <w:t xml:space="preserve"> </w:t>
+      </w:r>
+      <w:r>
+        <w:rPr>
+          <w:iCs/>
+          <w:rFonts w:ascii="Times New Roman" w:hAnsi="Times New Roman"/>
+          <w:i/>
+        </w:rPr>
+        <w:t xml:space="preserve">Physical Review Letters</w:t>
+      </w:r>
+      <w:r>
+        <w:rPr>
+          <w:rFonts w:ascii="Times New Roman" w:hAnsi="Times New Roman"/>
+        </w:rPr>
+        <w:t xml:space="preserve"> </w:t>
+      </w:r>
+      <w:r>
+        <w:rPr>
+          <w:rFonts w:ascii="Times New Roman" w:hAnsi="Times New Roman"/>
+        </w:rPr>
+        <w:t xml:space="preserve">87: 167902.</w:t>
+      </w:r>
+      <w:r>
+        <w:rPr>
+          <w:rFonts w:ascii="Times New Roman" w:hAnsi="Times New Roman"/>
+        </w:rPr>
+        <w:t xml:space="preserve"> </w:t>
+      </w:r>
+      <w:hyperlink r:id="rId58">
+        <w:r>
+          <w:rPr>
+            <w:rStyle w:val="Hyperlink"/>
+          </w:rPr>
+          <w:t xml:space="preserve">https://doi.org/10.1103/PhysRevLett.87.167902</w:t>
+        </w:r>
+      </w:hyperlink>
+      <w:r>
+        <w:rPr>
+          <w:rFonts w:ascii="Times New Roman" w:hAnsi="Times New Roman"/>
+        </w:rPr>
+        <w:t xml:space="preserve">.</w:t>
+      </w:r>
+    </w:p>
+    <w:bookmarkEnd w:id="59"/>
+    <w:bookmarkStart w:id="61" w:name="ref-giurgicatiron2020"/>
+    <w:p>
+      <w:pPr>
+        <w:pStyle w:val="Bibliography"/>
+      </w:pPr>
+      <w:r>
+        <w:rPr>
+          <w:rFonts w:ascii="Times New Roman" w:hAnsi="Times New Roman"/>
+        </w:rPr>
         <w:t xml:space="preserve">Giurgica-Tiron, Tudor, Yousef Hindy, Ryan LaRose, Andrea Mari, and William J. Zeng. 2020.</w:t>
       </w:r>
       <w:r>
@@ -14258,7 +15761,7 @@
         </w:rPr>
         <w:t xml:space="preserve"> </w:t>
       </w:r>
-      <w:hyperlink r:id="rId54">
+      <w:hyperlink r:id="rId60">
         <w:r>
           <w:rPr>
             <w:rStyle w:val="Hyperlink"/>
@@ -14273,8 +15776,8 @@
         <w:t xml:space="preserve">.</w:t>
       </w:r>
     </w:p>
-    <w:bookmarkEnd w:id="55"/>
-    <w:bookmarkStart w:id="57" w:name="ref-qiskitibmruntime"/>
+    <w:bookmarkEnd w:id="61"/>
+    <w:bookmarkStart w:id="63" w:name="ref-qiskitibmruntime"/>
     <w:p>
       <w:pPr>
         <w:pStyle w:val="Bibliography"/>
@@ -14327,7 +15830,7 @@
         </w:rPr>
         <w:t xml:space="preserve"> </w:t>
       </w:r>
-      <w:hyperlink r:id="rId56">
+      <w:hyperlink r:id="rId62">
         <w:r>
           <w:rPr>
             <w:rStyle w:val="Hyperlink"/>
@@ -14342,8 +15845,8 @@
         <w:t xml:space="preserve">.</w:t>
       </w:r>
     </w:p>
-    <w:bookmarkEnd w:id="57"/>
-    <w:bookmarkStart w:id="59" w:name="ref-javadiabhari2024qiskit"/>
+    <w:bookmarkEnd w:id="63"/>
+    <w:bookmarkStart w:id="65" w:name="ref-javadiabhari2024qiskit"/>
     <w:p>
       <w:pPr>
         <w:pStyle w:val="Bibliography"/>
@@ -14390,7 +15893,7 @@
         </w:rPr>
         <w:t xml:space="preserve"> </w:t>
       </w:r>
-      <w:hyperlink r:id="rId58">
+      <w:hyperlink r:id="rId64">
         <w:r>
           <w:rPr>
             <w:rStyle w:val="Hyperlink"/>
@@ -14405,8 +15908,8 @@
         <w:t xml:space="preserve">.</w:t>
       </w:r>
     </w:p>
-    <w:bookmarkEnd w:id="59"/>
-    <w:bookmarkStart w:id="61" w:name="ref-kempe2003walks"/>
+    <w:bookmarkEnd w:id="65"/>
+    <w:bookmarkStart w:id="67" w:name="ref-kempe2003walks"/>
     <w:p>
       <w:pPr>
         <w:pStyle w:val="Bibliography"/>
@@ -14461,7 +15964,7 @@
         </w:rPr>
         <w:t xml:space="preserve"> </w:t>
       </w:r>
-      <w:hyperlink r:id="rId60">
+      <w:hyperlink r:id="rId66">
         <w:r>
           <w:rPr>
             <w:rStyle w:val="Hyperlink"/>
@@ -14476,8 +15979,8 @@
         <w:t xml:space="preserve">.</w:t>
       </w:r>
     </w:p>
-    <w:bookmarkEnd w:id="61"/>
-    <w:bookmarkStart w:id="63" w:name="ref-lloyd1996simulators"/>
+    <w:bookmarkEnd w:id="67"/>
+    <w:bookmarkStart w:id="69" w:name="ref-lloyd1996simulators"/>
     <w:p>
       <w:pPr>
         <w:pStyle w:val="Bibliography"/>
@@ -14532,7 +16035,7 @@
         </w:rPr>
         <w:t xml:space="preserve"> </w:t>
       </w:r>
-      <w:hyperlink r:id="rId62">
+      <w:hyperlink r:id="rId68">
         <w:r>
           <w:rPr>
             <w:rStyle w:val="Hyperlink"/>
@@ -14547,8 +16050,8 @@
         <w:t xml:space="preserve">.</w:t>
       </w:r>
     </w:p>
-    <w:bookmarkEnd w:id="63"/>
-    <w:bookmarkStart w:id="65" w:name="ref-lloyd2014qpca"/>
+    <w:bookmarkEnd w:id="69"/>
+    <w:bookmarkStart w:id="71" w:name="ref-lloyd2014qpca"/>
     <w:p>
       <w:pPr>
         <w:pStyle w:val="Bibliography"/>
@@ -14603,7 +16106,7 @@
         </w:rPr>
         <w:t xml:space="preserve"> </w:t>
       </w:r>
-      <w:hyperlink r:id="rId64">
+      <w:hyperlink r:id="rId70">
         <w:r>
           <w:rPr>
             <w:rStyle w:val="Hyperlink"/>
@@ -14618,8 +16121,8 @@
         <w:t xml:space="preserve">.</w:t>
       </w:r>
     </w:p>
-    <w:bookmarkEnd w:id="65"/>
-    <w:bookmarkStart w:id="66" w:name="ref-mcardle2019"/>
+    <w:bookmarkEnd w:id="71"/>
+    <w:bookmarkStart w:id="72" w:name="ref-mcardle2019"/>
     <w:p>
       <w:pPr>
         <w:pStyle w:val="Bibliography"/>
@@ -14669,8 +16172,8 @@
         <w:t xml:space="preserve">122: 180501.</w:t>
       </w:r>
     </w:p>
-    <w:bookmarkEnd w:id="66"/>
-    <w:bookmarkStart w:id="68" w:name="ref-monteverde2026qang"/>
+    <w:bookmarkEnd w:id="72"/>
+    <w:bookmarkStart w:id="74" w:name="ref-monteverde2026qang"/>
     <w:p>
       <w:pPr>
         <w:pStyle w:val="Bibliography"/>
@@ -14723,7 +16226,7 @@
         </w:rPr>
         <w:t xml:space="preserve"> </w:t>
       </w:r>
-      <w:hyperlink r:id="rId67">
+      <w:hyperlink r:id="rId73">
         <w:r>
           <w:rPr>
             <w:rStyle w:val="Hyperlink"/>
@@ -14738,8 +16241,8 @@
         <w:t xml:space="preserve">.</w:t>
       </w:r>
     </w:p>
-    <w:bookmarkEnd w:id="68"/>
-    <w:bookmarkStart w:id="69" w:name="ref-monteverde2026qml"/>
+    <w:bookmarkEnd w:id="74"/>
+    <w:bookmarkStart w:id="75" w:name="ref-monteverde2026qml"/>
     <w:p>
       <w:pPr>
         <w:pStyle w:val="Bibliography"/>
@@ -14781,8 +16284,8 @@
         <w:t xml:space="preserve">-Limited Hardware: What the Qg Symmetry Filter Does and Does Not Do.”</w:t>
       </w:r>
     </w:p>
-    <w:bookmarkEnd w:id="69"/>
-    <w:bookmarkStart w:id="71" w:name="ref-qiskitml"/>
+    <w:bookmarkEnd w:id="75"/>
+    <w:bookmarkStart w:id="77" w:name="ref-qiskitml"/>
     <w:p>
       <w:pPr>
         <w:pStyle w:val="Bibliography"/>
@@ -14811,7 +16314,7 @@
         </w:rPr>
         <w:t xml:space="preserve"> </w:t>
       </w:r>
-      <w:hyperlink r:id="rId70">
+      <w:hyperlink r:id="rId76">
         <w:r>
           <w:rPr>
             <w:rStyle w:val="Hyperlink"/>
@@ -14826,8 +16329,8 @@
         <w:t xml:space="preserve">.</w:t>
       </w:r>
     </w:p>
-    <w:bookmarkEnd w:id="71"/>
-    <w:bookmarkStart w:id="73" w:name="ref-tang2021qpca"/>
+    <w:bookmarkEnd w:id="77"/>
+    <w:bookmarkStart w:id="79" w:name="ref-tang2021qpca"/>
     <w:p>
       <w:pPr>
         <w:pStyle w:val="Bibliography"/>
@@ -14882,7 +16385,7 @@
         </w:rPr>
         <w:t xml:space="preserve"> </w:t>
       </w:r>
-      <w:hyperlink r:id="rId72">
+      <w:hyperlink r:id="rId78">
         <w:r>
           <w:rPr>
             <w:rStyle w:val="Hyperlink"/>
@@ -14897,8 +16400,8 @@
         <w:t xml:space="preserve">.</w:t>
       </w:r>
     </w:p>
-    <w:bookmarkEnd w:id="73"/>
-    <w:bookmarkStart w:id="75" w:name="ref-temme2017"/>
+    <w:bookmarkEnd w:id="79"/>
+    <w:bookmarkStart w:id="81" w:name="ref-temme2017"/>
     <w:p>
       <w:pPr>
         <w:pStyle w:val="Bibliography"/>
@@ -14953,7 +16456,7 @@
         </w:rPr>
         <w:t xml:space="preserve"> </w:t>
       </w:r>
-      <w:hyperlink r:id="rId74">
+      <w:hyperlink r:id="rId80">
         <w:r>
           <w:rPr>
             <w:rStyle w:val="Hyperlink"/>
@@ -14968,9 +16471,9 @@
         <w:t xml:space="preserve">.</w:t>
       </w:r>
     </w:p>
-    <w:bookmarkEnd w:id="75"/>
-    <w:bookmarkEnd w:id="76"/>
-    <w:bookmarkEnd w:id="77"/>
+    <w:bookmarkEnd w:id="81"/>
+    <w:bookmarkEnd w:id="82"/>
+    <w:bookmarkEnd w:id="83"/>
     <w:sectPr/>
   </w:body>
 </w:document>

</xml_diff>

<commit_message>
IBM paper (EN and ES): coherent ZZ errors (sections 145 and 150); Zenodo record updated
Co-Authored-By: Claude Opus 5.5 <noreply@anthropic.com>
Claude-Session: https://claude.ai/code/session_01VmfpwzVWvRWhRHG7VzpiEN
</commit_message>
<xml_diff>
--- a/manuscript/qang_ibm.docx
+++ b/manuscript/qang_ibm.docx
@@ -5634,6 +5634,342 @@
         <w:rPr>
           <w:rFonts w:ascii="Times New Roman" w:hAnsi="Times New Roman"/>
         </w:rPr>
+        <w:t xml:space="preserve">Coherent</w:t>
+      </w:r>
+      <w:r>
+        <w:rPr>
+          <w:rFonts w:ascii="Times New Roman" w:hAnsi="Times New Roman"/>
+        </w:rPr>
+        <w:t xml:space="preserve"> </w:t>
+      </w:r>
+      <w:r>
+        <w:rPr>
+          <w:rFonts w:ascii="Times New Roman" w:hAnsi="Times New Roman"/>
+        </w:rPr>
+        <w:t xml:space="preserve">ZZ</w:t>
+      </w:r>
+      <w:r>
+        <w:rPr>
+          <w:rFonts w:ascii="Times New Roman" w:hAnsi="Times New Roman"/>
+        </w:rPr>
+        <w:t xml:space="preserve"> </w:t>
+      </w:r>
+      <w:r>
+        <w:rPr>
+          <w:rFonts w:ascii="Times New Roman" w:hAnsi="Times New Roman"/>
+        </w:rPr>
+        <w:t xml:space="preserve">errors,</w:t>
+      </w:r>
+      <w:r>
+        <w:rPr>
+          <w:rFonts w:ascii="Times New Roman" w:hAnsi="Times New Roman"/>
+        </w:rPr>
+        <w:t xml:space="preserve"> </w:t>
+      </w:r>
+      <w:r>
+        <w:rPr>
+          <w:rFonts w:ascii="Times New Roman" w:hAnsi="Times New Roman"/>
+        </w:rPr>
+        <w:t xml:space="preserve">which</w:t>
+      </w:r>
+      <w:r>
+        <w:rPr>
+          <w:rFonts w:ascii="Times New Roman" w:hAnsi="Times New Roman"/>
+        </w:rPr>
+        <w:t xml:space="preserve"> </w:t>
+      </w:r>
+      <w:r>
+        <w:rPr>
+          <w:rFonts w:ascii="Times New Roman" w:hAnsi="Times New Roman"/>
+        </w:rPr>
+        <w:t xml:space="preserve">conserve</w:t>
+      </w:r>
+      <w:r>
+        <w:rPr>
+          <w:rFonts w:ascii="Times New Roman" w:hAnsi="Times New Roman"/>
+        </w:rPr>
+        <w:t xml:space="preserve"> </w:t>
+      </w:r>
+      <w:r>
+        <w:rPr>
+          <w:rFonts w:ascii="Times New Roman" w:hAnsi="Times New Roman"/>
+        </w:rPr>
+        <w:t xml:space="preserve">the</w:t>
+      </w:r>
+      <w:r>
+        <w:rPr>
+          <w:rFonts w:ascii="Times New Roman" w:hAnsi="Times New Roman"/>
+        </w:rPr>
+        <w:t xml:space="preserve"> </w:t>
+      </w:r>
+      <w:r>
+        <w:rPr>
+          <w:rFonts w:ascii="Times New Roman" w:hAnsi="Times New Roman"/>
+        </w:rPr>
+        <w:t xml:space="preserve">weight,</w:t>
+      </w:r>
+      <w:r>
+        <w:rPr>
+          <w:rFonts w:ascii="Times New Roman" w:hAnsi="Times New Roman"/>
+        </w:rPr>
+        <w:t xml:space="preserve"> </w:t>
+      </w:r>
+      <w:r>
+        <w:rPr>
+          <w:rFonts w:ascii="Times New Roman" w:hAnsi="Times New Roman"/>
+        </w:rPr>
+        <w:t xml:space="preserve">are</w:t>
+      </w:r>
+      <w:r>
+        <w:rPr>
+          <w:rFonts w:ascii="Times New Roman" w:hAnsi="Times New Roman"/>
+        </w:rPr>
+        <w:t xml:space="preserve"> </w:t>
+      </w:r>
+      <w:r>
+        <w:rPr>
+          <w:rFonts w:ascii="Times New Roman" w:hAnsi="Times New Roman"/>
+        </w:rPr>
+        <w:t xml:space="preserve">still</w:t>
+      </w:r>
+      <w:r>
+        <w:rPr>
+          <w:rFonts w:ascii="Times New Roman" w:hAnsi="Times New Roman"/>
+        </w:rPr>
+        <w:t xml:space="preserve"> </w:t>
+      </w:r>
+      <w:r>
+        <w:rPr>
+          <w:rFonts w:ascii="Times New Roman" w:hAnsi="Times New Roman"/>
+        </w:rPr>
+        <w:t xml:space="preserve">partly</w:t>
+      </w:r>
+      <w:r>
+        <w:rPr>
+          <w:rFonts w:ascii="Times New Roman" w:hAnsi="Times New Roman"/>
+        </w:rPr>
+        <w:t xml:space="preserve"> </w:t>
+      </w:r>
+      <w:r>
+        <w:rPr>
+          <w:rFonts w:ascii="Times New Roman" w:hAnsi="Times New Roman"/>
+        </w:rPr>
+        <w:t xml:space="preserve">filtered</w:t>
+      </w:r>
+      <w:r>
+        <w:rPr>
+          <w:rFonts w:ascii="Times New Roman" w:hAnsi="Times New Roman"/>
+        </w:rPr>
+        <w:t xml:space="preserve"> </w:t>
+      </w:r>
+      <w:r>
+        <w:rPr>
+          <w:rFonts w:ascii="Times New Roman" w:hAnsi="Times New Roman"/>
+        </w:rPr>
+        <w:t xml:space="preserve">(32–60%</w:t>
+      </w:r>
+      <w:r>
+        <w:rPr>
+          <w:rFonts w:ascii="Times New Roman" w:hAnsi="Times New Roman"/>
+        </w:rPr>
+        <w:t xml:space="preserve"> </w:t>
+      </w:r>
+      <w:r>
+        <w:rPr>
+          <w:rFonts w:ascii="Times New Roman" w:hAnsi="Times New Roman"/>
+        </w:rPr>
+        <w:t xml:space="preserve">of</w:t>
+      </w:r>
+      <w:r>
+        <w:rPr>
+          <w:rFonts w:ascii="Times New Roman" w:hAnsi="Times New Roman"/>
+        </w:rPr>
+        <w:t xml:space="preserve"> </w:t>
+      </w:r>
+      <w:r>
+        <w:rPr>
+          <w:rFonts w:ascii="Times New Roman" w:hAnsi="Times New Roman"/>
+        </w:rPr>
+        <w:t xml:space="preserve">the</w:t>
+      </w:r>
+      <w:r>
+        <w:rPr>
+          <w:rFonts w:ascii="Times New Roman" w:hAnsi="Times New Roman"/>
+        </w:rPr>
+        <w:t xml:space="preserve"> </w:t>
+      </w:r>
+      <w:r>
+        <w:rPr>
+          <w:rFonts w:ascii="Times New Roman" w:hAnsi="Times New Roman"/>
+        </w:rPr>
+        <w:t xml:space="preserve">added</w:t>
+      </w:r>
+      <w:r>
+        <w:rPr>
+          <w:rFonts w:ascii="Times New Roman" w:hAnsi="Times New Roman"/>
+        </w:rPr>
+        <w:t xml:space="preserve"> </w:t>
+      </w:r>
+      <w:r>
+        <w:rPr>
+          <w:rFonts w:ascii="Times New Roman" w:hAnsi="Times New Roman"/>
+        </w:rPr>
+        <w:t xml:space="preserve">error</w:t>
+      </w:r>
+      <w:r>
+        <w:rPr>
+          <w:rFonts w:ascii="Times New Roman" w:hAnsi="Times New Roman"/>
+        </w:rPr>
+        <w:t xml:space="preserve"> </w:t>
+      </w:r>
+      <w:r>
+        <w:rPr>
+          <w:rFonts w:ascii="Times New Roman" w:hAnsi="Times New Roman"/>
+        </w:rPr>
+        <w:t xml:space="preserve">for</w:t>
+      </w:r>
+      <w:r>
+        <w:rPr>
+          <w:rFonts w:ascii="Times New Roman" w:hAnsi="Times New Roman"/>
+        </w:rPr>
+        <w:t xml:space="preserve"> </w:t>
+      </w:r>
+      <w:r>
+        <w:rPr>
+          <w:rFonts w:ascii="Times New Roman" w:hAnsi="Times New Roman"/>
+        </w:rPr>
+        <w:t xml:space="preserve">always-on</w:t>
+      </w:r>
+      <w:r>
+        <w:rPr>
+          <w:rFonts w:ascii="Times New Roman" w:hAnsi="Times New Roman"/>
+        </w:rPr>
+        <w:t xml:space="preserve"> </w:t>
+      </w:r>
+      <w:r>
+        <w:rPr>
+          <w:rFonts w:ascii="Times New Roman" w:hAnsi="Times New Roman"/>
+        </w:rPr>
+        <w:t xml:space="preserve">ZZ</w:t>
+      </w:r>
+      <w:r>
+        <w:rPr>
+          <w:rFonts w:ascii="Times New Roman" w:hAnsi="Times New Roman"/>
+        </w:rPr>
+        <w:t xml:space="preserve"> </w:t>
+      </w:r>
+      <w:r>
+        <w:rPr>
+          <w:rFonts w:ascii="Times New Roman" w:hAnsi="Times New Roman"/>
+        </w:rPr>
+        <w:t xml:space="preserve">crosstalk),</w:t>
+      </w:r>
+      <w:r>
+        <w:rPr>
+          <w:rFonts w:ascii="Times New Roman" w:hAnsi="Times New Roman"/>
+        </w:rPr>
+        <w:t xml:space="preserve"> </w:t>
+      </w:r>
+      <w:r>
+        <w:rPr>
+          <w:rFonts w:ascii="Times New Roman" w:hAnsi="Times New Roman"/>
+        </w:rPr>
+        <w:t xml:space="preserve">because</w:t>
+      </w:r>
+      <w:r>
+        <w:rPr>
+          <w:rFonts w:ascii="Times New Roman" w:hAnsi="Times New Roman"/>
+        </w:rPr>
+        <w:t xml:space="preserve"> </w:t>
+      </w:r>
+      <w:r>
+        <w:rPr>
+          <w:rFonts w:ascii="Times New Roman" w:hAnsi="Times New Roman"/>
+        </w:rPr>
+        <w:t xml:space="preserve">they</w:t>
+      </w:r>
+      <w:r>
+        <w:rPr>
+          <w:rFonts w:ascii="Times New Roman" w:hAnsi="Times New Roman"/>
+        </w:rPr>
+        <w:t xml:space="preserve"> </w:t>
+      </w:r>
+      <w:r>
+        <w:rPr>
+          <w:rFonts w:ascii="Times New Roman" w:hAnsi="Times New Roman"/>
+        </w:rPr>
+        <w:t xml:space="preserve">act</w:t>
+      </w:r>
+      <w:r>
+        <w:rPr>
+          <w:rFonts w:ascii="Times New Roman" w:hAnsi="Times New Roman"/>
+        </w:rPr>
+        <w:t xml:space="preserve"> </w:t>
+      </w:r>
+      <w:r>
+        <w:rPr>
+          <w:rFonts w:ascii="Times New Roman" w:hAnsi="Times New Roman"/>
+        </w:rPr>
+        <w:t xml:space="preserve">partly</w:t>
+      </w:r>
+      <w:r>
+        <w:rPr>
+          <w:rFonts w:ascii="Times New Roman" w:hAnsi="Times New Roman"/>
+        </w:rPr>
+        <w:t xml:space="preserve"> </w:t>
+      </w:r>
+      <w:r>
+        <w:rPr>
+          <w:rFonts w:ascii="Times New Roman" w:hAnsi="Times New Roman"/>
+        </w:rPr>
+        <w:t xml:space="preserve">inside</w:t>
+      </w:r>
+      <w:r>
+        <w:rPr>
+          <w:rFonts w:ascii="Times New Roman" w:hAnsi="Times New Roman"/>
+        </w:rPr>
+        <w:t xml:space="preserve"> </w:t>
+      </w:r>
+      <w:r>
+        <w:rPr>
+          <w:rFonts w:ascii="Times New Roman" w:hAnsi="Times New Roman"/>
+        </w:rPr>
+        <w:t xml:space="preserve">native</w:t>
+      </w:r>
+      <w:r>
+        <w:rPr>
+          <w:rFonts w:ascii="Times New Roman" w:hAnsi="Times New Roman"/>
+        </w:rPr>
+        <w:t xml:space="preserve"> </w:t>
+      </w:r>
+      <w:r>
+        <w:rPr>
+          <w:rFonts w:ascii="Times New Roman" w:hAnsi="Times New Roman"/>
+        </w:rPr>
+        <w:t xml:space="preserve">gate</w:t>
+      </w:r>
+      <w:r>
+        <w:rPr>
+          <w:rFonts w:ascii="Times New Roman" w:hAnsi="Times New Roman"/>
+        </w:rPr>
+        <w:t xml:space="preserve"> </w:t>
+      </w:r>
+      <w:r>
+        <w:rPr>
+          <w:rFonts w:ascii="Times New Roman" w:hAnsi="Times New Roman"/>
+        </w:rPr>
+        <w:t xml:space="preserve">decompositions.</w:t>
+      </w:r>
+      <w:r>
+        <w:rPr>
+          <w:rFonts w:ascii="Times New Roman" w:hAnsi="Times New Roman"/>
+        </w:rPr>
+        <w:t xml:space="preserve"> </w:t>
+      </w:r>
+      <w:r>
+        <w:rPr>
+          <w:rFonts w:ascii="Times New Roman" w:hAnsi="Times New Roman"/>
+        </w:rPr>
         <w:t xml:space="preserve">Two</w:t>
       </w:r>
       <w:r>
@@ -6329,7 +6665,7 @@
         <w:rPr>
           <w:rFonts w:ascii="Times New Roman" w:hAnsi="Times New Roman"/>
         </w:rPr>
-        <w:t xml:space="preserve">§137–§149 refer to the research notes of the repository, where every number below is reproduced by a</w:t>
+        <w:t xml:space="preserve">§137–§150 refer to the research notes of the repository, where every number below is reproduced by a</w:t>
       </w:r>
       <w:r>
         <w:rPr>
@@ -10667,7 +11003,7 @@
     </w:p>
     <w:bookmarkEnd w:id="30"/>
     <w:bookmarkEnd w:id="31"/>
-    <w:bookmarkStart w:id="50" w:name="results"/>
+    <w:bookmarkStart w:id="51" w:name="results"/>
     <w:p>
       <w:pPr>
         <w:pStyle w:val="Heading1"/>
@@ -14867,17 +15203,16 @@
       </w:r>
     </w:p>
     <w:bookmarkEnd w:id="49"/>
-    <w:bookmarkEnd w:id="50"/>
-    <w:bookmarkStart w:id="51" w:name="discussion"/>
+    <w:bookmarkStart w:id="50" w:name="Xba2e06c277c8f28d457cc55757490a6e258d24c"/>
     <w:p>
       <w:pPr>
-        <w:pStyle w:val="Heading1"/>
+        <w:pStyle w:val="Heading2"/>
       </w:pPr>
       <w:r>
         <w:rPr>
           <w:rFonts w:ascii="Times New Roman" w:hAnsi="Times New Roman"/>
         </w:rPr>
-        <w:t xml:space="preserve">Discussion</w:t>
+        <w:t xml:space="preserve">Coherent ZZ errors the filter should not see (§145, §150)</w:t>
       </w:r>
     </w:p>
     <w:p>
@@ -14888,6 +15223,450 @@
         <w:rPr>
           <w:rFonts w:ascii="Times New Roman" w:hAnsi="Times New Roman"/>
         </w:rPr>
+        <w:t xml:space="preserve">The device noise models are incoherent channels. Two coherent errors that conserve the weight were added</w:t>
+      </w:r>
+      <w:r>
+        <w:rPr>
+          <w:rFonts w:ascii="Times New Roman" w:hAnsi="Times New Roman"/>
+        </w:rPr>
+        <w:t xml:space="preserve"> </w:t>
+      </w:r>
+      <w:r>
+        <w:rPr>
+          <w:rFonts w:ascii="Times New Roman" w:hAnsi="Times New Roman"/>
+        </w:rPr>
+        <w:t xml:space="preserve">to the ten circuits of §137 on three devices: a miscalibrated conditional phase, RZZ(</w:t>
+      </w:r>
+      <m:oMath>
+        <m:r>
+          <m:t>ε</m:t>
+        </m:r>
+      </m:oMath>
+      <w:r>
+        <w:rPr>
+          <w:rFonts w:ascii="Times New Roman" w:hAnsi="Times New Roman"/>
+        </w:rPr>
+        <w:t xml:space="preserve">) after</w:t>
+      </w:r>
+      <w:r>
+        <w:rPr>
+          <w:rFonts w:ascii="Times New Roman" w:hAnsi="Times New Roman"/>
+        </w:rPr>
+        <w:t xml:space="preserve"> </w:t>
+      </w:r>
+      <w:r>
+        <w:rPr>
+          <w:rFonts w:ascii="Times New Roman" w:hAnsi="Times New Roman"/>
+        </w:rPr>
+        <w:t xml:space="preserve">every native two-qubit gate on its pair (</w:t>
+      </w:r>
+      <m:oMath>
+        <m:r>
+          <m:t>ε</m:t>
+        </m:r>
+        <m:r>
+          <m:rPr>
+            <m:sty m:val="p"/>
+          </m:rPr>
+          <m:t>=</m:t>
+        </m:r>
+        <m:r>
+          <m:t>0</m:t>
+        </m:r>
+        <m:r>
+          <m:rPr>
+            <m:sty m:val="p"/>
+          </m:rPr>
+          <m:t>,</m:t>
+        </m:r>
+        <m:r>
+          <m:t>0.05</m:t>
+        </m:r>
+        <m:r>
+          <m:rPr>
+            <m:sty m:val="p"/>
+          </m:rPr>
+          <m:t>,</m:t>
+        </m:r>
+        <m:r>
+          <m:t>0.10</m:t>
+        </m:r>
+      </m:oMath>
+      <w:r>
+        <w:rPr>
+          <w:rFonts w:ascii="Times New Roman" w:hAnsi="Times New Roman"/>
+        </w:rPr>
+        <w:t xml:space="preserve"> </w:t>
+      </w:r>
+      <w:r>
+        <w:rPr>
+          <w:rFonts w:ascii="Times New Roman" w:hAnsi="Times New Roman"/>
+        </w:rPr>
+        <w:t xml:space="preserve">rad, §145), and always-on ZZ crosstalk,</w:t>
+      </w:r>
+      <w:r>
+        <w:rPr>
+          <w:rFonts w:ascii="Times New Roman" w:hAnsi="Times New Roman"/>
+        </w:rPr>
+        <w:t xml:space="preserve"> </w:t>
+      </w:r>
+      <m:oMath>
+        <m:r>
+          <m:rPr>
+            <m:sty m:val="p"/>
+          </m:rPr>
+          <m:t>exp</m:t>
+        </m:r>
+        <m:d>
+          <m:dPr>
+            <m:begChr m:val="("/>
+            <m:endChr m:val=")"/>
+            <m:sepChr m:val=""/>
+            <m:grow/>
+          </m:dPr>
+          <m:e>
+            <m:r>
+              <m:rPr>
+                <m:sty m:val="p"/>
+              </m:rPr>
+              <m:t>−</m:t>
+            </m:r>
+            <m:r>
+              <m:t>i</m:t>
+            </m:r>
+            <m:r>
+              <m:t>θ</m:t>
+            </m:r>
+            <m:r>
+              <m:t>Z</m:t>
+            </m:r>
+            <m:r>
+              <m:t>Z</m:t>
+            </m:r>
+            <m:r>
+              <m:rPr>
+                <m:sty m:val="p"/>
+              </m:rPr>
+              <m:t>/</m:t>
+            </m:r>
+            <m:r>
+              <m:t>2</m:t>
+            </m:r>
+          </m:e>
+        </m:d>
+      </m:oMath>
+      <w:r>
+        <w:rPr>
+          <w:rFonts w:ascii="Times New Roman" w:hAnsi="Times New Roman"/>
+        </w:rPr>
+        <w:t xml:space="preserve"> </w:t>
+      </w:r>
+      <w:r>
+        <w:rPr>
+          <w:rFonts w:ascii="Times New Roman" w:hAnsi="Times New Roman"/>
+        </w:rPr>
+        <w:t xml:space="preserve">with</w:t>
+      </w:r>
+      <w:r>
+        <w:rPr>
+          <w:rFonts w:ascii="Times New Roman" w:hAnsi="Times New Roman"/>
+        </w:rPr>
+        <w:t xml:space="preserve"> </w:t>
+      </w:r>
+      <m:oMath>
+        <m:r>
+          <m:t>θ</m:t>
+        </m:r>
+        <m:r>
+          <m:rPr>
+            <m:sty m:val="p"/>
+          </m:rPr>
+          <m:t>=</m:t>
+        </m:r>
+        <m:r>
+          <m:t>2</m:t>
+        </m:r>
+        <m:r>
+          <m:t>π</m:t>
+        </m:r>
+        <m:r>
+          <m:t>ν</m:t>
+        </m:r>
+        <m:r>
+          <m:t>t</m:t>
+        </m:r>
+      </m:oMath>
+      <w:r>
+        <w:rPr>
+          <w:rFonts w:ascii="Times New Roman" w:hAnsi="Times New Roman"/>
+        </w:rPr>
+        <w:t xml:space="preserve"> </w:t>
+      </w:r>
+      <w:r>
+        <w:rPr>
+          <w:rFonts w:ascii="Times New Roman" w:hAnsi="Times New Roman"/>
+        </w:rPr>
+        <w:t xml:space="preserve">after every layer on every coupled pair of used qubits,</w:t>
+      </w:r>
+      <w:r>
+        <w:rPr>
+          <w:rFonts w:ascii="Times New Roman" w:hAnsi="Times New Roman"/>
+        </w:rPr>
+        <w:t xml:space="preserve"> </w:t>
+      </w:r>
+      <m:oMath>
+        <m:r>
+          <m:t>t</m:t>
+        </m:r>
+      </m:oMath>
+      <w:r>
+        <w:rPr>
+          <w:rFonts w:ascii="Times New Roman" w:hAnsi="Times New Roman"/>
+        </w:rPr>
+        <w:t xml:space="preserve"> </w:t>
+      </w:r>
+      <w:r>
+        <w:rPr>
+          <w:rFonts w:ascii="Times New Roman" w:hAnsi="Times New Roman"/>
+        </w:rPr>
+        <w:t xml:space="preserve">from</w:t>
+      </w:r>
+      <w:r>
+        <w:rPr>
+          <w:rFonts w:ascii="Times New Roman" w:hAnsi="Times New Roman"/>
+        </w:rPr>
+        <w:t xml:space="preserve"> </w:t>
+      </w:r>
+      <w:r>
+        <w:rPr>
+          <w:rFonts w:ascii="Times New Roman" w:hAnsi="Times New Roman"/>
+        </w:rPr>
+        <w:t xml:space="preserve">the calibrated layer durations (</w:t>
+      </w:r>
+      <m:oMath>
+        <m:r>
+          <m:t>ν</m:t>
+        </m:r>
+        <m:r>
+          <m:rPr>
+            <m:sty m:val="p"/>
+          </m:rPr>
+          <m:t>=</m:t>
+        </m:r>
+        <m:r>
+          <m:t>0</m:t>
+        </m:r>
+        <m:r>
+          <m:rPr>
+            <m:sty m:val="p"/>
+          </m:rPr>
+          <m:t>,</m:t>
+        </m:r>
+        <m:r>
+          <m:t>5</m:t>
+        </m:r>
+        <m:r>
+          <m:rPr>
+            <m:sty m:val="p"/>
+          </m:rPr>
+          <m:t>,</m:t>
+        </m:r>
+        <m:r>
+          <m:t>15</m:t>
+        </m:r>
+      </m:oMath>
+      <w:r>
+        <w:rPr>
+          <w:rFonts w:ascii="Times New Roman" w:hAnsi="Times New Roman"/>
+        </w:rPr>
+        <w:t xml:space="preserve"> </w:t>
+      </w:r>
+      <w:r>
+        <w:rPr>
+          <w:rFonts w:ascii="Times New Roman" w:hAnsi="Times New Roman"/>
+        </w:rPr>
+        <w:t xml:space="preserve">kHz;</w:t>
+      </w:r>
+      <w:r>
+        <w:rPr>
+          <w:rFonts w:ascii="Times New Roman" w:hAnsi="Times New Roman"/>
+        </w:rPr>
+        <w:t xml:space="preserve"> </w:t>
+      </w:r>
+      <w:r>
+        <w:rPr>
+          <w:rStyle w:val="VerbatimChar"/>
+          <w:rFonts w:ascii="Times New Roman" w:hAnsi="Times New Roman"/>
+        </w:rPr>
+        <w:t xml:space="preserve">add_static_zz</w:t>
+      </w:r>
+      <w:r>
+        <w:rPr>
+          <w:rFonts w:ascii="Times New Roman" w:hAnsi="Times New Roman"/>
+        </w:rPr>
+        <w:t xml:space="preserve">, §150). The predictions assumed both</w:t>
+      </w:r>
+      <w:r>
+        <w:rPr>
+          <w:rFonts w:ascii="Times New Roman" w:hAnsi="Times New Roman"/>
+        </w:rPr>
+        <w:t xml:space="preserve"> </w:t>
+      </w:r>
+      <w:r>
+        <w:rPr>
+          <w:rFonts w:ascii="Times New Roman" w:hAnsi="Times New Roman"/>
+        </w:rPr>
+        <w:t xml:space="preserve">invisible to the filter; five of the seven failed. Both errors are partly filtered: the kept fraction fell</w:t>
+      </w:r>
+      <w:r>
+        <w:rPr>
+          <w:rFonts w:ascii="Times New Roman" w:hAnsi="Times New Roman"/>
+        </w:rPr>
+        <w:t xml:space="preserve"> </w:t>
+      </w:r>
+      <w:r>
+        <w:rPr>
+          <w:rFonts w:ascii="Times New Roman" w:hAnsi="Times New Roman"/>
+        </w:rPr>
+        <w:t xml:space="preserve">by 0.009–0.020 (</w:t>
+      </w:r>
+      <m:oMath>
+        <m:r>
+          <m:t>ε</m:t>
+        </m:r>
+        <m:r>
+          <m:rPr>
+            <m:sty m:val="p"/>
+          </m:rPr>
+          <m:t>=</m:t>
+        </m:r>
+        <m:r>
+          <m:t>0.10</m:t>
+        </m:r>
+      </m:oMath>
+      <w:r>
+        <w:rPr>
+          <w:rFonts w:ascii="Times New Roman" w:hAnsi="Times New Roman"/>
+        </w:rPr>
+        <w:t xml:space="preserve">) and by up to 0.023 (15 kHz), and the filter removed 32–60% of the error</w:t>
+      </w:r>
+      <w:r>
+        <w:rPr>
+          <w:rFonts w:ascii="Times New Roman" w:hAnsi="Times New Roman"/>
+        </w:rPr>
+        <w:t xml:space="preserve"> </w:t>
+      </w:r>
+      <w:r>
+        <w:rPr>
+          <w:rFonts w:ascii="Times New Roman" w:hAnsi="Times New Roman"/>
+        </w:rPr>
+        <w:t xml:space="preserve">the crosstalk added. A ZZ term is diagonal in the computational frame, but the qubits are in that frame only</w:t>
+      </w:r>
+      <w:r>
+        <w:rPr>
+          <w:rFonts w:ascii="Times New Roman" w:hAnsi="Times New Roman"/>
+        </w:rPr>
+        <w:t xml:space="preserve"> </w:t>
+      </w:r>
+      <w:r>
+        <w:rPr>
+          <w:rFonts w:ascii="Times New Roman" w:hAnsi="Times New Roman"/>
+        </w:rPr>
+        <w:t xml:space="preserve">between logical gates; inside the native decomposition of an XX+YY gate they are rotated, and there ZZ moves</w:t>
+      </w:r>
+      <w:r>
+        <w:rPr>
+          <w:rFonts w:ascii="Times New Roman" w:hAnsi="Times New Roman"/>
+        </w:rPr>
+        <w:t xml:space="preserve"> </w:t>
+      </w:r>
+      <w:r>
+        <w:rPr>
+          <w:rFonts w:ascii="Times New Roman" w:hAnsi="Times New Roman"/>
+        </w:rPr>
+        <w:t xml:space="preserve">excitations out of the sector. What passes the filter is modest at these strengths: the filtered error grew by</w:t>
+      </w:r>
+      <w:r>
+        <w:rPr>
+          <w:rFonts w:ascii="Times New Roman" w:hAnsi="Times New Roman"/>
+        </w:rPr>
+        <w:t xml:space="preserve"> </w:t>
+      </w:r>
+      <w:r>
+        <w:rPr>
+          <w:rFonts w:ascii="Times New Roman" w:hAnsi="Times New Roman"/>
+        </w:rPr>
+        <w:t xml:space="preserve">0.001–0.011 with the gate error (4% on the ECR devices, 62% on FakeTorino, where the CZ decomposition exposes</w:t>
+      </w:r>
+      <w:r>
+        <w:rPr>
+          <w:rFonts w:ascii="Times New Roman" w:hAnsi="Times New Roman"/>
+        </w:rPr>
+        <w:t xml:space="preserve"> </w:t>
+      </w:r>
+      <w:r>
+        <w:rPr>
+          <w:rFonts w:ascii="Times New Roman" w:hAnsi="Times New Roman"/>
+        </w:rPr>
+        <w:t xml:space="preserve">more of it) and by 0.003–0.009 (14–38%) with 15 kHz of crosstalk, least on FakeTorino, whose circuits last</w:t>
+      </w:r>
+      <w:r>
+        <w:rPr>
+          <w:rFonts w:ascii="Times New Roman" w:hAnsi="Times New Roman"/>
+        </w:rPr>
+        <w:t xml:space="preserve"> </w:t>
+      </w:r>
+      <w:r>
+        <w:rPr>
+          <w:rFonts w:ascii="Times New Roman" w:hAnsi="Times New Roman"/>
+        </w:rPr>
+        <w:t xml:space="preserve">2.1 </w:t>
+      </w:r>
+      <m:oMath>
+        <m:r>
+          <m:t>μ</m:t>
+        </m:r>
+      </m:oMath>
+      <w:r>
+        <w:rPr>
+          <w:rFonts w:ascii="Times New Roman" w:hAnsi="Times New Roman"/>
+        </w:rPr>
+        <w:t xml:space="preserve">s against 9–10 </w:t>
+      </w:r>
+      <m:oMath>
+        <m:r>
+          <m:t>μ</m:t>
+        </m:r>
+      </m:oMath>
+      <w:r>
+        <w:rPr>
+          <w:rFonts w:ascii="Times New Roman" w:hAnsi="Times New Roman"/>
+        </w:rPr>
+        <w:t xml:space="preserve">s.</w:t>
+      </w:r>
+    </w:p>
+    <w:bookmarkEnd w:id="50"/>
+    <w:bookmarkEnd w:id="51"/>
+    <w:bookmarkStart w:id="52" w:name="discussion"/>
+    <w:p>
+      <w:pPr>
+        <w:pStyle w:val="Heading1"/>
+      </w:pPr>
+      <w:r>
+        <w:rPr>
+          <w:rFonts w:ascii="Times New Roman" w:hAnsi="Times New Roman"/>
+        </w:rPr>
+        <w:t xml:space="preserve">Discussion</w:t>
+      </w:r>
+    </w:p>
+    <w:p>
+      <w:pPr>
+        <w:pStyle w:val="FirstParagraph"/>
+      </w:pPr>
+      <w:r>
+        <w:rPr>
+          <w:rFonts w:ascii="Times New Roman" w:hAnsi="Times New Roman"/>
+        </w:rPr>
         <w:t xml:space="preserve">As a read-out tool the filter is robust: on every one of twenty IBM device noise models it lowered the</w:t>
       </w:r>
       <w:r>
@@ -15056,19 +15835,19 @@
         <w:rPr>
           <w:rFonts w:ascii="Times New Roman" w:hAnsi="Times New Roman"/>
         </w:rPr>
-        <w:t xml:space="preserve">ancilla, the filter helps little; a weight-preserving alternative, when one exists, gains far more. Eleven of</w:t>
-      </w:r>
-      <w:r>
-        <w:rPr>
-          <w:rFonts w:ascii="Times New Roman" w:hAnsi="Times New Roman"/>
-        </w:rPr>
-        <w:t xml:space="preserve"> </w:t>
-      </w:r>
-      <w:r>
-        <w:rPr>
-          <w:rFonts w:ascii="Times New Roman" w:hAnsi="Times New Roman"/>
-        </w:rPr>
-        <w:t xml:space="preserve">the forty-two predictions failed as written, several through the analysis rather</w:t>
+        <w:t xml:space="preserve">ancilla, the filter helps little; a weight-preserving alternative, when one exists, gains far more. Errors that conserve the weight pass the filter only in part, because the qubits leave the</w:t>
+      </w:r>
+      <w:r>
+        <w:rPr>
+          <w:rFonts w:ascii="Times New Roman" w:hAnsi="Times New Roman"/>
+        </w:rPr>
+        <w:t xml:space="preserve"> </w:t>
+      </w:r>
+      <w:r>
+        <w:rPr>
+          <w:rFonts w:ascii="Times New Roman" w:hAnsi="Times New Roman"/>
+        </w:rPr>
+        <w:t xml:space="preserve">computational frame inside native gates. Sixteen of the forty-nine predictions failed as written, several through the analysis rather</w:t>
       </w:r>
       <w:r>
         <w:rPr>
@@ -15104,23 +15883,23 @@
         <w:rPr>
           <w:rFonts w:ascii="Times New Roman" w:hAnsi="Times New Roman"/>
         </w:rPr>
-        <w:t xml:space="preserve">model gate, relaxation, dephasing and read-out errors as independent channels; leakage, crosstalk and drift</w:t>
-      </w:r>
-      <w:r>
-        <w:rPr>
-          <w:rFonts w:ascii="Times New Roman" w:hAnsi="Times New Roman"/>
-        </w:rPr>
-        <w:t xml:space="preserve"> </w:t>
-      </w:r>
-      <w:r>
-        <w:rPr>
-          <w:rFonts w:ascii="Times New Roman" w:hAnsi="Times New Roman"/>
-        </w:rPr>
-        <w:t xml:space="preserve">are absent. A run on hardware is the next step.</w:t>
+        <w:t xml:space="preserve">model gate, relaxation, dephasing and read-out errors as independent channels; ZZ crosstalk was added by</w:t>
+      </w:r>
+      <w:r>
+        <w:rPr>
+          <w:rFonts w:ascii="Times New Roman" w:hAnsi="Times New Roman"/>
+        </w:rPr>
+        <w:t xml:space="preserve"> </w:t>
+      </w:r>
+      <w:r>
+        <w:rPr>
+          <w:rFonts w:ascii="Times New Roman" w:hAnsi="Times New Roman"/>
+        </w:rPr>
+        <w:t xml:space="preserve">hand (§150), leakage and drift are absent. A run on hardware is the next step.</w:t>
       </w:r>
     </w:p>
-    <w:bookmarkEnd w:id="51"/>
-    <w:bookmarkStart w:id="83" w:name="code-and-data-availability"/>
+    <w:bookmarkEnd w:id="52"/>
+    <w:bookmarkStart w:id="84" w:name="code-and-data-availability"/>
     <w:p>
       <w:pPr>
         <w:pStyle w:val="Heading1"/>
@@ -15148,7 +15927,7 @@
         </w:rPr>
         <w:t xml:space="preserve"> </w:t>
       </w:r>
-      <w:hyperlink r:id="rId52">
+      <w:hyperlink r:id="rId53">
         <w:r>
           <w:rPr>
             <w:rStyle w:val="Hyperlink"/>
@@ -15435,8 +16214,8 @@
         <w:t xml:space="preserve">]</w:t>
       </w:r>
     </w:p>
-    <w:bookmarkStart w:id="82" w:name="refs"/>
-    <w:bookmarkStart w:id="54" w:name="ref-blank2020kernel"/>
+    <w:bookmarkStart w:id="83" w:name="refs"/>
+    <w:bookmarkStart w:id="55" w:name="ref-blank2020kernel"/>
     <w:p>
       <w:pPr>
         <w:pStyle w:val="Bibliography"/>
@@ -15491,7 +16270,7 @@
         </w:rPr>
         <w:t xml:space="preserve"> </w:t>
       </w:r>
-      <w:hyperlink r:id="rId53">
+      <w:hyperlink r:id="rId54">
         <w:r>
           <w:rPr>
             <w:rStyle w:val="Hyperlink"/>
@@ -15506,8 +16285,8 @@
         <w:t xml:space="preserve">.</w:t>
       </w:r>
     </w:p>
-    <w:bookmarkEnd w:id="54"/>
-    <w:bookmarkStart w:id="55" w:name="ref-bonetmonroig2018"/>
+    <w:bookmarkEnd w:id="55"/>
+    <w:bookmarkStart w:id="56" w:name="ref-bonetmonroig2018"/>
     <w:p>
       <w:pPr>
         <w:pStyle w:val="Bibliography"/>
@@ -15557,8 +16336,8 @@
         <w:t xml:space="preserve">98: 062339.</w:t>
       </w:r>
     </w:p>
-    <w:bookmarkEnd w:id="55"/>
-    <w:bookmarkStart w:id="57" w:name="ref-bravyi2021readout"/>
+    <w:bookmarkEnd w:id="56"/>
+    <w:bookmarkStart w:id="58" w:name="ref-bravyi2021readout"/>
     <w:p>
       <w:pPr>
         <w:pStyle w:val="Bibliography"/>
@@ -15613,7 +16392,7 @@
         </w:rPr>
         <w:t xml:space="preserve"> </w:t>
       </w:r>
-      <w:hyperlink r:id="rId56">
+      <w:hyperlink r:id="rId57">
         <w:r>
           <w:rPr>
             <w:rStyle w:val="Hyperlink"/>
@@ -15628,8 +16407,8 @@
         <w:t xml:space="preserve">.</w:t>
       </w:r>
     </w:p>
-    <w:bookmarkEnd w:id="57"/>
-    <w:bookmarkStart w:id="59" w:name="ref-buhrman2001fingerprinting"/>
+    <w:bookmarkEnd w:id="58"/>
+    <w:bookmarkStart w:id="60" w:name="ref-buhrman2001fingerprinting"/>
     <w:p>
       <w:pPr>
         <w:pStyle w:val="Bibliography"/>
@@ -15684,7 +16463,7 @@
         </w:rPr>
         <w:t xml:space="preserve"> </w:t>
       </w:r>
-      <w:hyperlink r:id="rId58">
+      <w:hyperlink r:id="rId59">
         <w:r>
           <w:rPr>
             <w:rStyle w:val="Hyperlink"/>
@@ -15699,8 +16478,8 @@
         <w:t xml:space="preserve">.</w:t>
       </w:r>
     </w:p>
-    <w:bookmarkEnd w:id="59"/>
-    <w:bookmarkStart w:id="61" w:name="ref-giurgicatiron2020"/>
+    <w:bookmarkEnd w:id="60"/>
+    <w:bookmarkStart w:id="62" w:name="ref-giurgicatiron2020"/>
     <w:p>
       <w:pPr>
         <w:pStyle w:val="Bibliography"/>
@@ -15761,7 +16540,7 @@
         </w:rPr>
         <w:t xml:space="preserve"> </w:t>
       </w:r>
-      <w:hyperlink r:id="rId60">
+      <w:hyperlink r:id="rId61">
         <w:r>
           <w:rPr>
             <w:rStyle w:val="Hyperlink"/>
@@ -15776,8 +16555,8 @@
         <w:t xml:space="preserve">.</w:t>
       </w:r>
     </w:p>
-    <w:bookmarkEnd w:id="61"/>
-    <w:bookmarkStart w:id="63" w:name="ref-qiskitibmruntime"/>
+    <w:bookmarkEnd w:id="62"/>
+    <w:bookmarkStart w:id="64" w:name="ref-qiskitibmruntime"/>
     <w:p>
       <w:pPr>
         <w:pStyle w:val="Bibliography"/>
@@ -15830,7 +16609,7 @@
         </w:rPr>
         <w:t xml:space="preserve"> </w:t>
       </w:r>
-      <w:hyperlink r:id="rId62">
+      <w:hyperlink r:id="rId63">
         <w:r>
           <w:rPr>
             <w:rStyle w:val="Hyperlink"/>
@@ -15845,8 +16624,8 @@
         <w:t xml:space="preserve">.</w:t>
       </w:r>
     </w:p>
-    <w:bookmarkEnd w:id="63"/>
-    <w:bookmarkStart w:id="65" w:name="ref-javadiabhari2024qiskit"/>
+    <w:bookmarkEnd w:id="64"/>
+    <w:bookmarkStart w:id="66" w:name="ref-javadiabhari2024qiskit"/>
     <w:p>
       <w:pPr>
         <w:pStyle w:val="Bibliography"/>
@@ -15893,7 +16672,7 @@
         </w:rPr>
         <w:t xml:space="preserve"> </w:t>
       </w:r>
-      <w:hyperlink r:id="rId64">
+      <w:hyperlink r:id="rId65">
         <w:r>
           <w:rPr>
             <w:rStyle w:val="Hyperlink"/>
@@ -15908,8 +16687,8 @@
         <w:t xml:space="preserve">.</w:t>
       </w:r>
     </w:p>
-    <w:bookmarkEnd w:id="65"/>
-    <w:bookmarkStart w:id="67" w:name="ref-kempe2003walks"/>
+    <w:bookmarkEnd w:id="66"/>
+    <w:bookmarkStart w:id="68" w:name="ref-kempe2003walks"/>
     <w:p>
       <w:pPr>
         <w:pStyle w:val="Bibliography"/>
@@ -15964,7 +16743,7 @@
         </w:rPr>
         <w:t xml:space="preserve"> </w:t>
       </w:r>
-      <w:hyperlink r:id="rId66">
+      <w:hyperlink r:id="rId67">
         <w:r>
           <w:rPr>
             <w:rStyle w:val="Hyperlink"/>
@@ -15979,8 +16758,8 @@
         <w:t xml:space="preserve">.</w:t>
       </w:r>
     </w:p>
-    <w:bookmarkEnd w:id="67"/>
-    <w:bookmarkStart w:id="69" w:name="ref-lloyd1996simulators"/>
+    <w:bookmarkEnd w:id="68"/>
+    <w:bookmarkStart w:id="70" w:name="ref-lloyd1996simulators"/>
     <w:p>
       <w:pPr>
         <w:pStyle w:val="Bibliography"/>
@@ -16035,7 +16814,7 @@
         </w:rPr>
         <w:t xml:space="preserve"> </w:t>
       </w:r>
-      <w:hyperlink r:id="rId68">
+      <w:hyperlink r:id="rId69">
         <w:r>
           <w:rPr>
             <w:rStyle w:val="Hyperlink"/>
@@ -16050,8 +16829,8 @@
         <w:t xml:space="preserve">.</w:t>
       </w:r>
     </w:p>
-    <w:bookmarkEnd w:id="69"/>
-    <w:bookmarkStart w:id="71" w:name="ref-lloyd2014qpca"/>
+    <w:bookmarkEnd w:id="70"/>
+    <w:bookmarkStart w:id="72" w:name="ref-lloyd2014qpca"/>
     <w:p>
       <w:pPr>
         <w:pStyle w:val="Bibliography"/>
@@ -16106,7 +16885,7 @@
         </w:rPr>
         <w:t xml:space="preserve"> </w:t>
       </w:r>
-      <w:hyperlink r:id="rId70">
+      <w:hyperlink r:id="rId71">
         <w:r>
           <w:rPr>
             <w:rStyle w:val="Hyperlink"/>
@@ -16121,8 +16900,8 @@
         <w:t xml:space="preserve">.</w:t>
       </w:r>
     </w:p>
-    <w:bookmarkEnd w:id="71"/>
-    <w:bookmarkStart w:id="72" w:name="ref-mcardle2019"/>
+    <w:bookmarkEnd w:id="72"/>
+    <w:bookmarkStart w:id="73" w:name="ref-mcardle2019"/>
     <w:p>
       <w:pPr>
         <w:pStyle w:val="Bibliography"/>
@@ -16172,8 +16951,8 @@
         <w:t xml:space="preserve">122: 180501.</w:t>
       </w:r>
     </w:p>
-    <w:bookmarkEnd w:id="72"/>
-    <w:bookmarkStart w:id="74" w:name="ref-monteverde2026qang"/>
+    <w:bookmarkEnd w:id="73"/>
+    <w:bookmarkStart w:id="75" w:name="ref-monteverde2026qang"/>
     <w:p>
       <w:pPr>
         <w:pStyle w:val="Bibliography"/>
@@ -16226,7 +17005,7 @@
         </w:rPr>
         <w:t xml:space="preserve"> </w:t>
       </w:r>
-      <w:hyperlink r:id="rId73">
+      <w:hyperlink r:id="rId74">
         <w:r>
           <w:rPr>
             <w:rStyle w:val="Hyperlink"/>
@@ -16241,8 +17020,8 @@
         <w:t xml:space="preserve">.</w:t>
       </w:r>
     </w:p>
-    <w:bookmarkEnd w:id="74"/>
-    <w:bookmarkStart w:id="75" w:name="ref-monteverde2026qml"/>
+    <w:bookmarkEnd w:id="75"/>
+    <w:bookmarkStart w:id="76" w:name="ref-monteverde2026qml"/>
     <w:p>
       <w:pPr>
         <w:pStyle w:val="Bibliography"/>
@@ -16284,8 +17063,8 @@
         <w:t xml:space="preserve">-Limited Hardware: What the Qg Symmetry Filter Does and Does Not Do.”</w:t>
       </w:r>
     </w:p>
-    <w:bookmarkEnd w:id="75"/>
-    <w:bookmarkStart w:id="77" w:name="ref-qiskitml"/>
+    <w:bookmarkEnd w:id="76"/>
+    <w:bookmarkStart w:id="78" w:name="ref-qiskitml"/>
     <w:p>
       <w:pPr>
         <w:pStyle w:val="Bibliography"/>
@@ -16314,7 +17093,7 @@
         </w:rPr>
         <w:t xml:space="preserve"> </w:t>
       </w:r>
-      <w:hyperlink r:id="rId76">
+      <w:hyperlink r:id="rId77">
         <w:r>
           <w:rPr>
             <w:rStyle w:val="Hyperlink"/>
@@ -16329,8 +17108,8 @@
         <w:t xml:space="preserve">.</w:t>
       </w:r>
     </w:p>
-    <w:bookmarkEnd w:id="77"/>
-    <w:bookmarkStart w:id="79" w:name="ref-tang2021qpca"/>
+    <w:bookmarkEnd w:id="78"/>
+    <w:bookmarkStart w:id="80" w:name="ref-tang2021qpca"/>
     <w:p>
       <w:pPr>
         <w:pStyle w:val="Bibliography"/>
@@ -16385,7 +17164,7 @@
         </w:rPr>
         <w:t xml:space="preserve"> </w:t>
       </w:r>
-      <w:hyperlink r:id="rId78">
+      <w:hyperlink r:id="rId79">
         <w:r>
           <w:rPr>
             <w:rStyle w:val="Hyperlink"/>
@@ -16400,8 +17179,8 @@
         <w:t xml:space="preserve">.</w:t>
       </w:r>
     </w:p>
-    <w:bookmarkEnd w:id="79"/>
-    <w:bookmarkStart w:id="81" w:name="ref-temme2017"/>
+    <w:bookmarkEnd w:id="80"/>
+    <w:bookmarkStart w:id="82" w:name="ref-temme2017"/>
     <w:p>
       <w:pPr>
         <w:pStyle w:val="Bibliography"/>
@@ -16456,7 +17235,7 @@
         </w:rPr>
         <w:t xml:space="preserve"> </w:t>
       </w:r>
-      <w:hyperlink r:id="rId80">
+      <w:hyperlink r:id="rId81">
         <w:r>
           <w:rPr>
             <w:rStyle w:val="Hyperlink"/>
@@ -16471,9 +17250,9 @@
         <w:t xml:space="preserve">.</w:t>
       </w:r>
     </w:p>
-    <w:bookmarkEnd w:id="81"/>
     <w:bookmarkEnd w:id="82"/>
     <w:bookmarkEnd w:id="83"/>
+    <w:bookmarkEnd w:id="84"/>
     <w:sectPr/>
   </w:body>
 </w:document>

</xml_diff>